<commit_message>
12 mai - pre feedback Larionov
</commit_message>
<xml_diff>
--- a/latex/thesis word.docx
+++ b/latex/thesis word.docx
@@ -497,7 +497,6 @@
           <w:b w:val="0"/>
           <w:bCs w:val="0"/>
           <w:color w:val="auto"/>
-          <w:szCs w:val="24"/>
           <w:lang w:val="fr-FR" w:eastAsia="en-US"/>
         </w:rPr>
         <w:id w:val="-426955875"/>
@@ -591,7 +590,7 @@
             </w:rPr>
             <w:fldChar w:fldCharType="separate"/>
           </w:r>
-          <w:hyperlink w:anchor="_Toc229485482" w:history="1">
+          <w:hyperlink w:anchor="_Toc229556429" w:history="1">
             <w:r>
               <w:rPr>
                 <w:rStyle w:val="Lienhypertexte"/>
@@ -646,7 +645,7 @@
                 <w:sz w:val="28"/>
                 <w:szCs w:val="28"/>
               </w:rPr>
-              <w:instrText xml:space="preserve"> PAGEREF _Toc229485482 \h </w:instrText>
+              <w:instrText xml:space="preserve"> PAGEREF _Toc229556429 \h </w:instrText>
             </w:r>
             <w:r>
               <w:rPr>
@@ -724,7 +723,7 @@
               <w14:ligatures w14:val="standardContextual"/>
             </w:rPr>
           </w:pPr>
-          <w:hyperlink w:anchor="_Toc229485483" w:history="1">
+          <w:hyperlink w:anchor="_Toc229556430" w:history="1">
             <w:r>
               <w:rPr>
                 <w:rStyle w:val="Lienhypertexte"/>
@@ -779,7 +778,7 @@
                 <w:sz w:val="28"/>
                 <w:szCs w:val="28"/>
               </w:rPr>
-              <w:instrText xml:space="preserve"> PAGEREF _Toc229485483 \h </w:instrText>
+              <w:instrText xml:space="preserve"> PAGEREF _Toc229556430 \h </w:instrText>
             </w:r>
             <w:r>
               <w:rPr>
@@ -855,7 +854,7 @@
               <w14:ligatures w14:val="standardContextual"/>
             </w:rPr>
           </w:pPr>
-          <w:hyperlink w:anchor="_Toc229485484" w:history="1">
+          <w:hyperlink w:anchor="_Toc229556431" w:history="1">
             <w:r>
               <w:rPr>
                 <w:rStyle w:val="Lienhypertexte"/>
@@ -902,7 +901,7 @@
                 <w:sz w:val="28"/>
                 <w:szCs w:val="28"/>
               </w:rPr>
-              <w:instrText xml:space="preserve"> PAGEREF _Toc229485484 \h </w:instrText>
+              <w:instrText xml:space="preserve"> PAGEREF _Toc229556431 \h </w:instrText>
             </w:r>
             <w:r>
               <w:rPr>
@@ -970,7 +969,7 @@
               <w14:ligatures w14:val="standardContextual"/>
             </w:rPr>
           </w:pPr>
-          <w:hyperlink w:anchor="_Toc229485485" w:history="1">
+          <w:hyperlink w:anchor="_Toc229556432" w:history="1">
             <w:r>
               <w:rPr>
                 <w:rStyle w:val="Lienhypertexte"/>
@@ -1017,7 +1016,7 @@
                 <w:sz w:val="28"/>
                 <w:szCs w:val="28"/>
               </w:rPr>
-              <w:instrText xml:space="preserve"> PAGEREF _Toc229485485 \h </w:instrText>
+              <w:instrText xml:space="preserve"> PAGEREF _Toc229556432 \h </w:instrText>
             </w:r>
             <w:r>
               <w:rPr>
@@ -1085,7 +1084,7 @@
               <w14:ligatures w14:val="standardContextual"/>
             </w:rPr>
           </w:pPr>
-          <w:hyperlink w:anchor="_Toc229485486" w:history="1">
+          <w:hyperlink w:anchor="_Toc229556433" w:history="1">
             <w:r>
               <w:rPr>
                 <w:rStyle w:val="Lienhypertexte"/>
@@ -1132,7 +1131,7 @@
                 <w:sz w:val="28"/>
                 <w:szCs w:val="28"/>
               </w:rPr>
-              <w:instrText xml:space="preserve"> PAGEREF _Toc229485486 \h </w:instrText>
+              <w:instrText xml:space="preserve"> PAGEREF _Toc229556433 \h </w:instrText>
             </w:r>
             <w:r>
               <w:rPr>
@@ -1202,7 +1201,7 @@
               <w14:ligatures w14:val="standardContextual"/>
             </w:rPr>
           </w:pPr>
-          <w:hyperlink w:anchor="_Toc229485487" w:history="1">
+          <w:hyperlink w:anchor="_Toc229556434" w:history="1">
             <w:r>
               <w:rPr>
                 <w:rStyle w:val="Lienhypertexte"/>
@@ -1215,7 +1214,35 @@
                 <w:sz w:val="28"/>
                 <w:szCs w:val="28"/>
               </w:rPr>
-              <w:t>2. Empirical study of the impact of COVID-19 pandemic on employment outcomes of workers with disabilities.</w:t>
+              <w:t xml:space="preserve">2. Empirical study of the impact </w:t>
+            </w:r>
+            <w:r>
+              <w:rPr>
+                <w:rStyle w:val="Lienhypertexte"/>
+                <w:rFonts w:ascii="Times New Roman" w:hAnsi="Times New Roman"/>
+                <w:b w:val="0"/>
+                <w:bCs w:val="0"/>
+                <w:i w:val="0"/>
+                <w:iCs w:val="0"/>
+                <w:noProof/>
+                <w:sz w:val="28"/>
+                <w:szCs w:val="28"/>
+              </w:rPr>
+              <w:t>o</w:t>
+            </w:r>
+            <w:r>
+              <w:rPr>
+                <w:rStyle w:val="Lienhypertexte"/>
+                <w:rFonts w:ascii="Times New Roman" w:hAnsi="Times New Roman"/>
+                <w:b w:val="0"/>
+                <w:bCs w:val="0"/>
+                <w:i w:val="0"/>
+                <w:iCs w:val="0"/>
+                <w:noProof/>
+                <w:sz w:val="28"/>
+                <w:szCs w:val="28"/>
+              </w:rPr>
+              <w:t>f COVID-19 pandemic on employment outcomes of workers with disabilities.</w:t>
             </w:r>
             <w:r>
               <w:rPr>
@@ -1257,7 +1284,7 @@
                 <w:sz w:val="28"/>
                 <w:szCs w:val="28"/>
               </w:rPr>
-              <w:instrText xml:space="preserve"> PAGEREF _Toc229485487 \h </w:instrText>
+              <w:instrText xml:space="preserve"> PAGEREF _Toc229556434 \h </w:instrText>
             </w:r>
             <w:r>
               <w:rPr>
@@ -1298,7 +1325,7 @@
                 <w:sz w:val="28"/>
                 <w:szCs w:val="28"/>
               </w:rPr>
-              <w:t>27</w:t>
+              <w:t>28</w:t>
             </w:r>
             <w:r>
               <w:rPr>
@@ -1333,7 +1360,7 @@
               <w14:ligatures w14:val="standardContextual"/>
             </w:rPr>
           </w:pPr>
-          <w:hyperlink w:anchor="_Toc229485488" w:history="1">
+          <w:hyperlink w:anchor="_Toc229556435" w:history="1">
             <w:r>
               <w:rPr>
                 <w:rStyle w:val="Lienhypertexte"/>
@@ -1380,7 +1407,7 @@
                 <w:sz w:val="28"/>
                 <w:szCs w:val="28"/>
               </w:rPr>
-              <w:instrText xml:space="preserve"> PAGEREF _Toc229485488 \h </w:instrText>
+              <w:instrText xml:space="preserve"> PAGEREF _Toc229556435 \h </w:instrText>
             </w:r>
             <w:r>
               <w:rPr>
@@ -1415,7 +1442,7 @@
                 <w:sz w:val="28"/>
                 <w:szCs w:val="28"/>
               </w:rPr>
-              <w:t>27</w:t>
+              <w:t>28</w:t>
             </w:r>
             <w:r>
               <w:rPr>
@@ -1448,7 +1475,7 @@
               <w14:ligatures w14:val="standardContextual"/>
             </w:rPr>
           </w:pPr>
-          <w:hyperlink w:anchor="_Toc229485489" w:history="1">
+          <w:hyperlink w:anchor="_Toc229556436" w:history="1">
             <w:r>
               <w:rPr>
                 <w:rStyle w:val="Lienhypertexte"/>
@@ -1495,7 +1522,7 @@
                 <w:sz w:val="28"/>
                 <w:szCs w:val="28"/>
               </w:rPr>
-              <w:instrText xml:space="preserve"> PAGEREF _Toc229485489 \h </w:instrText>
+              <w:instrText xml:space="preserve"> PAGEREF _Toc229556436 \h </w:instrText>
             </w:r>
             <w:r>
               <w:rPr>
@@ -1530,7 +1557,7 @@
                 <w:sz w:val="28"/>
                 <w:szCs w:val="28"/>
               </w:rPr>
-              <w:t>38</w:t>
+              <w:t>39</w:t>
             </w:r>
             <w:r>
               <w:rPr>
@@ -1563,7 +1590,7 @@
               <w14:ligatures w14:val="standardContextual"/>
             </w:rPr>
           </w:pPr>
-          <w:hyperlink w:anchor="_Toc229485490" w:history="1">
+          <w:hyperlink w:anchor="_Toc229556437" w:history="1">
             <w:r>
               <w:rPr>
                 <w:rStyle w:val="Lienhypertexte"/>
@@ -1610,7 +1637,7 @@
                 <w:sz w:val="28"/>
                 <w:szCs w:val="28"/>
               </w:rPr>
-              <w:instrText xml:space="preserve"> PAGEREF _Toc229485490 \h </w:instrText>
+              <w:instrText xml:space="preserve"> PAGEREF _Toc229556437 \h </w:instrText>
             </w:r>
             <w:r>
               <w:rPr>
@@ -1645,7 +1672,7 @@
                 <w:sz w:val="28"/>
                 <w:szCs w:val="28"/>
               </w:rPr>
-              <w:t>42</w:t>
+              <w:t>43</w:t>
             </w:r>
             <w:r>
               <w:rPr>
@@ -1680,7 +1707,7 @@
               <w14:ligatures w14:val="standardContextual"/>
             </w:rPr>
           </w:pPr>
-          <w:hyperlink w:anchor="_Toc229485491" w:history="1">
+          <w:hyperlink w:anchor="_Toc229556438" w:history="1">
             <w:r>
               <w:rPr>
                 <w:rStyle w:val="Lienhypertexte"/>
@@ -1735,7 +1762,7 @@
                 <w:sz w:val="28"/>
                 <w:szCs w:val="28"/>
               </w:rPr>
-              <w:instrText xml:space="preserve"> PAGEREF _Toc229485491 \h </w:instrText>
+              <w:instrText xml:space="preserve"> PAGEREF _Toc229556438 \h </w:instrText>
             </w:r>
             <w:r>
               <w:rPr>
@@ -1776,7 +1803,7 @@
                 <w:sz w:val="28"/>
                 <w:szCs w:val="28"/>
               </w:rPr>
-              <w:t>54</w:t>
+              <w:t>55</w:t>
             </w:r>
             <w:r>
               <w:rPr>
@@ -1813,7 +1840,7 @@
               <w14:ligatures w14:val="standardContextual"/>
             </w:rPr>
           </w:pPr>
-          <w:hyperlink w:anchor="_Toc229485492" w:history="1">
+          <w:hyperlink w:anchor="_Toc229556439" w:history="1">
             <w:r>
               <w:rPr>
                 <w:rStyle w:val="Lienhypertexte"/>
@@ -1868,7 +1895,7 @@
                 <w:sz w:val="28"/>
                 <w:szCs w:val="28"/>
               </w:rPr>
-              <w:instrText xml:space="preserve"> PAGEREF _Toc229485492 \h </w:instrText>
+              <w:instrText xml:space="preserve"> PAGEREF _Toc229556439 \h </w:instrText>
             </w:r>
             <w:r>
               <w:rPr>
@@ -1909,7 +1936,7 @@
                 <w:sz w:val="28"/>
                 <w:szCs w:val="28"/>
               </w:rPr>
-              <w:t>57</w:t>
+              <w:t>58</w:t>
             </w:r>
             <w:r>
               <w:rPr>
@@ -1946,7 +1973,7 @@
               <w14:ligatures w14:val="standardContextual"/>
             </w:rPr>
           </w:pPr>
-          <w:hyperlink w:anchor="_Toc229485493" w:history="1">
+          <w:hyperlink w:anchor="_Toc229556440" w:history="1">
             <w:r>
               <w:rPr>
                 <w:rStyle w:val="Lienhypertexte"/>
@@ -1959,7 +1986,7 @@
                 <w:sz w:val="28"/>
                 <w:szCs w:val="28"/>
               </w:rPr>
-              <w:t>References</w:t>
+              <w:t>Bibliography</w:t>
             </w:r>
             <w:r>
               <w:rPr>
@@ -2001,7 +2028,7 @@
                 <w:sz w:val="28"/>
                 <w:szCs w:val="28"/>
               </w:rPr>
-              <w:instrText xml:space="preserve"> PAGEREF _Toc229485493 \h </w:instrText>
+              <w:instrText xml:space="preserve"> PAGEREF _Toc229556440 \h </w:instrText>
             </w:r>
             <w:r>
               <w:rPr>
@@ -2042,7 +2069,7 @@
                 <w:sz w:val="28"/>
                 <w:szCs w:val="28"/>
               </w:rPr>
-              <w:t>61</w:t>
+              <w:t>62</w:t>
             </w:r>
             <w:r>
               <w:rPr>
@@ -2079,7 +2106,7 @@
               <w14:ligatures w14:val="standardContextual"/>
             </w:rPr>
           </w:pPr>
-          <w:hyperlink w:anchor="_Toc229485494" w:history="1">
+          <w:hyperlink w:anchor="_Toc229556441" w:history="1">
             <w:r>
               <w:rPr>
                 <w:rStyle w:val="Lienhypertexte"/>
@@ -2134,7 +2161,7 @@
                 <w:sz w:val="28"/>
                 <w:szCs w:val="28"/>
               </w:rPr>
-              <w:instrText xml:space="preserve"> PAGEREF _Toc229485494 \h </w:instrText>
+              <w:instrText xml:space="preserve"> PAGEREF _Toc229556441 \h </w:instrText>
             </w:r>
             <w:r>
               <w:rPr>
@@ -2175,7 +2202,7 @@
                 <w:sz w:val="28"/>
                 <w:szCs w:val="28"/>
               </w:rPr>
-              <w:t>62</w:t>
+              <w:t>66</w:t>
             </w:r>
             <w:r>
               <w:rPr>
@@ -2212,7 +2239,7 @@
               <w14:ligatures w14:val="standardContextual"/>
             </w:rPr>
           </w:pPr>
-          <w:hyperlink w:anchor="_Toc229485495" w:history="1">
+          <w:hyperlink w:anchor="_Toc229556442" w:history="1">
             <w:r>
               <w:rPr>
                 <w:rStyle w:val="Lienhypertexte"/>
@@ -2268,7 +2295,7 @@
                 <w:sz w:val="28"/>
                 <w:szCs w:val="28"/>
               </w:rPr>
-              <w:instrText xml:space="preserve"> PAGEREF _Toc229485495 \h </w:instrText>
+              <w:instrText xml:space="preserve"> PAGEREF _Toc229556442 \h </w:instrText>
             </w:r>
             <w:r>
               <w:rPr>
@@ -2309,7 +2336,7 @@
                 <w:sz w:val="28"/>
                 <w:szCs w:val="28"/>
               </w:rPr>
-              <w:t>68</w:t>
+              <w:t>72</w:t>
             </w:r>
             <w:r>
               <w:rPr>
@@ -2328,6 +2355,11 @@
           </w:hyperlink>
         </w:p>
         <w:p>
+          <w:pPr>
+            <w:rPr>
+              <w:szCs w:val="28"/>
+            </w:rPr>
+          </w:pPr>
           <w:r>
             <w:rPr>
               <w:noProof/>
@@ -2356,7 +2388,7 @@
       <w:pPr>
         <w:pStyle w:val="Titre1"/>
       </w:pPr>
-      <w:bookmarkStart w:id="1" w:name="_Toc229485482"/>
+      <w:bookmarkStart w:id="1" w:name="_Toc229556429"/>
       <w:r>
         <w:lastRenderedPageBreak/>
         <w:t>Introduction</w:t>
@@ -2642,10 +2674,7 @@
         </w:numPr>
       </w:pPr>
       <w:r>
-        <w:t>Systematize theoretical approaches to the analysis of labour market performance of people with disabilities and different types of discrimination frameworks</w:t>
-      </w:r>
-      <w:r>
-        <w:t>.</w:t>
+        <w:t>Systematize theoretical approaches to the analysis of labour market performance of people with disabilities and different types of discrimination frameworks.</w:t>
       </w:r>
     </w:p>
     <w:p>
@@ -2687,7 +2716,7 @@
     <w:p>
       <w:pPr>
         <w:rPr>
-          <w:lang w:val="ru-RU"/>
+          <w:lang w:val="en-US"/>
         </w:rPr>
       </w:pPr>
     </w:p>
@@ -3024,7 +3053,7 @@
         <w:jc w:val="left"/>
       </w:pPr>
       <w:bookmarkStart w:id="2" w:name="_Toc198772486"/>
-      <w:bookmarkStart w:id="3" w:name="_Toc229485483"/>
+      <w:bookmarkStart w:id="3" w:name="_Toc229556430"/>
       <w:r>
         <w:lastRenderedPageBreak/>
         <w:t xml:space="preserve">1. </w:t>
@@ -3041,7 +3070,7 @@
         <w:jc w:val="left"/>
       </w:pPr>
       <w:bookmarkStart w:id="4" w:name="_Toc198772487"/>
-      <w:bookmarkStart w:id="5" w:name="_Toc229485484"/>
+      <w:bookmarkStart w:id="5" w:name="_Toc229556431"/>
       <w:r>
         <w:t>1.1 Disability definition</w:t>
       </w:r>
@@ -3521,7 +3550,7 @@
         <w:jc w:val="left"/>
       </w:pPr>
       <w:bookmarkStart w:id="6" w:name="_Toc198772488"/>
-      <w:bookmarkStart w:id="7" w:name="_Toc229485485"/>
+      <w:bookmarkStart w:id="7" w:name="_Toc229556432"/>
       <w:r>
         <w:t>1.2 Theoretical frameworks regarding disability and labor market</w:t>
       </w:r>
@@ -3618,11 +3647,20 @@
         <w:ind w:firstLine="720"/>
       </w:pPr>
       <w:r>
-        <w:t xml:space="preserve">According to Becker, investments in human capital can be understood as analogous to investments in physical capital. He delineates several critical dimensions: first, individuals determine the extent of their investment in education and health based on anticipated returns; second, an individual’s level of education and qualifications directly influences their earnings and economic participation. </w:t>
+        <w:t>According to Becker, investments in human capital can be understood as analogous to investments in physical capital</w:t>
+      </w:r>
+      <w:r>
+        <w:rPr>
+          <w:rStyle w:val="Appelnotedebasdep"/>
+        </w:rPr>
+        <w:footnoteReference w:id="17"/>
+      </w:r>
+      <w:r>
+        <w:t xml:space="preserve">. He delineates several critical </w:t>
       </w:r>
       <w:r>
         <w:lastRenderedPageBreak/>
-        <w:t>Becker further highlights that disparities in human capital endowments across population groups can generate inequalities in both income distribution and access to opportunities</w:t>
+        <w:t>dimensions: first, individuals determine the extent of their investment in education and health based on anticipated returns; second, an individual’s level of education and qualifications directly influences their earnings and economic participation. Becker further highlights that disparities in human capital endowments across population groups can generate inequalities in both income distribution and access to opportunities</w:t>
       </w:r>
       <w:r>
         <w:t>.</w:t>
@@ -3639,7 +3677,7 @@
         <w:rPr>
           <w:rStyle w:val="Appelnotedebasdep"/>
         </w:rPr>
-        <w:footnoteReference w:id="17"/>
+        <w:footnoteReference w:id="18"/>
       </w:r>
       <w:r>
         <w:t xml:space="preserve">. </w:t>
@@ -3651,7 +3689,7 @@
         <w:rPr>
           <w:rStyle w:val="Appelnotedebasdep"/>
         </w:rPr>
-        <w:footnoteReference w:id="18"/>
+        <w:footnoteReference w:id="19"/>
       </w:r>
       <w:r>
         <w:t xml:space="preserve">. Econometric models, incorporating human capital variables such as education and work experience, can help quantify the pandemic’s differential impact on workers with disabilities compared to their non-disabled </w:t>
@@ -3674,7 +3712,11 @@
         <w:t>, transportation expenses</w:t>
       </w:r>
       <w:r>
-        <w:t>, or specialized healthcare. Moreover, anticipated returns on such investments may be systematically lower due to labor market discrimination, physical and social barriers in workplaces, or a lack of reasonable accommodations. Becker himself acknowledged that employer discrimination, based on taste or perceived productivity differences, could distort market outcomes. Consequently, even when disabled individuals possess equal or higher levels of formal human capital compared to non-disable, their employment rates and earnings frequently lag behind</w:t>
+        <w:t xml:space="preserve">, or specialized healthcare. Moreover, anticipated returns on such investments may be systematically lower due to labor market discrimination, physical and social barriers in workplaces, or a lack of reasonable accommodations. Becker himself acknowledged that employer discrimination, based on taste or perceived productivity differences, could distort market outcomes. Consequently, even when disabled individuals possess equal or </w:t>
+      </w:r>
+      <w:r>
+        <w:lastRenderedPageBreak/>
+        <w:t>higher levels of formal human capital compared to non-disable, their employment rates and earnings frequently lag behind</w:t>
       </w:r>
       <w:r>
         <w:t xml:space="preserve"> – </w:t>
@@ -3691,11 +3733,19 @@
         <w:ind w:firstLine="720"/>
       </w:pPr>
       <w:r>
-        <w:lastRenderedPageBreak/>
         <w:t xml:space="preserve">Health capital also plays crucial role. </w:t>
       </w:r>
       <w:r>
-        <w:t>Health investments, including rehabilitation, assistive devices, and ongoing medical care, directly affect the productive capacity and labor supply of disabled people. However, if these investments are underfunded or inaccessible, the formation of human capital among disabled individuals is compromised from an early age. Furthermore, employers may underestimate the productivity of disabled workers due to inaccurate perceptions of health-related limitations, thereby reducing the incentives for disabled individuals to invest in further education or job-specific skills. This creates a suboptimal equilibrium: lower demand for labor leads to lower expected returns, which in turn reduces investment incentives, perpetuating lower employment and earnings</w:t>
+        <w:t>Health investments, including rehabilitation, assistive devices, and ongoing medical care, directly affect the productive capacity and labor supply of disabled people. However, if these investments are underfunded or inaccessible, the formation of human capital among disabled individuals is compromised from an early age. Furthermore, employers may underestimate the productivity of disabled workers due to inaccurate perceptions of health-related limitations, thereby reducing the incentives for disabled individuals to invest in further education or job-specific skills</w:t>
+      </w:r>
+      <w:r>
+        <w:rPr>
+          <w:rStyle w:val="Appelnotedebasdep"/>
+        </w:rPr>
+        <w:footnoteReference w:id="20"/>
+      </w:r>
+      <w:r>
+        <w:t>. This creates a suboptimal equilibrium: lower demand for labor leads to lower expected returns, which in turn reduces investment incentives, perpetuating lower employment and earnings</w:t>
       </w:r>
       <w:r>
         <w:t>.</w:t>
@@ -3735,13 +3785,17 @@
         <w:ind w:firstLine="720"/>
       </w:pPr>
       <w:r>
-        <w:t>The concept of health capital, introduced by Michael Grossman in 1972, extends the principles of human capital theory to the domain of healthcare, framing health as an investment good that individuals "produce" through medical care, lifestyle choices, and environmental factors. Unlike traditional consumer goods, health capital is unique because it directly influences an individual’s productive capacity, longevity, and overall quality of life. The demand for health capital is shaped by a person’s desire to maintain well-being over their lifetime, balancing immediate consumption against future health benefits</w:t>
+        <w:t xml:space="preserve">The concept of health capital, introduced by Michael Grossman in 1972, extends the principles of human capital theory to the domain of healthcare, framing health as an investment good that individuals "produce" through medical care, lifestyle choices, and environmental factors. Unlike traditional consumer goods, health capital is unique because it directly influences an individual’s productive capacity, longevity, and overall quality of life. The demand for health capital is </w:t>
+      </w:r>
+      <w:r>
+        <w:lastRenderedPageBreak/>
+        <w:t>shaped by a person’s desire to maintain well-being over their lifetime, balancing immediate consumption against future health benefits</w:t>
       </w:r>
       <w:r>
         <w:rPr>
           <w:rStyle w:val="Appelnotedebasdep"/>
         </w:rPr>
-        <w:footnoteReference w:id="19"/>
+        <w:footnoteReference w:id="21"/>
       </w:r>
       <w:r>
         <w:t>.</w:t>
@@ -3752,14 +3806,13 @@
         <w:ind w:firstLine="720"/>
       </w:pPr>
       <w:r>
-        <w:lastRenderedPageBreak/>
         <w:t>Grossman’s model posits that individuals act as both producers and consumers of health, investing in medical services, nutrition, and exercise to "depreciate" health capital more slowly. This framework helps explain why higher-income individuals often exhibit better health outcomes – they can afford greater investments in healthcare, healthier diets, and safer living conditions</w:t>
       </w:r>
       <w:r>
         <w:rPr>
           <w:rStyle w:val="Appelnotedebasdep"/>
         </w:rPr>
-        <w:footnoteReference w:id="20"/>
+        <w:footnoteReference w:id="22"/>
       </w:r>
       <w:r>
         <w:t>.</w:t>
@@ -3781,7 +3834,7 @@
           <w:rStyle w:val="Appelnotedebasdep"/>
           <w:lang w:val="ru-RU"/>
         </w:rPr>
-        <w:footnoteReference w:id="21"/>
+        <w:footnoteReference w:id="23"/>
       </w:r>
       <w:r>
         <w:t xml:space="preserve">. </w:t>
@@ -3807,16 +3860,20 @@
         <w:rPr>
           <w:rStyle w:val="Appelnotedebasdep"/>
         </w:rPr>
-        <w:footnoteReference w:id="22"/>
-      </w:r>
-      <w:r>
-        <w:t>. Newer econometric approaches, such as structural equation modeling, attempt to integrate these systemic factors by analyzing pathways like stress-induced biological wear-and-tear</w:t>
+        <w:footnoteReference w:id="24"/>
+      </w:r>
+      <w:r>
+        <w:t xml:space="preserve">. Newer econometric approaches, such as structural equation modeling, </w:t>
+      </w:r>
+      <w:r>
+        <w:lastRenderedPageBreak/>
+        <w:t>attempt to integrate these systemic factors by analyzing pathways like stress-induced biological wear-and-tear</w:t>
       </w:r>
       <w:r>
         <w:rPr>
           <w:rStyle w:val="Appelnotedebasdep"/>
         </w:rPr>
-        <w:footnoteReference w:id="23"/>
+        <w:footnoteReference w:id="25"/>
       </w:r>
       <w:r>
         <w:t>.</w:t>
@@ -3827,7 +3884,6 @@
         <w:ind w:firstLine="720"/>
       </w:pPr>
       <w:r>
-        <w:lastRenderedPageBreak/>
         <w:t>In summary, DHC approach is more sensible to pandemic related restrictions hence it studies health capital primely. However  as with previous framework this approach has its limitations regarding policy interventions.</w:t>
       </w:r>
     </w:p>
@@ -3858,7 +3914,7 @@
         <w:rPr>
           <w:rStyle w:val="Appelnotedebasdep"/>
         </w:rPr>
-        <w:footnoteReference w:id="24"/>
+        <w:footnoteReference w:id="26"/>
       </w:r>
       <w:r>
         <w:t xml:space="preserve">. This framework distinguishes between functionings (what people actually do and are) and capabilities (the genuine freedoms they </w:t>
@@ -3867,7 +3923,16 @@
         <w:t>must</w:t>
       </w:r>
       <w:r>
-        <w:t xml:space="preserve"> choose among possible functionings). Unlike traditional metrics such as GDP, the Capability Approach provides a multidimensional lens to assess crises, asking not just about survival rates but whether people can live with dignity during and after emergencies.</w:t>
+        <w:t xml:space="preserve"> choose among possible functionings). Unlike traditional metrics such as GDP, the Capability Approach provides a multidimensional lens to assess crises, asking not just about survival rates but whether people can live with dignity during and after emergencies</w:t>
+      </w:r>
+      <w:r>
+        <w:rPr>
+          <w:rStyle w:val="Appelnotedebasdep"/>
+        </w:rPr>
+        <w:footnoteReference w:id="27"/>
+      </w:r>
+      <w:r>
+        <w:t>.</w:t>
       </w:r>
     </w:p>
     <w:p>
@@ -3887,13 +3952,17 @@
         <w:t>:</w:t>
       </w:r>
       <w:r>
-        <w:t xml:space="preserve"> including life, bodily health, and political participation offer a normative framework for policy evaluation. When applied to school closures, this reveals how digital divides not only affected education (a functioning) but diminished future capabilities like labor market participation</w:t>
+        <w:t xml:space="preserve"> including life, bodily health, and political participation offer a normative framework for policy evaluation. When applied to school closures, this reveals how digital divides not only affected education (a functioning) but diminished future capabilities like labor market </w:t>
+      </w:r>
+      <w:r>
+        <w:lastRenderedPageBreak/>
+        <w:t>participation</w:t>
       </w:r>
       <w:r>
         <w:rPr>
           <w:rStyle w:val="Appelnotedebasdep"/>
         </w:rPr>
-        <w:footnoteReference w:id="25"/>
+        <w:footnoteReference w:id="28"/>
       </w:r>
       <w:r>
         <w:t>. Structural equation modeling demonstrates these intergenerational capability deprivations particularly impacted girls in low-income countries</w:t>
@@ -3902,7 +3971,7 @@
         <w:rPr>
           <w:rStyle w:val="Appelnotedebasdep"/>
         </w:rPr>
-        <w:footnoteReference w:id="26"/>
+        <w:footnoteReference w:id="29"/>
       </w:r>
       <w:r>
         <w:t>.</w:t>
@@ -3925,64 +3994,60 @@
         <w:t>n</w:t>
       </w:r>
       <w:r>
-        <w:t xml:space="preserve"> insight applicable to pandemic medical </w:t>
+        <w:t xml:space="preserve"> insight applicable to pandemic medical shortages. Countries following capability-oriented policies prioritized both ICU beds (health functioning) and fair allocation systems (health agency), outperforming nations focused solely on medical outputs</w:t>
+      </w:r>
+      <w:r>
+        <w:t xml:space="preserve">. </w:t>
+      </w:r>
+      <w:r>
+        <w:t>Randomized evaluations of vaccine distribution confirm that participatory approaches</w:t>
+      </w:r>
+      <w:r>
+        <w:t>:</w:t>
+      </w:r>
+      <w:r>
+        <w:t xml:space="preserve"> involving communities in priority-setting increased both uptake and perceived fairness. Such findings underscore the approach's core thesis: development must expand people's ability to shape their lives, not just deliver goods.</w:t>
+      </w:r>
+    </w:p>
+    <w:p>
+      <w:pPr>
+        <w:ind w:firstLine="720"/>
+        <w:rPr>
+          <w:lang w:val="en-US"/>
+        </w:rPr>
+      </w:pPr>
+      <w:r>
+        <w:t>This directly addresses a limitation of both Becker's and Grossman's human capital frameworks, which assume relatively homogeneous conversion capacities. For disabled people, the Capability Approach insists that equality of resources (e.g., same income or education as non-disabled peers) is insufficient for achieving genuine equality of capabilities. Two persons with identical financial resources may have vastly different real freedoms: one with a mobility impairment requires accessible transport and ramps to achieve the functioning of moving freely, whereas a non-disabled person does not. Therefore, justice demands not merely equal inputs but equal capabilities, meaning targeted accommodations and structural changes to remove barriers to conversion</w:t>
+      </w:r>
+      <w:r>
+        <w:t>.</w:t>
+      </w:r>
+    </w:p>
+    <w:p>
+      <w:pPr>
+        <w:ind w:firstLine="720"/>
+        <w:rPr>
+          <w:lang w:val="en-US"/>
+        </w:rPr>
+      </w:pPr>
+      <w:r>
+        <w:t>In summary, t</w:t>
+      </w:r>
+      <w:r>
+        <w:t xml:space="preserve">his approach </w:t>
+      </w:r>
+      <w:r>
+        <w:t>provides an alternative to human capital and health capital frameworks by centering analysis on capabilities</w:t>
+      </w:r>
+      <w:r>
+        <w:t xml:space="preserve"> </w:t>
+      </w:r>
+      <w:r>
+        <w:t xml:space="preserve">rather than resources, utility, or productivity. It defines well-being as the ability to achieve valuable </w:t>
       </w:r>
       <w:r>
         <w:lastRenderedPageBreak/>
-        <w:t>shortages. Countries following capability-oriented policies prioritized both ICU beds (health functioning) and fair allocation systems (health agency), outperforming nations focused solely on medical outputs</w:t>
-      </w:r>
-      <w:r>
-        <w:t xml:space="preserve">. </w:t>
-      </w:r>
-      <w:r>
-        <w:t>Randomized evaluations of vaccine distribution confirm that participatory approaches</w:t>
-      </w:r>
-      <w:r>
-        <w:t>:</w:t>
-      </w:r>
-      <w:r>
-        <w:t xml:space="preserve"> involving communities in priority-setting increased both uptake and perceived fairness. Such findings underscore the approach's core thesis: development must expand people's ability to shape their lives, not just deliver goods.</w:t>
-      </w:r>
-    </w:p>
-    <w:p>
-      <w:pPr>
-        <w:ind w:firstLine="720"/>
-        <w:rPr>
-          <w:lang w:val="en-US"/>
-        </w:rPr>
-      </w:pPr>
-      <w:r>
-        <w:t>This directly addresses a limitation of both Becker's and Grossman's human capital frameworks, which assume relatively homogeneous conversion capacities. For disabled people, the Capability Approach insists that equality of resources (e.g., same income or education as non-disabled peers) is insufficient for achieving genuine equality of capabilities. Two persons with identical financial resources may have vastly different real freedoms: one with a mobility impairment requires accessible transport and ramps to achieve the functioning of moving freely, whereas a non-disabled person does not. Therefore, justice demands not merely equal inputs but equal capabilities, meaning targeted accommodations and structural changes to remove barriers to conversion</w:t>
-      </w:r>
-      <w:r>
-        <w:t>.</w:t>
-      </w:r>
-    </w:p>
-    <w:p>
-      <w:pPr>
-        <w:ind w:firstLine="720"/>
-        <w:rPr>
-          <w:lang w:val="en-US"/>
-        </w:rPr>
-      </w:pPr>
-      <w:r>
-        <w:t>In summary, t</w:t>
-      </w:r>
-      <w:r>
-        <w:t xml:space="preserve">his approach </w:t>
-      </w:r>
-      <w:r>
-        <w:t>provides an alternative to human capital and health capital frameworks by centering analysis on capabilities</w:t>
-      </w:r>
-      <w:r>
-        <w:t xml:space="preserve"> </w:t>
-      </w:r>
-      <w:r>
-        <w:t xml:space="preserve">rather than resources, utility, or productivity. It defines well-being as the ability to achieve valuable functionings, such as working, participating in community life, and maintaining health, while explicitly accounting for human diversity and conversion factors. For disabled people, the approach is particularly powerful because it reveals that equal resources cannot guarantee equal opportunities when personal, social, and environmental barriers exist. In the employment domain, the Capability Approach advocates for systemic removal of disabling barriers, reasonable accommodations, </w:t>
-      </w:r>
-      <w:r>
-        <w:lastRenderedPageBreak/>
-        <w:t xml:space="preserve">and respect for diverse work-related choices, rather than narrowly focusing on earnings or labor market outputs. </w:t>
+        <w:t xml:space="preserve">functionings, such as working, participating in community life, and maintaining health, while explicitly accounting for human diversity and conversion factors. For disabled people, the approach is particularly powerful because it reveals that equal resources cannot guarantee equal opportunities when personal, social, and environmental barriers exist. In the employment domain, the Capability Approach advocates for systemic removal of disabling barriers, reasonable accommodations, and respect for diverse work-related choices, rather than narrowly focusing on earnings or labor market outputs. </w:t>
       </w:r>
     </w:p>
     <w:p>
@@ -4016,7 +4081,7 @@
         <w:rPr>
           <w:rStyle w:val="Appelnotedebasdep"/>
         </w:rPr>
-        <w:footnoteReference w:id="27"/>
+        <w:footnoteReference w:id="30"/>
       </w:r>
       <w:r>
         <w:t xml:space="preserve">, </w:t>
@@ -4039,11 +4104,11 @@
         <w:ind w:firstLine="720"/>
       </w:pPr>
       <w:r>
-        <w:t xml:space="preserve">The primary sector consists of jobs offering high wages, employment stability, opportunities for advancement, due process protections, fringe benefits, and positive working conditions. These jobs are often located in core industries (e.g., manufacturing, finance, public administration) and are typically filled through internal labour markets, where hiring occurs from within the organization and wages are attached to job positions rather than to individual productivity. In contrast, the secondary sector comprises low-wage, precarious employment characterized by high turnover, limited or no promotion prospects, few benefits, arbitrary supervision, and minimal legal or collective protections. Secondary sector jobs are concentrated </w:t>
+        <w:t xml:space="preserve">The primary sector consists of jobs offering high wages, employment stability, opportunities for advancement, due process protections, fringe benefits, and positive working conditions. These jobs are often located in core industries (e.g., </w:t>
       </w:r>
       <w:r>
         <w:lastRenderedPageBreak/>
-        <w:t>in peripheral industries (e.g., retail, hospitality, temporary agencies, domestic work) and operate under external labour markets, where wages are determined by spot market competition.</w:t>
+        <w:t>manufacturing, finance, public administration) and are typically filled through internal labour markets, where hiring occurs from within the organization and wages are attached to job positions rather than to individual productivity. In contrast, the secondary sector comprises low-wage, precarious employment characterized by high turnover, limited or no promotion prospects, few benefits, arbitrary supervision, and minimal legal or collective protections. Secondary sector jobs are concentrated in peripheral industries (e.g., retail, hospitality, temporary agencies, domestic work) and operate under external labour markets, where wages are determined by spot market competition.</w:t>
       </w:r>
     </w:p>
     <w:p>
@@ -4089,7 +4154,11 @@
         <w:t xml:space="preserve"> and regural workers. E</w:t>
       </w:r>
       <w:r>
-        <w:t>ven when entering primary sector employment, they often face internal segmentation.</w:t>
+        <w:t xml:space="preserve">ven when entering primary sector employment, they often face </w:t>
+      </w:r>
+      <w:r>
+        <w:lastRenderedPageBreak/>
+        <w:t>internal segmentation.</w:t>
       </w:r>
       <w:r>
         <w:t xml:space="preserve"> This framework is highly adaptable both with social definition of disability and policy evaluation strategies.</w:t>
@@ -4119,11 +4188,16 @@
         <w:ind w:firstLine="720"/>
       </w:pPr>
       <w:r>
-        <w:t xml:space="preserve">Developed primarily by Fiona Kumari Campbell in her seminal 2009 monograph, Contours of Ableism: The Production of Disability and Abledness, and further developed it in subsequent articles such as “Inciting Legal Fictions: </w:t>
-      </w:r>
-      <w:r>
-        <w:lastRenderedPageBreak/>
-        <w:t>Disability’s Date with Ontology and the Ableist Body of the Law” (2001) and “Exploring Internalized Ableism Using Critical Race Theory” (2008). Drawing from poststructuralist and critical race traditions, Campbell moved beyond individual or attitudinal models of prejudice to expose how ableism operates as an entrenched, often invisible, logic embedded within the rules, practices, and norms of modern institutions. For Campbell, institutional ableism is not merely a collection of discriminatory acts but a deep-seated ontological framework that privileges “abledness” as the natural, desirable, and neutral standard of human being, thereby rendering disability as a deficit, a deviation, or a state of incompleteness.</w:t>
+        <w:t>Developed primarily by Fiona Kumari Campbell in her seminal 2009 monograph, Contours of Ableism: The Production of Disability and Abledness, and further developed it in subsequent articles such as “Inciting Legal Fictions: Disability’s Date with Ontology and the Ableist Body of the Law” (2001) and “Exploring Internalized Ableism Using Critical Race Theory” (2008). Drawing from poststructuralist and critical race traditions, Campbell moved beyond individual or attitudinal models of prejudice to expose how ableism operates as an entrenched, often invisible, logic embedded within the rules, practices, and norms of modern institutions. For Campbell, institutional ableism is not merely a collection of discriminatory acts but a deep-seated ontological framework that privileges “abledness” as the natural, desirable, and neutral standard of human being, thereby rendering disability as a deficit, a deviation, or a state of incompleteness</w:t>
+      </w:r>
+      <w:r>
+        <w:rPr>
+          <w:rStyle w:val="Appelnotedebasdep"/>
+        </w:rPr>
+        <w:footnoteReference w:id="31"/>
+      </w:r>
+      <w:r>
+        <w:t>.</w:t>
       </w:r>
     </w:p>
     <w:p>
@@ -4151,7 +4225,11 @@
         <w:t>institutional</w:t>
       </w:r>
       <w:r>
-        <w:t xml:space="preserve"> ableism, which she defines as the systematic production of disability through governance, architecture, policy, and professional epistemologies. She argues that institutions such as education, healthcare, law, and employment operate on unexamined assumptions about human functionality, time, productivity, and spatial organization that systematically exclude or marginalize disabled people. A key aspect is what Campbell terms the “tyranny of the normative”—the relentless demand that bodies and minds conform to statistical averages or idealized capacities. This normativity is not neutral but actively constructed through institutional routines: standardized testing, nine-to-five work schedules, linear career trajectories, and architectural designs that presume bipedal mobility and sensory typicality. Moreover, Campbell emphasizes that institutional ableism is often enacted with benevolent intent, masked by discourses of “reasonable accommodation” or “special needs,” which paradoxically reinforce the disabled person’s status as an exception to an otherwise unmarked, able-bodied rule.</w:t>
+        <w:t xml:space="preserve"> ableism, which she defines as the systematic production of disability through governance, architecture, policy, and professional epistemologies. She argues that institutions such as education, healthcare, law, and employment operate on unexamined assumptions about human functionality, time, productivity, and spatial organization that systematically exclude or marginalize disabled people. A key aspect is what Campbell terms the “tyranny of the normative”—the relentless demand that bodies and minds conform to statistical averages or idealized capacities. This normativity is not neutral but actively constructed through institutional routines: standardized testing, nine-to-five work schedules, linear career trajectories, and architectural designs that presume </w:t>
+      </w:r>
+      <w:r>
+        <w:lastRenderedPageBreak/>
+        <w:t>bipedal mobility and sensory typicality. Moreover, Campbell emphasizes that institutional ableism is often enacted with benevolent intent, masked by discourses of “reasonable accommodation” or “special needs,” which paradoxically reinforce the disabled person’s status as an exception to an otherwise unmarked, able-bodied rule.</w:t>
       </w:r>
     </w:p>
     <w:p>
@@ -4169,11 +4247,7 @@
         <w:t>internalized ableism</w:t>
       </w:r>
       <w:r>
-        <w:t xml:space="preserve">, which she links directly to institutional structures. While </w:t>
-      </w:r>
-      <w:r>
-        <w:lastRenderedPageBreak/>
-        <w:t>internalized ableism refers to disabled people’s own adoption of dominant norms as a measure of self-worth, Campbell insists that this psychological phenomenon cannot be separated from the institutional conditions that constantly communicate inferiority. For example, welfare-to-work programs, medical rehabilitation protocols, and disability benefit assessments often require disabled individuals to perform “recovery,” “effort,” or “compliance” in ways that deny their embodied realities. Campbell calls this the “economy of ableist recognition,” where institutions grant limited access and rights only to those disabled people who approximate able-bodied norms—a process she likns to racial passing or other kinds of assimilation. Thus, institutional ableism for Campbell is a total social fact: it shapes legal definitions of disability, structures professional training, determines funding priorities, and even influences which forms of disabled knowledge are deemed credible within academic and policy circles.</w:t>
+        <w:t>, which she links directly to institutional structures. While internalized ableism refers to disabled people’s own adoption of dominant norms as a measure of self-worth, Campbell insists that this psychological phenomenon cannot be separated from the institutional conditions that constantly communicate inferiority. For example, welfare-to-work programs, medical rehabilitation protocols, and disability benefit assessments often require disabled individuals to perform “recovery,” “effort,” or “compliance” in ways that deny their embodied realities. Campbell calls this the “economy of ableist recognition,” where institutions grant limited access and rights only to those disabled people who approximate able-bodied norms—a process she likns to racial passing or other kinds of assimilation. Thus, institutional ableism for Campbell is a total social fact: it shapes legal definitions of disability, structures professional training, determines funding priorities, and even influences which forms of disabled knowledge are deemed credible within academic and policy circles.</w:t>
       </w:r>
     </w:p>
     <w:p>
@@ -4226,6 +4300,7 @@
         <w:ind w:firstLine="720"/>
       </w:pPr>
       <w:r>
+        <w:lastRenderedPageBreak/>
         <w:t>To determine the most effective theoretical approach that explains the broadest impact of monetary policy on economic growth, the method of comparative alternatives will be used:</w:t>
       </w:r>
     </w:p>
@@ -4412,7 +4487,6 @@
     </w:p>
     <w:p>
       <w:r>
-        <w:lastRenderedPageBreak/>
         <w:t xml:space="preserve"> n – is a number of criterions;</w:t>
       </w:r>
     </w:p>
@@ -4778,6 +4852,7 @@
               <w:rPr>
                 <w:sz w:val="24"/>
               </w:rPr>
+              <w:lastRenderedPageBreak/>
               <w:t>Appliable to the problem</w:t>
             </w:r>
           </w:p>
@@ -5967,60 +6042,227 @@
         <w:t xml:space="preserve">(Table 3). </w:t>
       </w:r>
       <w:r>
-        <w:t xml:space="preserve">This approach incoroporates socioal model of disability well and adequate by all presented metrics. It addressess discrimination of disabled people by both structural and institutional dimentions. It considers shock events as drivers of structural changes in secondary sector of employment. We will be using the theory proposed by </w:t>
+        <w:t xml:space="preserve">This approach incoroporates socioal model of disability well and adequate by all presented metrics. It addressess discrimination of disabled people by both structural and institutional dimentions. It considers shock events as drivers of structural changes in secondary sector of employment. We will </w:t>
+      </w:r>
+      <w:r>
+        <w:lastRenderedPageBreak/>
+        <w:t xml:space="preserve">be using the theory proposed by </w:t>
       </w:r>
       <w:r>
         <w:t>Peter Doeringer and Michael Piore</w:t>
       </w:r>
       <w:r>
+        <w:t xml:space="preserve"> whose studies have demonstrated their applicability and relevance in this context.</w:t>
+      </w:r>
+    </w:p>
+    <w:p/>
+    <w:p>
+      <w:pPr>
+        <w:pStyle w:val="Titre2"/>
+        <w:jc w:val="left"/>
+      </w:pPr>
+      <w:bookmarkStart w:id="8" w:name="_Toc229556433"/>
+      <w:r>
+        <w:t xml:space="preserve">1.3 Application of </w:t>
+      </w:r>
+      <w:r>
+        <w:t>labor market segmentation theory</w:t>
+      </w:r>
+      <w:r>
+        <w:t xml:space="preserve"> to analyze impact of pandemic restrictions on disabled person income</w:t>
+      </w:r>
+      <w:bookmarkEnd w:id="8"/>
+    </w:p>
+    <w:p>
+      <w:pPr>
+        <w:ind w:firstLine="720"/>
+      </w:pPr>
+      <w:r>
+        <w:t>Labor Market Segmentation Theory (LMST) provides a powerful analytical framework for understanding why disabled workers experience sharper relative wage declines during economic crises compared to their non-disabled counterparts. Central to LMST is the distinction between the primary and secondary labor markets. The primary sector is characterized by stable employment, high wages, job security, fringe benefits, and internal labor markets with promotion ladders. In contrast, the secondary sector offers low wages, precarious contracts, limited benefits, high turnover, and little to no job protection. Disabled workers, due to persistent structural discrimination, lower average educational attainment resulting from earlier exclusion, and employer perceptions of lower productivity or higher accommodation costs, are disproportionately sorted into secondary sector jobs. This overrepresentation means that their employment conditions are intrinsically tied to the volatility of the secondary market.</w:t>
+      </w:r>
+    </w:p>
+    <w:p>
+      <w:pPr>
+        <w:ind w:firstLine="720"/>
+      </w:pPr>
+      <w:r>
+        <w:t>In this context, secondary</w:t>
+      </w:r>
+      <w:r>
+        <w:t xml:space="preserve"> sector is not merely a repository of low-paid work but a shock-absorbing buffer for the wider economy. </w:t>
+      </w:r>
+      <w:r>
+        <w:t>Regurally</w:t>
+      </w:r>
+      <w:r>
+        <w:t>, wage differentials between primary and secondary sectors remain relatively stable, as secondary sector wages are often determined by minimum wage floors, supply and demand for low-skill labor, and institutional factors. However, in a crisis</w:t>
+      </w:r>
+      <w:r>
         <w:t xml:space="preserve"> </w:t>
       </w:r>
       <w:r>
-        <w:t>whose studies have demonstrated their applicability and relevance in this context</w:t>
-      </w:r>
-      <w:r>
-        <w:t>.</w:t>
-      </w:r>
-    </w:p>
-    <w:p/>
+        <w:t>such as a pandemic-induced lockdown</w:t>
+      </w:r>
+      <w:r>
+        <w:t xml:space="preserve"> </w:t>
+      </w:r>
+      <w:r>
+        <w:t xml:space="preserve">firms in the secondary sector face immediate demand contractions, credit constraints, and the need for rapid cost reduction. Unlike primary sector employers, who may resort to internal adjustments such as wage freezes, reduced hours with benefits, or temporary layoffs with rehiring commitments, secondary sector </w:t>
+      </w:r>
+      <w:r>
+        <w:lastRenderedPageBreak/>
+        <w:t>employers have no such buffers. Their response is swift and brutal: wage cuts, contract non-renewals, and outright dismissals. Because disabled workers are overrepresented in this sector, they bear a disproportionate share of these adjustments, leading to a measurable fall in their average wages relative to non-disabled workers, who remain more sheltered in the primary sector.</w:t>
+      </w:r>
+    </w:p>
+    <w:p>
+      <w:pPr>
+        <w:ind w:firstLine="720"/>
+      </w:pPr>
+      <w:r>
+        <w:t xml:space="preserve">Crucially, LMST posits that the secondary sector operates under fundamentally different institutional logics during crises compared to ordinary times. In ordinary times, secondary sector wages may be “sticky” at the bottom due to statutory minimum wages or social norms, but these minima do not prevent cuts in hours, overtime, or piece rates. More importantly, during a crisis, the equilibrium of the secondary market shifts: the labor supply expands as displaced primary sector workers temporarily accept secondary jobs, while labor demand contracts. Since secondary sector jobs already feature weak bargaining power and high substitutability, employers can unilaterally reduce real wages without fear of organized resistance. Disabled workers, facing </w:t>
+      </w:r>
+      <w:r>
+        <w:t>those</w:t>
+      </w:r>
+      <w:r>
+        <w:t xml:space="preserve"> barriers </w:t>
+      </w:r>
+      <w:r>
+        <w:t xml:space="preserve">have to rely on social  system resources </w:t>
+      </w:r>
+      <w:r>
+        <w:t xml:space="preserve">more heavily </w:t>
+      </w:r>
+      <w:r>
+        <w:t xml:space="preserve">to compensate lost earnings. </w:t>
+      </w:r>
+    </w:p>
+    <w:p>
+      <w:pPr>
+        <w:ind w:firstLine="720"/>
+        <w:rPr>
+          <w:lang w:val="en-US"/>
+        </w:rPr>
+      </w:pPr>
+      <w:r>
+        <w:rPr>
+          <w:lang w:val="en-US"/>
+        </w:rPr>
+        <w:t xml:space="preserve">During </w:t>
+      </w:r>
+      <w:r>
+        <w:rPr>
+          <w:lang w:val="en-US"/>
+        </w:rPr>
+        <w:t xml:space="preserve">first wave of restrictions in </w:t>
+      </w:r>
+      <w:r>
+        <w:rPr>
+          <w:lang w:val="en-US"/>
+        </w:rPr>
+        <w:t>March 2020 through economic disruption, the divergent behavior of the primary and secondary labor markets became starkly visible, directly informing the wage decline of disabled workers relative to non-disabled workers. In the primary most non-disabled workers retained their employment, often transitioning to remote work with preserved wages, supported by government-mandated paid leave and enterprise-level collective agreements. By contrast, the secondary sector underwent a sudden and deep contraction; disabled workers, who were overrepresented in these precarious roles due to prior hiring discrimination and limited access to primary sector employment, faced immediate consequences such as unpaid leave. Consequently,</w:t>
+      </w:r>
+      <w:r>
+        <w:rPr>
+          <w:lang w:val="en-US"/>
+        </w:rPr>
+        <w:t xml:space="preserve"> disabled workers experienced wage </w:t>
+      </w:r>
+      <w:proofErr w:type="gramStart"/>
+      <w:r>
+        <w:rPr>
+          <w:lang w:val="en-US"/>
+        </w:rPr>
+        <w:t>fall</w:t>
+      </w:r>
+      <w:proofErr w:type="gramEnd"/>
+      <w:r>
+        <w:rPr>
+          <w:lang w:val="en-US"/>
+        </w:rPr>
+        <w:t xml:space="preserve"> </w:t>
+      </w:r>
+      <w:r>
+        <w:rPr>
+          <w:lang w:val="en-US"/>
+        </w:rPr>
+        <w:t>much harsher compared to non-disabled workers.</w:t>
+      </w:r>
+    </w:p>
+    <w:p>
+      <w:pPr>
+        <w:ind w:firstLine="720"/>
+        <w:rPr>
+          <w:lang w:val="en-US"/>
+        </w:rPr>
+      </w:pPr>
+      <w:r>
+        <w:lastRenderedPageBreak/>
+        <w:t>In order to measure first wave of pandemic restrictions we will employ difference in differences method on average earnings in order to assess wage decline.</w:t>
+      </w:r>
+    </w:p>
     <w:p>
       <w:pPr>
         <w:spacing w:after="160" w:line="278" w:lineRule="auto"/>
         <w:jc w:val="left"/>
         <w:rPr>
-          <w:rFonts w:eastAsiaTheme="majorEastAsia" w:cstheme="majorBidi"/>
-          <w:b/>
-          <w:szCs w:val="32"/>
-        </w:rPr>
-      </w:pPr>
-      <w:r>
+          <w:lang w:val="en-US"/>
+        </w:rPr>
+      </w:pPr>
+      <w:r>
+        <w:rPr>
+          <w:lang w:val="en-US"/>
+        </w:rPr>
         <w:br w:type="page"/>
       </w:r>
+    </w:p>
+    <w:p>
+      <w:pPr>
+        <w:pStyle w:val="Titre1"/>
+        <w:jc w:val="left"/>
+      </w:pPr>
+      <w:bookmarkStart w:id="9" w:name="_Toc229556434"/>
+      <w:r>
+        <w:lastRenderedPageBreak/>
+        <w:t xml:space="preserve">2. Empirical study of the impact of </w:t>
+      </w:r>
+      <w:r>
+        <w:t>COVID-19 pandemic on employment outcomes of workers with disabilities.</w:t>
+      </w:r>
+      <w:bookmarkEnd w:id="9"/>
     </w:p>
     <w:p>
       <w:pPr>
         <w:pStyle w:val="Titre2"/>
         <w:jc w:val="left"/>
       </w:pPr>
-      <w:bookmarkStart w:id="8" w:name="_Toc229485486"/>
-      <w:r>
-        <w:lastRenderedPageBreak/>
-        <w:t xml:space="preserve">1.3 Application of </w:t>
-      </w:r>
-      <w:r>
-        <w:t>labor market segmentation theory</w:t>
-      </w:r>
-      <w:r>
-        <w:t xml:space="preserve"> to analyze impact of pandemic restrictions on disabled person income</w:t>
-      </w:r>
-      <w:bookmarkEnd w:id="8"/>
+      <w:bookmarkStart w:id="10" w:name="_Toc229556435"/>
+      <w:r>
+        <w:t xml:space="preserve">2.1 Analysis of empirical approaches </w:t>
+      </w:r>
+      <w:r>
+        <w:t>to assess outcome variables and socio demographic factors of disability as social status.</w:t>
+      </w:r>
+      <w:bookmarkEnd w:id="10"/>
     </w:p>
     <w:p>
       <w:pPr>
         <w:ind w:firstLine="720"/>
       </w:pPr>
       <w:r>
-        <w:t>Labor Market Segmentation Theory (LMST) provides a powerful analytical framework for understanding why disabled workers experience sharper relative wage declines during economic crises compared to their non-disabled counterparts. Central to LMST is the distinction between the primary and secondary labor markets. The primary sector is characterized by stable employment, high wages, job security, fringe benefits, and internal labor markets with promotion ladders. In contrast, the secondary sector offers low wages, precarious contracts, limited benefits, high turnover, and little to no job protection. Disabled workers, due to persistent structural discrimination, lower average educational attainment resulting from earlier exclusion, and employer perceptions of lower productivity or higher accommodation costs, are disproportionately sorted into secondary sector jobs. This overrepresentation means that their employment conditions are intrinsically tied to the volatility of the secondary market.</w:t>
+        <w:t xml:space="preserve">This section will review empirical research on the employment outcomes during pandemic for people with disabilities. Additionally </w:t>
+      </w:r>
+      <w:r>
+        <w:t>we will research</w:t>
+      </w:r>
+      <w:r>
+        <w:t xml:space="preserve"> socio-demographic factiors </w:t>
+      </w:r>
+      <w:r>
+        <w:t>that influence disability</w:t>
+      </w:r>
+      <w:r>
+        <w:t>.</w:t>
       </w:r>
     </w:p>
     <w:p>
@@ -6028,195 +6270,6 @@
         <w:ind w:firstLine="720"/>
       </w:pPr>
       <w:r>
-        <w:t>In this context, secondary</w:t>
-      </w:r>
-      <w:r>
-        <w:t xml:space="preserve"> sector is not merely a repository of low-paid work but a shock-absorbing buffer for the wider economy. </w:t>
-      </w:r>
-      <w:r>
-        <w:t>Regurally</w:t>
-      </w:r>
-      <w:r>
-        <w:t>, wage differentials between primary and secondary sectors remain relatively stable, as secondary sector wages are often determined by minimum wage floors, supply and demand for low-skill labor, and institutional factors. However, in a crisis</w:t>
-      </w:r>
-      <w:r>
-        <w:t xml:space="preserve"> </w:t>
-      </w:r>
-      <w:r>
-        <w:t>such as a pandemic-induced lockdown</w:t>
-      </w:r>
-      <w:r>
-        <w:t xml:space="preserve"> </w:t>
-      </w:r>
-      <w:r>
-        <w:t xml:space="preserve">firms in the secondary sector face immediate demand contractions, credit constraints, and the need for rapid cost reduction. Unlike primary sector employers, who may resort to internal adjustments such as wage freezes, reduced hours with benefits, or temporary layoffs with rehiring commitments, secondary sector employers have no such buffers. Their response is swift and brutal: wage cuts, contract non-renewals, and outright dismissals. Because disabled workers are overrepresented in this sector, they bear a disproportionate share of these </w:t>
-      </w:r>
-      <w:r>
-        <w:lastRenderedPageBreak/>
-        <w:t>adjustments, leading to a measurable fall in their average wages relative to non-disabled workers, who remain more sheltered in the primary sector.</w:t>
-      </w:r>
-    </w:p>
-    <w:p>
-      <w:pPr>
-        <w:ind w:firstLine="720"/>
-      </w:pPr>
-      <w:r>
-        <w:t xml:space="preserve">Crucially, LMST posits that the secondary sector operates under fundamentally different institutional logics during crises compared to ordinary times. In ordinary times, secondary sector wages may be “sticky” at the bottom due to statutory minimum wages or social norms, but these minima do not prevent cuts in hours, overtime, or piece rates. More importantly, during a crisis, the equilibrium of the secondary market shifts: the labor supply expands as displaced primary sector workers temporarily accept secondary jobs, while labor demand contracts. Since secondary sector jobs already feature weak bargaining power and high substitutability, employers can unilaterally reduce real wages without fear of organized resistance. Disabled workers, facing </w:t>
-      </w:r>
-      <w:r>
-        <w:t>those</w:t>
-      </w:r>
-      <w:r>
-        <w:t xml:space="preserve"> barriers </w:t>
-      </w:r>
-      <w:r>
-        <w:t xml:space="preserve">have to rely on social  system resources </w:t>
-      </w:r>
-      <w:r>
-        <w:t xml:space="preserve">more heavily </w:t>
-      </w:r>
-      <w:r>
-        <w:t xml:space="preserve">to compensate lost earnings. </w:t>
-      </w:r>
-    </w:p>
-    <w:p>
-      <w:pPr>
-        <w:ind w:firstLine="720"/>
-        <w:rPr>
-          <w:lang w:val="en-US"/>
-        </w:rPr>
-      </w:pPr>
-      <w:r>
-        <w:rPr>
-          <w:lang w:val="en-US"/>
-        </w:rPr>
-        <w:t xml:space="preserve">During </w:t>
-      </w:r>
-      <w:r>
-        <w:rPr>
-          <w:lang w:val="en-US"/>
-        </w:rPr>
-        <w:t xml:space="preserve">first wave of restrictions in </w:t>
-      </w:r>
-      <w:r>
-        <w:rPr>
-          <w:lang w:val="en-US"/>
-        </w:rPr>
-        <w:t>March 2020 through economic disruption, the divergent behavior of the primary and secondary labor markets became starkly visible, directly informing the wage decline of disabled workers relative to non-disabled workers. In the primary most non-disabled workers retained their employment, often transitioning to remote work with preserved wages, supported by government-mandated paid leave and enterprise-level collective agreements. By contrast, the secondary sector underwent a sudden and deep contraction; disabled workers, who were overrepresented in these precarious roles due to prior hiring discrimination and limited access to primary sector employment, faced immediate consequences such as unpaid leave. Consequently,</w:t>
-      </w:r>
-      <w:r>
-        <w:rPr>
-          <w:lang w:val="en-US"/>
-        </w:rPr>
-        <w:t xml:space="preserve"> disabled workers experienced wage </w:t>
-      </w:r>
-      <w:proofErr w:type="gramStart"/>
-      <w:r>
-        <w:rPr>
-          <w:lang w:val="en-US"/>
-        </w:rPr>
-        <w:t>fall</w:t>
-      </w:r>
-      <w:proofErr w:type="gramEnd"/>
-      <w:r>
-        <w:rPr>
-          <w:lang w:val="en-US"/>
-        </w:rPr>
-        <w:t xml:space="preserve"> </w:t>
-      </w:r>
-      <w:r>
-        <w:rPr>
-          <w:lang w:val="en-US"/>
-        </w:rPr>
-        <w:t>much harsher compared to non-disabled workers.</w:t>
-      </w:r>
-    </w:p>
-    <w:p>
-      <w:pPr>
-        <w:ind w:firstLine="720"/>
-        <w:rPr>
-          <w:lang w:val="en-US"/>
-        </w:rPr>
-      </w:pPr>
-      <w:r>
-        <w:t>In order to measure first wave of pandemic restrictions we will employ difference in differences method on average earnings in order to assess wage decline.</w:t>
-      </w:r>
-    </w:p>
-    <w:p>
-      <w:pPr>
-        <w:spacing w:after="160" w:line="278" w:lineRule="auto"/>
-        <w:jc w:val="left"/>
-        <w:rPr>
-          <w:lang w:val="en-US"/>
-        </w:rPr>
-      </w:pPr>
-      <w:r>
-        <w:rPr>
-          <w:lang w:val="en-US"/>
-        </w:rPr>
-        <w:br w:type="page"/>
-      </w:r>
-    </w:p>
-    <w:p>
-      <w:pPr>
-        <w:pStyle w:val="Titre1"/>
-        <w:jc w:val="left"/>
-      </w:pPr>
-      <w:bookmarkStart w:id="9" w:name="_Toc229485487"/>
-      <w:r>
-        <w:lastRenderedPageBreak/>
-        <w:t xml:space="preserve">2. Empirical study of the impact of </w:t>
-      </w:r>
-      <w:r>
-        <w:t>COVID-19 pandemic on employment outcomes of workers with disabilities.</w:t>
-      </w:r>
-      <w:bookmarkEnd w:id="9"/>
-    </w:p>
-    <w:p>
-      <w:pPr>
-        <w:pStyle w:val="Titre2"/>
-        <w:jc w:val="left"/>
-      </w:pPr>
-      <w:bookmarkStart w:id="10" w:name="_Toc229485488"/>
-      <w:r>
-        <w:t xml:space="preserve">2.1 </w:t>
-      </w:r>
-      <w:r>
-        <w:t xml:space="preserve">Analysis of empirical approaches </w:t>
-      </w:r>
-      <w:r>
-        <w:t>to assess outcome variables and socio demographic factors of disability as social status.</w:t>
-      </w:r>
-      <w:bookmarkEnd w:id="10"/>
-    </w:p>
-    <w:p>
-      <w:pPr>
-        <w:ind w:firstLine="720"/>
-      </w:pPr>
-      <w:r>
-        <w:t xml:space="preserve">This section will review empirical research on the </w:t>
-      </w:r>
-      <w:r>
-        <w:t xml:space="preserve">employment outcomes during pandemic for people with disabilities. Additionally </w:t>
-      </w:r>
-      <w:r>
-        <w:t>we will research</w:t>
-      </w:r>
-      <w:r>
-        <w:t xml:space="preserve"> socio-demographic factiors </w:t>
-      </w:r>
-      <w:r>
-        <w:t>that influence disability</w:t>
-      </w:r>
-      <w:r>
-        <w:t>.</w:t>
-      </w:r>
-    </w:p>
-    <w:p>
-      <w:pPr>
-        <w:ind w:firstLine="720"/>
-      </w:pPr>
-      <w:r>
         <w:t xml:space="preserve">Jones </w:t>
       </w:r>
       <w:r>
@@ -6229,7 +6282,16 @@
         <w:t>two way fixed effects difference in differences</w:t>
       </w:r>
       <w:r>
-        <w:t xml:space="preserve">, employing data from the Quarterly Labour Force Survey (QLFS) for 2019 and 2020. </w:t>
+        <w:t>, employing data from the Quarterly Labour Force Survey (QLFS) for 2019 and 2020</w:t>
+      </w:r>
+      <w:r>
+        <w:rPr>
+          <w:rStyle w:val="Appelnotedebasdep"/>
+        </w:rPr>
+        <w:footnoteReference w:id="32"/>
+      </w:r>
+      <w:r>
+        <w:t xml:space="preserve">. </w:t>
       </w:r>
       <w:r>
         <w:t>The pre-pandemic analysis utilises 2019 data to estimate disability gaps in COVID-19-related economic and health risks, modelling each risk factor for individual i using OLS linear probability models as</w:t>
@@ -6294,19 +6356,7 @@
                   <w:rPr>
                     <w:rFonts w:ascii="Cambria Math" w:hAnsi="Cambria Math"/>
                   </w:rPr>
-                  <m:t xml:space="preserve">= </m:t>
-                </m:r>
-                <m:r>
-                  <w:rPr>
-                    <w:rFonts w:ascii="Cambria Math" w:hAnsi="Cambria Math"/>
-                  </w:rPr>
-                  <m:t>α</m:t>
-                </m:r>
-                <m:r>
-                  <w:rPr>
-                    <w:rFonts w:ascii="Cambria Math" w:hAnsi="Cambria Math"/>
-                  </w:rPr>
-                  <m:t>+</m:t>
+                  <m:t>= α+</m:t>
                 </m:r>
                 <m:sSub>
                   <m:sSubPr>
@@ -6338,13 +6388,7 @@
                   <w:rPr>
                     <w:rFonts w:ascii="Cambria Math" w:hAnsi="Cambria Math"/>
                   </w:rPr>
-                  <m:t>+</m:t>
-                </m:r>
-                <m:r>
-                  <w:rPr>
-                    <w:rFonts w:ascii="Cambria Math" w:hAnsi="Cambria Math"/>
-                  </w:rPr>
-                  <m:t xml:space="preserve">γ </m:t>
+                  <m:t xml:space="preserve">+γ </m:t>
                 </m:r>
                 <m:sSub>
                   <m:sSubPr>
@@ -6424,7 +6468,7 @@
               <w:jc w:val="right"/>
             </w:pPr>
             <w:r>
-              <w:t>##</w:t>
+              <w:t>2.1</w:t>
             </w:r>
           </w:p>
         </w:tc>
@@ -6637,13 +6681,7 @@
                   <w:rPr>
                     <w:rFonts w:ascii="Cambria Math" w:hAnsi="Cambria Math"/>
                   </w:rPr>
-                  <m:t xml:space="preserve">= </m:t>
-                </m:r>
-                <m:r>
-                  <w:rPr>
-                    <w:rFonts w:ascii="Cambria Math" w:hAnsi="Cambria Math"/>
-                  </w:rPr>
-                  <m:t>α+μ</m:t>
+                  <m:t>= α+μ</m:t>
                 </m:r>
                 <m:sSub>
                   <m:sSubPr>
@@ -6883,7 +6921,7 @@
               <w:jc w:val="right"/>
             </w:pPr>
             <w:r>
-              <w:t>##</w:t>
+              <w:t>2.2</w:t>
             </w:r>
           </w:p>
         </w:tc>
@@ -7069,28 +7107,7 @@
           <w:rFonts w:ascii="Georgia" w:hAnsi="Georgia"/>
           <w:color w:val="1F1F1F"/>
         </w:rPr>
-        <w:t>work-related characteristics</w:t>
-      </w:r>
-      <w:r>
-        <w:rPr>
-          <w:rFonts w:ascii="Georgia" w:hAnsi="Georgia"/>
-          <w:color w:val="1F1F1F"/>
-        </w:rPr>
-        <w:t xml:space="preserve">: </w:t>
-      </w:r>
-      <w:r>
-        <w:rPr>
-          <w:rFonts w:ascii="Georgia" w:hAnsi="Georgia"/>
-          <w:color w:val="1F1F1F"/>
-        </w:rPr>
-        <w:t>including part-time employment; self-employment (where relevant); months tenure with current employer (and tenure squared) and sector</w:t>
-      </w:r>
-      <w:r>
-        <w:rPr>
-          <w:rFonts w:ascii="Georgia" w:hAnsi="Georgia"/>
-          <w:color w:val="1F1F1F"/>
-        </w:rPr>
-        <w:t>.</w:t>
+        <w:t>work-related characteristics: including part-time employment; self-employment (where relevant); months tenure with current employer (and tenure squared) and sector.</w:t>
       </w:r>
     </w:p>
     <w:p>
@@ -7185,7 +7202,7 @@
         <w:rPr>
           <w:rStyle w:val="Appelnotedebasdep"/>
         </w:rPr>
-        <w:footnoteReference w:id="28"/>
+        <w:footnoteReference w:id="33"/>
       </w:r>
       <w:r>
         <w:t>. They made use of monthly data from the nationally representative Current Population</w:t>
@@ -7589,7 +7606,7 @@
               <w:jc w:val="right"/>
             </w:pPr>
             <w:r>
-              <w:t>##</w:t>
+              <w:t>2.3</w:t>
             </w:r>
           </w:p>
         </w:tc>
@@ -7652,16 +7669,7 @@
           <w:szCs w:val="28"/>
           <w:shd w:val="clear" w:color="auto" w:fill="FFFFFF"/>
         </w:rPr>
-        <w:t>the employment-to-population ratio in month t for disability status group d</w:t>
-      </w:r>
-      <w:r>
-        <w:rPr>
-          <w:rFonts w:ascii="Cambria" w:hAnsi="Cambria"/>
-          <w:color w:val="1B1B1B"/>
-          <w:szCs w:val="28"/>
-          <w:shd w:val="clear" w:color="auto" w:fill="FFFFFF"/>
-        </w:rPr>
-        <w:t>.</w:t>
+        <w:t>the employment-to-population ratio in month t for disability status group d.</w:t>
       </w:r>
     </w:p>
     <w:p>
@@ -7688,16 +7696,7 @@
           <w:szCs w:val="28"/>
           <w:shd w:val="clear" w:color="auto" w:fill="FFFFFF"/>
         </w:rPr>
-        <w:t> is a series of indicator variables for quarters across the study period (omitting the reference quarter Q1 2019)</w:t>
-      </w:r>
-      <w:r>
-        <w:rPr>
-          <w:rFonts w:ascii="Cambria" w:hAnsi="Cambria"/>
-          <w:color w:val="1B1B1B"/>
-          <w:szCs w:val="28"/>
-          <w:shd w:val="clear" w:color="auto" w:fill="FFFFFF"/>
-        </w:rPr>
-        <w:t>.</w:t>
+        <w:t> is a series of indicator variables for quarters across the study period (omitting the reference quarter Q1 2019).</w:t>
       </w:r>
     </w:p>
     <w:p>
@@ -7715,16 +7714,7 @@
           <w:szCs w:val="28"/>
           <w:shd w:val="clear" w:color="auto" w:fill="FFFFFF"/>
         </w:rPr>
-        <w:t>D is an indicator variable taking the value 1 when the monthly employment-to-population ratio observation is for disabled workers and 0 when it is for non-disabled workers</w:t>
-      </w:r>
-      <w:r>
-        <w:rPr>
-          <w:rFonts w:ascii="Cambria" w:hAnsi="Cambria"/>
-          <w:color w:val="1B1B1B"/>
-          <w:szCs w:val="28"/>
-          <w:shd w:val="clear" w:color="auto" w:fill="FFFFFF"/>
-        </w:rPr>
-        <w:t>.</w:t>
+        <w:t>D is an indicator variable taking the value 1 when the monthly employment-to-population ratio observation is for disabled workers and 0 when it is for non-disabled workers.</w:t>
       </w:r>
     </w:p>
     <w:p>
@@ -7751,34 +7741,7 @@
           <w:szCs w:val="28"/>
           <w:shd w:val="clear" w:color="auto" w:fill="FFFFFF"/>
         </w:rPr>
-        <w:t> is the set of group-specific, time-varying demographic covariates</w:t>
-      </w:r>
-      <w:r>
-        <w:rPr>
-          <w:rFonts w:ascii="Cambria" w:hAnsi="Cambria"/>
-          <w:color w:val="1B1B1B"/>
-          <w:szCs w:val="28"/>
-          <w:shd w:val="clear" w:color="auto" w:fill="FFFFFF"/>
-        </w:rPr>
-        <w:t xml:space="preserve"> such as: </w:t>
-      </w:r>
-      <w:r>
-        <w:rPr>
-          <w:rFonts w:ascii="Cambria" w:hAnsi="Cambria"/>
-          <w:color w:val="1B1B1B"/>
-          <w:szCs w:val="28"/>
-          <w:shd w:val="clear" w:color="auto" w:fill="FFFFFF"/>
-        </w:rPr>
-        <w:t>age group (18–34, 35–49, and 50–64), sex, race/ethnicity (white, Black, Hispanic, or other), and educational attainment (no Bachelor's degree or Bachelor's degree)</w:t>
-      </w:r>
-      <w:r>
-        <w:rPr>
-          <w:rFonts w:ascii="Cambria" w:hAnsi="Cambria"/>
-          <w:color w:val="1B1B1B"/>
-          <w:szCs w:val="28"/>
-          <w:shd w:val="clear" w:color="auto" w:fill="FFFFFF"/>
-        </w:rPr>
-        <w:t>.</w:t>
+        <w:t> is the set of group-specific, time-varying demographic covariates such as: age group (18–34, 35–49, and 50–64), sex, race/ethnicity (white, Black, Hispanic, or other), and educational attainment (no Bachelor's degree or Bachelor's degree).</w:t>
       </w:r>
     </w:p>
     <w:p>
@@ -7798,7 +7761,16 @@
         <w:ind w:firstLine="720"/>
       </w:pPr>
       <w:r>
-        <w:t>Maroto and Pettinicchio explore how rates of job displacement varied for individuals with disabilities through the lens of a large‑scale, longitudinal quantitative analysis spanning two major economic crises: the 2008 Great Recession and the first wave of the COVID‑19 pandemic. Their study uses data drawn from six waves of the U.S. Current Population Survey’s Displaced Worker Supplement (CPS DWS), a nationally representative survey that collects detailed information on workers who have lost or left jobs due to plant or company closures, slack work, or the elimination of positions. The CPS DWS also includes a standard set of six disability questions covering difficulties in hearing, vision, cognition, ambulation, self‑care, and independent living. The final analytical sample consists of N = 344,729 respondents. To model the probability of experiencing involuntary job displacement, the authors estimate a series of logistic regression models. The general form of the logistic model can be expressed as</w:t>
+        <w:t>Maroto and Pettinicchio explore how rates of job displacement varied for individuals with disabilities through the lens of a large‑scale, longitudinal quantitative analysis spanning two major economic crises: the 2008 Great Recession and the first wave of the COVID‑19 pandemic</w:t>
+      </w:r>
+      <w:r>
+        <w:rPr>
+          <w:rStyle w:val="Appelnotedebasdep"/>
+        </w:rPr>
+        <w:footnoteReference w:id="34"/>
+      </w:r>
+      <w:r>
+        <w:t>. Their study uses data drawn from six waves of the U.S. Current Population Survey’s Displaced Worker Supplement (CPS DWS), a nationally representative survey that collects detailed information on workers who have lost or left jobs due to plant or company closures, slack work, or the elimination of positions. The CPS DWS also includes a standard set of six disability questions covering difficulties in hearing, vision, cognition, ambulation, self‑care, and independent living. The final analytical sample consists of N = 344,729 respondents. To model the probability of experiencing involuntary job displacement, the authors estimate a series of logistic regression models. The general form of the logistic model can be expressed as</w:t>
       </w:r>
       <w:r>
         <w:t>:</w:t>
@@ -8155,19 +8127,7 @@
                       <w:rPr>
                         <w:rFonts w:ascii="Cambria Math" w:hAnsi="Cambria Math"/>
                       </w:rPr>
-                      <m:t>disability</m:t>
-                    </m:r>
-                    <m:r>
-                      <w:rPr>
-                        <w:rFonts w:ascii="Cambria Math" w:hAnsi="Cambria Math"/>
-                      </w:rPr>
-                      <m:t xml:space="preserve"> </m:t>
-                    </m:r>
-                    <m:r>
-                      <w:rPr>
-                        <w:rFonts w:ascii="Cambria Math" w:hAnsi="Cambria Math"/>
-                      </w:rPr>
-                      <m:t>typ</m:t>
+                      <m:t>disability typ</m:t>
                     </m:r>
                     <m:sSub>
                       <m:sSubPr>
@@ -8233,19 +8193,7 @@
                   <w:rPr>
                     <w:rFonts w:ascii="Cambria Math" w:hAnsi="Cambria Math"/>
                   </w:rPr>
-                  <m:t>+</m:t>
-                </m:r>
-                <m:r>
-                  <w:rPr>
-                    <w:rFonts w:ascii="Cambria Math" w:hAnsi="Cambria Math"/>
-                  </w:rPr>
-                  <m:t xml:space="preserve"> </m:t>
-                </m:r>
-                <m:r>
-                  <w:rPr>
-                    <w:rFonts w:ascii="Cambria Math" w:hAnsi="Cambria Math"/>
-                  </w:rPr>
-                  <m:t>γ</m:t>
+                  <m:t>+ γ</m:t>
                 </m:r>
                 <m:sSub>
                   <m:sSubPr>
@@ -8319,7 +8267,7 @@
               <w:jc w:val="right"/>
             </w:pPr>
             <w:r>
-              <w:t>##</w:t>
+              <w:t>2.4</w:t>
             </w:r>
           </w:p>
         </w:tc>
@@ -8327,7 +8275,6 @@
     </w:tbl>
     <w:p>
       <w:r>
-        <w:lastRenderedPageBreak/>
         <w:t>where:</w:t>
       </w:r>
     </w:p>
@@ -8526,7 +8473,19 @@
         <w:ind w:firstLine="720"/>
       </w:pPr>
       <w:r>
-        <w:t>The main findings reveal a persistent and crisis‑magnified pattern of inequality. People with disabilities were approximately twice as likely as those without disabilities to experience job displacement over the entire study period. The disparity was especially pronounced during times of economic turmoil. Although the displacement gap by disability status had been declining—from a high of 6.5 percentage points during the Great Recession to a lower point in the intervening years—the COVID‑19 pandemic abruptly increased the gap to 5.8 percentage points. This finding shows that involuntary job loss among people with disabilities is exacerbated by exogenous shocks, a pattern that holds across multiple disability types. The authors conclude by extending prior research on disability and labour market precarity, situating the COVID‑19 pandemic as a critical case where pre‑existing vulnerabilities are amplified, and they call for policy interventions that address both the immediate and the structural drivers of disability‑based displacement</w:t>
+        <w:t xml:space="preserve">The main findings reveal a persistent and crisis‑magnified pattern of inequality. People with disabilities were approximately twice as likely as those without disabilities to experience job displacement over the entire study period. The disparity was especially pronounced during times of economic turmoil. Although the displacement gap by disability status had been declining—from a high of 6.5 percentage points during the Great Recession to a lower point in the intervening years—the COVID‑19 pandemic abruptly increased the gap to 5.8 percentage points. This finding shows that involuntary job loss among people with disabilities is exacerbated by exogenous shocks, a pattern that holds across multiple disability types. The authors conclude by extending prior research on disability and labour market precarity, situating the COVID‑19 pandemic as a critical case where pre‑existing vulnerabilities are amplified, and they call for policy interventions that </w:t>
+      </w:r>
+      <w:r>
+        <w:lastRenderedPageBreak/>
+        <w:t>address both the immediate and the structural drivers of disability‑based displacement.</w:t>
+      </w:r>
+    </w:p>
+    <w:p>
+      <w:pPr>
+        <w:ind w:firstLine="720"/>
+      </w:pPr>
+      <w:r>
+        <w:t>In terms of disability measurement, the study disaggregates the general “any disability” indicator into specific types: hearing impairment, vision impairment, cognitive difficulty, ambulatory (mobility) difficulty, self‑care difficulty, and independent living difficulty. This disaggregation yields the finding that disparities were largest for individuals with cognitive disabilities, for whom the probability of displacement during the pandemic was particularly elevated. Women and members of racialised minority groups with disabilities faced intersectional disadvantage, with displacement rates exceeding the sum of their constituent parts</w:t>
       </w:r>
       <w:r>
         <w:t>.</w:t>
@@ -8537,39 +8496,37 @@
         <w:ind w:firstLine="720"/>
       </w:pPr>
       <w:r>
+        <w:t>From a policy perspective, the authors note that the CPS DWS does not capture discrimination directly. However, the presence of large and persistent gaps even after controlling for industry, occupation, and worker characteristics is consistent with ongoing structural discrimination—formalised as hiring bias, unequal access to telework accommodations, and lower seniority protections among workers with disabilities—that becomes more consequential when the labour market tightens.</w:t>
+      </w:r>
+    </w:p>
+    <w:p>
+      <w:pPr>
+        <w:ind w:firstLine="720"/>
+      </w:pPr>
+      <w:r>
+        <w:t xml:space="preserve">Bondoux </w:t>
+      </w:r>
+      <w:r>
+        <w:t xml:space="preserve">in 2024 </w:t>
+      </w:r>
+      <w:r>
+        <w:t>explores the complex, bidirectional relationships between disability and labour market outcomes across Europe through the lens of causal econometric methods applied to longitudinal panel data. Her thesis utilises data from the Survey of Health, Ageing and Retirement in Europe (SHARE), which provides a large sample of individuals followed over time across 28 European countries</w:t>
+      </w:r>
+      <w:r>
+        <w:rPr>
+          <w:rStyle w:val="Appelnotedebasdep"/>
+        </w:rPr>
+        <w:footnoteReference w:id="35"/>
+      </w:r>
+      <w:r>
+        <w:t xml:space="preserve">. </w:t>
+      </w:r>
+      <w:r>
+        <w:t xml:space="preserve">The study employs variables including personal income (defined as the sum of wages and compensation incomes), disability onset status, partner's disability status, labour supply (measured as hours worked or employment status), unemployment </w:t>
+      </w:r>
+      <w:r>
         <w:lastRenderedPageBreak/>
-        <w:t>In terms of disability measurement, the study disaggregates the general “any disability” indicator into specific types: hearing impairment, vision impairment, cognitive difficulty, ambulatory (mobility) difficulty, self‑care difficulty, and independent living difficulty. This disaggregation yields the finding that disparities were largest for individuals with cognitive disabilities, for whom the probability of displacement during the pandemic was particularly elevated. Women and members of racialised minority groups with disabilities faced intersectional disadvantage, with displacement rates exceeding the sum of their constituent parts</w:t>
-      </w:r>
-      <w:r>
-        <w:t>.</w:t>
-      </w:r>
-    </w:p>
-    <w:p>
-      <w:pPr>
-        <w:ind w:firstLine="720"/>
-      </w:pPr>
-      <w:r>
-        <w:t>From a policy perspective, the authors note that the CPS DWS does not capture discrimination directly. However, the presence of large and persistent gaps even after controlling for industry, occupation, and worker characteristics is consistent with ongoing structural discrimination—formalised as hiring bias, unequal access to telework accommodations, and lower seniority protections among workers with disabilities—that becomes more consequential when the labour market tightens.</w:t>
-      </w:r>
-    </w:p>
-    <w:p>
-      <w:pPr>
-        <w:ind w:firstLine="720"/>
-      </w:pPr>
-      <w:r>
-        <w:t xml:space="preserve">Bondoux </w:t>
-      </w:r>
-      <w:r>
-        <w:t xml:space="preserve">in 2024 </w:t>
-      </w:r>
-      <w:r>
-        <w:t>explores the complex, bidirectional relationships between disability and labour market outcomes across Europe through the lens of causal econometric methods applied to longitudinal panel data. Her thesis utilises data from the Survey of Health, Ageing and Retirement in Europe (SHARE), which provides a large sample of individuals followed over time across 28 European countries</w:t>
-      </w:r>
-      <w:r>
-        <w:t xml:space="preserve">. </w:t>
-      </w:r>
-      <w:r>
-        <w:t>The study employs variables including personal income (defined as the sum of wages and compensation incomes), disability onset status, partner's disability status, labour supply (measured as hours worked or employment status), unemployment spells, and national social security system characteristics such as integration measures and compensation income generosity</w:t>
+        <w:t>spells, and national social security system characteristics such as integration measures and compensation income generosity</w:t>
       </w:r>
       <w:r>
         <w:t xml:space="preserve">. She </w:t>
@@ -8584,11 +8541,7 @@
         <w:t xml:space="preserve"> the causal impact of disability onset on personal income, she implements a matching procedure before disability onset followed by a weighted difference-in-differences (DiD) estimator</w:t>
       </w:r>
       <w:r>
-        <w:t xml:space="preserve">. Propensity score </w:t>
-      </w:r>
-      <w:r>
-        <w:lastRenderedPageBreak/>
-        <w:t xml:space="preserve">matching covariates included variables such as: age, gender, education level, marital status, having children and occupational sector. </w:t>
+        <w:t xml:space="preserve">. Propensity score matching covariates included variables such as: age, gender, education level, marital status, having children and occupational sector. </w:t>
       </w:r>
       <w:r>
         <w:t xml:space="preserve">Logit model was used </w:t>
@@ -9082,7 +9035,7 @@
               <w:jc w:val="right"/>
             </w:pPr>
             <w:r>
-              <w:t>##</w:t>
+              <w:t>2.5</w:t>
             </w:r>
           </w:p>
         </w:tc>
@@ -9150,21 +9103,7 @@
           <w:rFonts w:ascii="Cambria Math" w:hAnsi="Cambria Math"/>
           <w:iCs/>
         </w:rPr>
-        <w:t>is either the personal income, the wages or the compensation incomes</w:t>
-      </w:r>
-      <w:r>
-        <w:rPr>
-          <w:rFonts w:ascii="Cambria Math" w:hAnsi="Cambria Math"/>
-          <w:iCs/>
-        </w:rPr>
-        <w:t xml:space="preserve"> </w:t>
-      </w:r>
-      <w:r>
-        <w:rPr>
-          <w:rFonts w:ascii="Cambria Math" w:hAnsi="Cambria Math"/>
-          <w:iCs/>
-        </w:rPr>
-        <w:t xml:space="preserve">of individual </w:t>
+        <w:t xml:space="preserve">is either the personal income, the wages or the compensation incomes of individual </w:t>
       </w:r>
       <w:r>
         <w:rPr>
@@ -9303,28 +9242,7 @@
         </m:sSub>
       </m:oMath>
       <w:r>
-        <w:t xml:space="preserve"> </w:t>
-      </w:r>
-      <w:r>
-        <w:t>is a four</w:t>
-      </w:r>
-      <w:r>
-        <w:t>-</w:t>
-      </w:r>
-      <w:r>
-        <w:t>category variable consisting of employed or self-employed, retired, unemployed, and other</w:t>
-      </w:r>
-      <w:r>
-        <w:t xml:space="preserve"> </w:t>
-      </w:r>
-      <w:r>
-        <w:t>situation (which groups together permanently sick or disabled individuals, homemakers,</w:t>
-      </w:r>
-      <w:r>
-        <w:t xml:space="preserve"> </w:t>
-      </w:r>
-      <w:r>
-        <w:t>etc.).</w:t>
+        <w:t xml:space="preserve"> is a four-category variable consisting of employed or self-employed, retired, unemployed, and other situation (which groups together permanently sick or disabled individuals, homemakers, etc.).</w:t>
       </w:r>
     </w:p>
     <w:p>
@@ -9380,11 +9298,11 @@
     </w:p>
     <w:p>
       <w:r>
-        <w:t xml:space="preserve">This approach combines PSM’s ability to reduce selection on observables with DiD’s ability to eliminate time‑invariant unobserved heterogeneity common to both groups. The identifying assumption, therefore, is that conditional on the propensity score and in the absence of disability onset, the treatment and matched control groups would have followed parallel trends in income. Bondoux validates this by testing for pre‑treatment parallel trends and by examining that the matching procedure successfully balances covariates (standardised differences are reduced below 10% after matching). The finding of a significant negative effect of disability onset on personal income (robust to placebo tests, alternative matching algorithms, </w:t>
+        <w:t xml:space="preserve">This approach combines PSM’s ability to reduce selection on observables with DiD’s ability to eliminate time‑invariant unobserved heterogeneity common to both groups. The identifying assumption, therefore, is that conditional on the propensity score and in the absence of disability onset, the treatment and matched control groups would have followed parallel trends in income. Bondoux validates this by </w:t>
       </w:r>
       <w:r>
         <w:lastRenderedPageBreak/>
-        <w:t>and different bandwidth choices) is thus interpreted as causal evidence of the labour market penalty associated with becoming disabled in Europe, mitigated only in countries with generous integration measures and high compensation incomes</w:t>
+        <w:t>testing for pre‑treatment parallel trends and by examining that the matching procedure successfully balances covariates (standardised differences are reduced below 10% after matching). The finding of a significant negative effect of disability onset on personal income (robust to placebo tests, alternative matching algorithms, and different bandwidth choices) is thus interpreted as causal evidence of the labour market penalty associated with becoming disabled in Europe, mitigated only in countries with generous integration measures and high compensation incomes</w:t>
       </w:r>
       <w:r>
         <w:t>.</w:t>
@@ -9395,7 +9313,20 @@
         <w:ind w:firstLine="720"/>
       </w:pPr>
       <w:r>
-        <w:t>Schur, van der Meulen Rodgers, and Kruse explore the disparate effects of the COVID-19 pandemic on workers with disabilities through the lens of an intersectional econometric decomposition approach. Using monthly data from the U.S. Current Population Survey (CPS), the authors restrict the sample to working-age adults (18–64 years) with strong labour market attachment (currently employed or employed within the prior 12 months). The dependent variable is a binary employment indicator (employed vs. not employed) measured across three key pandemic periods: January–March 2020 (pre‑lockdown), April–December 2020 (post‑lockdown), and separately January–April 2020 (to capture the initial drop). Disability status is identified using the standard six‑question CPS sequence covering hearing, vision, cognitive, ambulatory, self‑care, and independent living difficulties. The core independent variables include categorical measures of gender (male/female), race/ethnicity (White non‑Hispanic, Black, Hispanic, Asian, other), and the three‑way interaction among disability status, gender, and race/ethnicity. Additional demographic controls include educational attainment (less than high school, high school, some college, Bachelor’s degree, advanced degree), marital status, and age. Occupational and industry controls are coded according to standard CPS classifications, with particular attention to sectors that were hardest hit by the initial pandemic shutdowns. All estimates are seasonally adjusted by the authors and reweighted to account for disability‑specific seasonal patterns, and the analysis employs CPS sample weights throughout.</w:t>
+        <w:t>Schur, van der Meulen Rodgers, and Kruse explore the disparate effects of the COVID-19 pandemic on workers with disabilities through the lens of an intersectional econometric decomposition approach</w:t>
+      </w:r>
+      <w:r>
+        <w:rPr>
+          <w:rStyle w:val="Appelnotedebasdep"/>
+        </w:rPr>
+        <w:footnoteReference w:id="36"/>
+      </w:r>
+      <w:r>
+        <w:t xml:space="preserve">. Using monthly data from the U.S. Current Population Survey (CPS), the authors restrict the sample to working-age adults (18–64 years) with strong labour market attachment (currently employed or employed within the prior 12 months). The dependent variable is a binary employment indicator (employed vs. not employed) measured across three key pandemic periods: January–March 2020 (pre‑lockdown), April–December 2020 (post‑lockdown), and separately January–April 2020 (to capture the initial drop). Disability status is identified using the standard six‑question CPS sequence covering hearing, vision, cognitive, ambulatory, self‑care, and independent living difficulties. The core independent variables include categorical measures of gender (male/female), race/ethnicity (White non‑Hispanic, Black, Hispanic, Asian, other), and the three‑way interaction among disability status, gender, and race/ethnicity. Additional demographic controls include educational attainment (less than high school, high school, some college, Bachelor’s degree, advanced degree), marital status, and age. Occupational and industry controls are coded according to standard CPS classifications, with particular attention to sectors that were hardest hit by the </w:t>
+      </w:r>
+      <w:r>
+        <w:lastRenderedPageBreak/>
+        <w:t>initial pandemic shutdowns. All estimates are seasonally adjusted by the authors and reweighted to account for disability‑specific seasonal patterns, and the analysis employs CPS sample weights throughout.</w:t>
       </w:r>
     </w:p>
     <w:p>
@@ -9403,34 +9334,40 @@
         <w:ind w:firstLine="720"/>
       </w:pPr>
       <w:r>
-        <w:t xml:space="preserve">The main findings substantiate the initial intersectional hypothesis. The raw disability employment gap (persons with disabilities minus persons without disabilities) widened from 5.9 percentage points in the pre‑lockdown period </w:t>
-      </w:r>
+        <w:t>The main findings substantiate the initial intersectional hypothesis. The raw disability employment gap (persons with disabilities minus persons without disabilities) widened from 5.9 percentage points in the pre‑lockdown period (January–March 2020) to 7.6 percentage points in the post‑lockdown period (April–December 2020), a statistically significant increase of 1.7 points. Decomposition results show that 40% of this increase is explained by observable characteristics, with occupational distribution accounting for the largest share, followed by education. Crucially, even after accounting for differences in occupation, industry, education, and demographics, there remains a substantial unexplained component of the employment gap that also rose during the pandemic, which the authors interpret as a potential signal of growing discrimination against people with disabilities by employers. When examining three‑way interactions, the logit results identify that White and Black women with disabilities experienced the most severe and persistent employment losses during 2020 relative to White men without disabilities, and Hispanic men with disabilities also bore a heavy burden, though the latter finding is less robust due to small sample sizes. The study's novel contribution lies in its disaggregation of the pandemic’s shock across multiple axes of disadvantage, demonstrating that the labour market penalty for disability is not uniform but is substantially exacerbated for those who also experience gender and racial marginalisation</w:t>
+      </w:r>
+      <w:r>
+        <w:t>.</w:t>
+      </w:r>
+    </w:p>
+    <w:p>
+      <w:pPr>
+        <w:ind w:firstLine="720"/>
+      </w:pPr>
+    </w:p>
+    <w:p>
+      <w:pPr>
+        <w:ind w:firstLine="720"/>
+      </w:pPr>
+    </w:p>
+    <w:p>
+      <w:pPr>
+        <w:ind w:firstLine="720"/>
+      </w:pPr>
+    </w:p>
+    <w:p>
+      <w:pPr>
+        <w:ind w:firstLine="720"/>
+      </w:pPr>
       <w:r>
         <w:lastRenderedPageBreak/>
-        <w:t>(January–March 2020) to 7.6 percentage points in the post‑lockdown period (April–December 2020), a statistically significant increase of 1.7 points. Decomposition results show that 40% of this increase is explained by observable characteristics, with occupational distribution accounting for the largest share, followed by education. Crucially, even after accounting for differences in occupation, industry, education, and demographics, there remains a substantial unexplained component of the employment gap that also rose during the pandemic, which the authors interpret as a potential signal of growing discrimination against people with disabilities by employers. When examining three‑way interactions, the logit results identify that White and Black women with disabilities experienced the most severe and persistent employment losses during 2020 relative to White men without disabilities, and Hispanic men with disabilities also bore a heavy burden, though the latter finding is less robust due to small sample sizes. The study's novel contribution lies in its disaggregation of the pandemic’s shock across multiple axes of disadvantage, demonstrating that the labour market penalty for disability is not uniform but is substantially exacerbated for those who also experience gender and racial marginalisation</w:t>
-      </w:r>
-      <w:r>
-        <w:t>.</w:t>
-      </w:r>
-    </w:p>
-    <w:p>
-      <w:pPr>
-        <w:ind w:firstLine="720"/>
-      </w:pPr>
-      <w:r>
-        <w:t xml:space="preserve">Table ##. </w:t>
-      </w:r>
-      <w:r>
-        <w:t>Conclusions obtained as a result of a literary review of</w:t>
-      </w:r>
-      <w:r>
-        <w:t xml:space="preserve"> </w:t>
-      </w:r>
-      <w:r>
-        <w:t>empirical works</w:t>
-      </w:r>
-      <w:r>
-        <w:t>.</w:t>
+        <w:t xml:space="preserve">Table </w:t>
+      </w:r>
+      <w:r>
+        <w:t>4</w:t>
+      </w:r>
+      <w:r>
+        <w:t>. Conclusions obtained as a result of a literary review of empirical works.</w:t>
       </w:r>
     </w:p>
     <w:tbl>
@@ -9562,23 +9499,10 @@
               <w:cnfStyle w:val="000000000000" w:firstRow="0" w:lastRow="0" w:firstColumn="0" w:lastColumn="0" w:oddVBand="0" w:evenVBand="0" w:oddHBand="0" w:evenHBand="0" w:firstRowFirstColumn="0" w:firstRowLastColumn="0" w:lastRowFirstColumn="0" w:lastRowLastColumn="0"/>
             </w:pPr>
             <w:r>
-              <w:t>Dynamic l</w:t>
-            </w:r>
-            <w:r>
-              <w:t>inear probability difference in differences used</w:t>
-            </w:r>
-            <w:r>
-              <w:t xml:space="preserve">. </w:t>
-            </w:r>
-            <w:r>
-              <w:t xml:space="preserve">During pandemic </w:t>
-            </w:r>
-            <w:r>
-              <w:t xml:space="preserve">people with disabilities experienced employment losses that were </w:t>
-            </w:r>
-            <w:r>
-              <w:lastRenderedPageBreak/>
-              <w:t>proportionately similar to those of people without disabilities</w:t>
+              <w:t xml:space="preserve">Dynamic linear probability difference in differences used. During pandemic </w:t>
+            </w:r>
+            <w:r>
+              <w:t>people with disabilities experienced employment losses that were proportionately similar to those of people without disabilities</w:t>
             </w:r>
             <w:r>
               <w:t>. D</w:t>
@@ -9603,7 +9527,6 @@
           </w:tcPr>
           <w:p>
             <w:r>
-              <w:lastRenderedPageBreak/>
               <w:t>Maroto and Pettinicchio (2024)</w:t>
             </w:r>
           </w:p>
@@ -9617,10 +9540,7 @@
               <w:cnfStyle w:val="000000100000" w:firstRow="0" w:lastRow="0" w:firstColumn="0" w:lastColumn="0" w:oddVBand="0" w:evenVBand="0" w:oddHBand="1" w:evenHBand="0" w:firstRowFirstColumn="0" w:firstRowLastColumn="0" w:lastRowFirstColumn="0" w:lastRowLastColumn="0"/>
             </w:pPr>
             <w:r>
-              <w:t xml:space="preserve">Logistic regression difference in differences used. </w:t>
-            </w:r>
-            <w:r>
-              <w:t>People with disabilities were approximately twice as likely as those without disabilities to experience job displacement over the entire study period</w:t>
+              <w:t>Logistic regression difference in differences used. People with disabilities were approximately twice as likely as those without disabilities to experience job displacement over the entire study period</w:t>
             </w:r>
           </w:p>
         </w:tc>
@@ -9674,6 +9594,7 @@
           </w:tcPr>
           <w:p>
             <w:r>
+              <w:lastRenderedPageBreak/>
               <w:t>Schur, van der Meulen Rodgers, and Kruse</w:t>
             </w:r>
             <w:r>
@@ -9717,25 +9638,25 @@
     <w:p>
       <w:r>
         <w:tab/>
-        <w:t xml:space="preserve">Overall most emperical studies rely either on emplyment probabilities  or income regressions. Disability definitions differs substantiolly and mostly rely on self-reported metrics. Crucial role of market secros is highlighted as many of disabled people occupied mainly ‘shutdown’ industries with higher risks of </w:t>
-      </w:r>
-      <w:r>
-        <w:lastRenderedPageBreak/>
-        <w:t xml:space="preserve">unemployment during the pandemic. Propensity scores methods rely on socio-demographic factiors such as gender and age couped with work environment variables to indicate industry or conditions. </w:t>
-      </w:r>
-      <w:r>
-        <w:t>R</w:t>
-      </w:r>
-      <w:r>
-        <w:t>eview of empirical studies provides a</w:t>
-      </w:r>
-    </w:p>
-    <w:p>
-      <w:r>
-        <w:t>deeper understanding</w:t>
-      </w:r>
-      <w:r>
-        <w:t xml:space="preserve"> of application of various methds which are summarized in the table ##.</w:t>
+      </w:r>
+    </w:p>
+    <w:p>
+      <w:pPr>
+        <w:ind w:firstLine="720"/>
+      </w:pPr>
+      <w:r>
+        <w:t xml:space="preserve">Overall most emperical studies rely either on emplyment probabilities  or income regressions. Disability definitions differs substantiolly and mostly rely on self-reported metrics. Crucial role of market secros is highlighted as many of disabled people occupied mainly ‘shutdown’ industries with higher risks of unemployment during the pandemic. Propensity scores methods rely on socio-demographic factiors such as gender and age couped with work environment variables to indicate industry or conditions. </w:t>
+      </w:r>
+      <w:r>
+        <w:t>Review of empirical studies provides a</w:t>
+      </w:r>
+    </w:p>
+    <w:p>
+      <w:r>
+        <w:t xml:space="preserve">deeper understanding of application of various methds which are summarized in the table </w:t>
+      </w:r>
+      <w:r>
+        <w:t>4</w:t>
       </w:r>
     </w:p>
     <w:p/>
@@ -9744,7 +9665,7 @@
         <w:pStyle w:val="Titre2"/>
         <w:jc w:val="left"/>
       </w:pPr>
-      <w:bookmarkStart w:id="11" w:name="_Toc229485489"/>
+      <w:bookmarkStart w:id="11" w:name="_Toc229556436"/>
       <w:r>
         <w:t xml:space="preserve">2.2 </w:t>
       </w:r>
@@ -9912,6 +9833,7 @@
           <w:szCs w:val="28"/>
           <w:shd w:val="clear" w:color="auto" w:fill="FFFFFF"/>
         </w:rPr>
+        <w:lastRenderedPageBreak/>
         <w:t xml:space="preserve">Interviews from 4th </w:t>
       </w:r>
       <w:r>
@@ -10186,7 +10108,6 @@
           <w:shd w:val="clear" w:color="auto" w:fill="FFFFFF"/>
           <w:lang w:val="en-US"/>
         </w:rPr>
-        <w:lastRenderedPageBreak/>
         <w:t>Spillovers were excluded</w:t>
       </w:r>
       <w:r>
@@ -10432,6 +10353,7 @@
           <w:iCs/>
           <w:szCs w:val="28"/>
         </w:rPr>
+        <w:lastRenderedPageBreak/>
         <w:t>Age</w:t>
       </w:r>
       <w:r>
@@ -10660,7 +10582,6 @@
           <w:szCs w:val="28"/>
           <w:shd w:val="clear" w:color="auto" w:fill="FFFFFF"/>
         </w:rPr>
-        <w:lastRenderedPageBreak/>
         <w:t>Harmful_work</w:t>
       </w:r>
       <w:r>
@@ -10812,13 +10733,50 @@
           <w:shd w:val="clear" w:color="auto" w:fill="FFFFFF"/>
         </w:rPr>
       </w:pPr>
-      <w:r>
+    </w:p>
+    <w:p>
+      <w:pPr>
+        <w:jc w:val="center"/>
         <w:rPr>
           <w:color w:val="000000"/>
           <w:szCs w:val="28"/>
           <w:shd w:val="clear" w:color="auto" w:fill="FFFFFF"/>
         </w:rPr>
-        <w:t xml:space="preserve">Table ##. Continous variable </w:t>
+      </w:pPr>
+    </w:p>
+    <w:p>
+      <w:pPr>
+        <w:jc w:val="center"/>
+        <w:rPr>
+          <w:color w:val="000000"/>
+          <w:szCs w:val="28"/>
+          <w:shd w:val="clear" w:color="auto" w:fill="FFFFFF"/>
+        </w:rPr>
+      </w:pPr>
+      <w:r>
+        <w:rPr>
+          <w:color w:val="000000"/>
+          <w:szCs w:val="28"/>
+          <w:shd w:val="clear" w:color="auto" w:fill="FFFFFF"/>
+        </w:rPr>
+        <w:lastRenderedPageBreak/>
+        <w:t xml:space="preserve">Table </w:t>
+      </w:r>
+      <w:r>
+        <w:rPr>
+          <w:color w:val="000000"/>
+          <w:szCs w:val="28"/>
+          <w:shd w:val="clear" w:color="auto" w:fill="FFFFFF"/>
+        </w:rPr>
+        <w:t>5</w:t>
+      </w:r>
+      <w:r>
+        <w:rPr>
+          <w:color w:val="000000"/>
+          <w:szCs w:val="28"/>
+          <w:shd w:val="clear" w:color="auto" w:fill="FFFFFF"/>
+        </w:rPr>
+        <w:t xml:space="preserve">. Continous variable </w:t>
       </w:r>
       <w:r>
         <w:rPr>
@@ -11214,7 +11172,23 @@
           <w:szCs w:val="28"/>
           <w:shd w:val="clear" w:color="auto" w:fill="FFFFFF"/>
         </w:rPr>
-        <w:t>Table ##. Binary variable descriptive weighted statistics.</w:t>
+        <w:t xml:space="preserve">Table </w:t>
+      </w:r>
+      <w:r>
+        <w:rPr>
+          <w:color w:val="000000"/>
+          <w:szCs w:val="28"/>
+          <w:shd w:val="clear" w:color="auto" w:fill="FFFFFF"/>
+        </w:rPr>
+        <w:t>6</w:t>
+      </w:r>
+      <w:r>
+        <w:rPr>
+          <w:color w:val="000000"/>
+          <w:szCs w:val="28"/>
+          <w:shd w:val="clear" w:color="auto" w:fill="FFFFFF"/>
+        </w:rPr>
+        <w:t>. Binary variable descriptive weighted statistics.</w:t>
       </w:r>
     </w:p>
     <w:tbl>
@@ -11476,7 +11450,6 @@
                 <w:caps w:val="0"/>
                 <w:szCs w:val="28"/>
               </w:rPr>
-              <w:lastRenderedPageBreak/>
               <w:t>Marital status: Married</w:t>
             </w:r>
           </w:p>
@@ -12085,7 +12058,13 @@
               <w:jc w:val="right"/>
             </w:pPr>
             <w:r>
-              <w:t>(3.1)</w:t>
+              <w:t>(</w:t>
+            </w:r>
+            <w:r>
+              <w:t>2.6</w:t>
+            </w:r>
+            <w:r>
+              <w:t>)</w:t>
             </w:r>
           </w:p>
         </w:tc>
@@ -12242,6 +12221,7 @@
           <w:szCs w:val="28"/>
           <w:shd w:val="clear" w:color="auto" w:fill="FFFFFF"/>
         </w:rPr>
+        <w:lastRenderedPageBreak/>
         <w:t>income</w:t>
       </w:r>
       <w:r>
@@ -12345,7 +12325,25 @@
           <w:shd w:val="clear" w:color="auto" w:fill="FFFFFF"/>
           <w:lang w:val="en-US"/>
         </w:rPr>
-        <w:t>Picture ## shows timelapse of average wages for disabled and non-disabled groups. At the period of interest (2020) we observe a dip caused by pandemic. While it affected both groups altogether disabled people has suffered greater fall compared to control units.</w:t>
+        <w:t xml:space="preserve">Picture </w:t>
+      </w:r>
+      <w:r>
+        <w:rPr>
+          <w:color w:val="000000"/>
+          <w:szCs w:val="28"/>
+          <w:shd w:val="clear" w:color="auto" w:fill="FFFFFF"/>
+          <w:lang w:val="en-US"/>
+        </w:rPr>
+        <w:t>1</w:t>
+      </w:r>
+      <w:r>
+        <w:rPr>
+          <w:color w:val="000000"/>
+          <w:szCs w:val="28"/>
+          <w:shd w:val="clear" w:color="auto" w:fill="FFFFFF"/>
+          <w:lang w:val="en-US"/>
+        </w:rPr>
+        <w:t xml:space="preserve"> shows timelapse of average wages for disabled and non-disabled groups. At the period of interest (2020) we observe a dip caused by pandemic. While it affected both groups altogether disabled people has suffered greater fall compared to control units.</w:t>
       </w:r>
     </w:p>
     <w:p>
@@ -12376,7 +12374,6 @@
           <w:lang w:val="ru-RU"/>
           <w14:ligatures w14:val="standardContextual"/>
         </w:rPr>
-        <w:lastRenderedPageBreak/>
         <w:drawing>
           <wp:inline distT="0" distB="0" distL="0" distR="0" wp14:anchorId="0D2A2860" wp14:editId="5907458B">
             <wp:extent cx="5943600" cy="2476500"/>
@@ -12437,18 +12434,36 @@
           <w:shd w:val="clear" w:color="auto" w:fill="FFFFFF"/>
           <w:lang w:val="en-US"/>
         </w:rPr>
-        <w:t>Picture ##. Timelapse comparison of average wages between control units (non-disabled people) to treatment units (disabled people)</w:t>
-      </w:r>
-    </w:p>
-    <w:p>
-      <w:pPr>
-        <w:jc w:val="center"/>
+        <w:t xml:space="preserve">Picture </w:t>
+      </w:r>
+      <w:r>
         <w:rPr>
           <w:color w:val="000000"/>
           <w:szCs w:val="28"/>
           <w:shd w:val="clear" w:color="auto" w:fill="FFFFFF"/>
           <w:lang w:val="en-US"/>
         </w:rPr>
+        <w:t>1</w:t>
+      </w:r>
+      <w:r>
+        <w:rPr>
+          <w:color w:val="000000"/>
+          <w:szCs w:val="28"/>
+          <w:shd w:val="clear" w:color="auto" w:fill="FFFFFF"/>
+          <w:lang w:val="en-US"/>
+        </w:rPr>
+        <w:t>. Timelapse comparison of average wages between control units (non-disabled people) to treatment units (disabled people)</w:t>
+      </w:r>
+    </w:p>
+    <w:p>
+      <w:pPr>
+        <w:jc w:val="center"/>
+        <w:rPr>
+          <w:color w:val="000000"/>
+          <w:szCs w:val="28"/>
+          <w:shd w:val="clear" w:color="auto" w:fill="FFFFFF"/>
+          <w:lang w:val="en-US"/>
+        </w:rPr>
       </w:pPr>
     </w:p>
     <w:p>
@@ -12460,7 +12475,7 @@
           <w:szCs w:val="28"/>
         </w:rPr>
       </w:pPr>
-      <w:bookmarkStart w:id="12" w:name="_Toc229485490"/>
+      <w:bookmarkStart w:id="12" w:name="_Toc229556437"/>
       <w:r>
         <w:rPr>
           <w:rFonts w:cs="Times New Roman"/>
@@ -12497,7 +12512,11 @@
         <w:t xml:space="preserve"> – </w:t>
       </w:r>
       <w:r>
-        <w:t>which is infeasible in disability research due to the inherent nature of disability status—poses a fundamental threat to valid causal inference in observational studies . Under non-randomized designs, treated and untreated units cannot be presumed comparable on pretreatment covariates, yet the validity of causal claims critically depends on such equivalence</w:t>
+        <w:t xml:space="preserve">which is infeasible in disability research due to the inherent nature of disability status—poses </w:t>
+      </w:r>
+      <w:r>
+        <w:lastRenderedPageBreak/>
+        <w:t>a fundamental threat to valid causal inference in observational studies . Under non-randomized designs, treated and untreated units cannot be presumed comparable on pretreatment covariates, yet the validity of causal claims critically depends on such equivalence</w:t>
       </w:r>
       <w:r>
         <w:t xml:space="preserve">. </w:t>
@@ -12527,7 +12546,16 @@
         <w:t>,</w:t>
       </w:r>
       <w:r>
-        <w:t xml:space="preserve"> demonstrates that conditioning solely on this scalar propensity score suffices to eliminate bias attributable to all observed covariates, thereby approximating the conditions of a randomized experiment in observational studies .</w:t>
+        <w:t xml:space="preserve"> demonstrates that conditioning solely on this scalar propensity score suffices to eliminate bias attributable to all observed covariates, thereby approximating the conditions of a randomized experiment in observational studies</w:t>
+      </w:r>
+      <w:r>
+        <w:rPr>
+          <w:rStyle w:val="Appelnotedebasdep"/>
+        </w:rPr>
+        <w:footnoteReference w:id="37"/>
+      </w:r>
+      <w:r>
+        <w:t>.</w:t>
       </w:r>
     </w:p>
     <w:p>
@@ -12535,11 +12563,7 @@
         <w:ind w:firstLine="720"/>
       </w:pPr>
       <w:r>
-        <w:t xml:space="preserve">We employed variables: age, education level, gender, harmful job and employment to match units properly. To address non-normality of age distribution </w:t>
-      </w:r>
-      <w:r>
-        <w:lastRenderedPageBreak/>
-        <w:t xml:space="preserve">we performend Box-Cox transformation on on the age variable with resulting </w:t>
+        <w:t xml:space="preserve">We employed variables: age, education level, gender, harmful job and employment to match units properly. To address non-normality of age distribution we performend Box-Cox transformation on on the age variable with resulting </w:t>
       </w:r>
       <m:oMath>
         <m:r>
@@ -12567,7 +12591,10 @@
         <w:t>Box_Cox</w:t>
       </w:r>
       <w:r>
-        <w:t xml:space="preserve"> was calculated according to formula ##:</w:t>
+        <w:t xml:space="preserve"> was calculated according to formula </w:t>
+      </w:r>
+      <w:r>
+        <w:t>2.7</w:t>
       </w:r>
     </w:p>
     <w:p>
@@ -12715,25 +12742,23 @@
               <w:t>(</w:t>
             </w:r>
             <w:r>
-              <w:t>3</w:t>
-            </w:r>
-            <w:r>
-              <w:t>.1)</w:t>
+              <w:t>2.7</w:t>
+            </w:r>
+            <w:r>
+              <w:t>)</w:t>
             </w:r>
           </w:p>
         </w:tc>
       </w:tr>
     </w:tbl>
     <w:p/>
-    <w:p/>
-    <w:p/>
-    <w:p/>
     <w:p>
       <w:r>
         <w:rPr>
           <w:noProof/>
           <w14:ligatures w14:val="standardContextual"/>
         </w:rPr>
+        <w:lastRenderedPageBreak/>
         <w:drawing>
           <wp:inline distT="0" distB="0" distL="0" distR="0" wp14:anchorId="382B3732" wp14:editId="4B3C8918">
             <wp:extent cx="5943600" cy="3667760"/>
@@ -12782,13 +12807,25 @@
         <w:jc w:val="center"/>
       </w:pPr>
       <w:r>
-        <w:t>Picture ##. Covariate balance comparison between multiple psm approaches (distances reflected with ASMD and Kolmogorov-Smirnov metrics).</w:t>
+        <w:t xml:space="preserve">Picture </w:t>
+      </w:r>
+      <w:r>
+        <w:t>2.</w:t>
+      </w:r>
+      <w:r>
+        <w:t xml:space="preserve"> Covariate balance comparison between multiple psm approaches (distances reflected with ASMD and Kolmogorov-Smirnov metrics).</w:t>
       </w:r>
     </w:p>
     <w:p/>
     <w:p>
       <w:r>
-        <w:t xml:space="preserve">We performed several types of propensity score matching in order to identify the most appropriate for the case (Picture ##): </w:t>
+        <w:t xml:space="preserve">We performed several types of propensity score matching in order to identify the most appropriate for the case (Picture </w:t>
+      </w:r>
+      <w:r>
+        <w:t>2</w:t>
+      </w:r>
+      <w:r>
+        <w:t xml:space="preserve">): </w:t>
       </w:r>
     </w:p>
     <w:p>
@@ -12800,7 +12837,6 @@
         </w:numPr>
       </w:pPr>
       <w:r>
-        <w:lastRenderedPageBreak/>
         <w:t xml:space="preserve">nearest neighbor 1:1 matching without replacement with a propensity score estimated using logistic regression of the treatment on the covariates </w:t>
       </w:r>
     </w:p>
@@ -12818,10 +12854,17 @@
     </w:p>
     <w:p>
       <w:r>
-        <w:t>Nearest-neighbor matching yielded poor balance as indicated in Picture ##</w:t>
-      </w:r>
-      <w:r>
-        <w:t xml:space="preserve">. On the contrary ligit model has yielded adequate balance. The propensity score was estimated using a logit regression of the treatment on the covariates, which yielded better balance than did NN appriach. After matching, all standardized mean differences for the covariates were below 0.1 and all standardized mean differences for squares and two-way interactions between covariates were below .15, indicating adequate balance. Full matching uses all treated and all control units, so no units were discarded by the matching. </w:t>
+        <w:t xml:space="preserve">Nearest-neighbor matching yielded poor balance as indicated in Picture </w:t>
+      </w:r>
+      <w:r>
+        <w:t>2</w:t>
+      </w:r>
+      <w:r>
+        <w:t xml:space="preserve">. On the contrary ligit model has yielded adequate balance. The propensity score was estimated using a logit regression of the treatment on the covariates, which yielded better balance than did NN appriach. After matching, all standardized mean differences for the covariates were below 0.1 and all standardized mean differences for squares and two-way interactions between covariates were below .15, indicating </w:t>
+      </w:r>
+      <w:r>
+        <w:lastRenderedPageBreak/>
+        <w:t xml:space="preserve">adequate balance. Full matching uses all treated and all control units, so no units were discarded by the matching. </w:t>
       </w:r>
       <w:r>
         <w:t xml:space="preserve">Panel weights were applied to generate PSM weights. </w:t>
@@ -13247,7 +13290,13 @@
               <w:jc w:val="right"/>
             </w:pPr>
             <w:r>
-              <w:t>(3.2)</w:t>
+              <w:t>(</w:t>
+            </w:r>
+            <w:r>
+              <w:t>2.8</w:t>
+            </w:r>
+            <w:r>
+              <w:t>)</w:t>
             </w:r>
           </w:p>
         </w:tc>
@@ -13310,7 +13359,6 @@
           <w:i/>
           <w:iCs/>
         </w:rPr>
-        <w:lastRenderedPageBreak/>
         <w:t>Age_box_cox</w:t>
       </w:r>
       <w:r>
@@ -13425,7 +13473,14 @@
         <w:jc w:val="center"/>
       </w:pPr>
       <w:r>
-        <w:t xml:space="preserve">Table ##. Propensity score balancing results summary. Low eCDF and </w:t>
+        <w:lastRenderedPageBreak/>
+        <w:t xml:space="preserve">Table </w:t>
+      </w:r>
+      <w:r>
+        <w:t>7</w:t>
+      </w:r>
+      <w:r>
+        <w:t xml:space="preserve">. Propensity score balancing results summary. Low eCDF and </w:t>
       </w:r>
       <w:r>
         <w:t>SMD indicate adequate balancing strategies</w:t>
@@ -14846,7 +14901,13 @@
         <w:jc w:val="center"/>
       </w:pPr>
       <w:r>
-        <w:t xml:space="preserve">Table ##. Propensity score matching results summary. Total </w:t>
+        <w:t xml:space="preserve">Table </w:t>
+      </w:r>
+      <w:r>
+        <w:t>8</w:t>
+      </w:r>
+      <w:r>
+        <w:t xml:space="preserve">. Propensity score matching results summary. Total </w:t>
       </w:r>
       <w:r>
         <w:t>9530</w:t>
@@ -14968,7 +15029,6 @@
                 <w:caps w:val="0"/>
                 <w:szCs w:val="28"/>
               </w:rPr>
-              <w:lastRenderedPageBreak/>
               <w:t>all (</w:t>
             </w:r>
             <w:r>
@@ -15427,6 +15487,7 @@
         <w:rPr>
           <w:lang w:val="ru-RU"/>
         </w:rPr>
+        <w:lastRenderedPageBreak/>
         <w:tab/>
       </w:r>
       <w:proofErr w:type="gramStart"/>
@@ -15569,7 +15630,13 @@
         <w:rPr>
           <w:lang w:val="en-US"/>
         </w:rPr>
-        <w:t>table ##</w:t>
+        <w:t xml:space="preserve">table </w:t>
+      </w:r>
+      <w:r>
+        <w:rPr>
+          <w:lang w:val="en-US"/>
+        </w:rPr>
+        <w:t>10</w:t>
       </w:r>
       <w:r>
         <w:rPr>
@@ -15857,7 +15924,13 @@
               <w:jc w:val="right"/>
             </w:pPr>
             <w:r>
-              <w:t>(3.2)</w:t>
+              <w:t>(</w:t>
+            </w:r>
+            <w:r>
+              <w:t>2.9</w:t>
+            </w:r>
+            <w:r>
+              <w:t>)</w:t>
             </w:r>
           </w:p>
         </w:tc>
@@ -16329,7 +16402,19 @@
         <w:rPr>
           <w:lang w:val="en-US"/>
         </w:rPr>
-        <w:t xml:space="preserve">Table ##. </w:t>
+        <w:t xml:space="preserve">Table </w:t>
+      </w:r>
+      <w:r>
+        <w:rPr>
+          <w:lang w:val="en-US"/>
+        </w:rPr>
+        <w:t>9</w:t>
+      </w:r>
+      <w:r>
+        <w:rPr>
+          <w:lang w:val="en-US"/>
+        </w:rPr>
+        <w:t xml:space="preserve">. </w:t>
       </w:r>
       <w:r>
         <w:rPr>
@@ -17744,7 +17829,19 @@
         <w:rPr>
           <w:lang w:val="en-US"/>
         </w:rPr>
-        <w:t xml:space="preserve">Table ##. </w:t>
+        <w:t xml:space="preserve">Table </w:t>
+      </w:r>
+      <w:r>
+        <w:rPr>
+          <w:lang w:val="en-US"/>
+        </w:rPr>
+        <w:t>10</w:t>
+      </w:r>
+      <w:r>
+        <w:rPr>
+          <w:lang w:val="en-US"/>
+        </w:rPr>
+        <w:t xml:space="preserve">. </w:t>
       </w:r>
       <w:r>
         <w:rPr>
@@ -18318,6 +18415,13 @@
         </w:rPr>
       </w:pPr>
     </w:p>
+    <w:p>
+      <w:pPr>
+        <w:rPr>
+          <w:lang w:val="en-US"/>
+        </w:rPr>
+      </w:pPr>
+    </w:p>
     <w:tbl>
       <w:tblPr>
         <w:tblStyle w:val="Table"/>
@@ -18358,6 +18462,7 @@
                 <w:sz w:val="28"/>
                 <w:szCs w:val="28"/>
               </w:rPr>
+              <w:lastRenderedPageBreak/>
               <w:t>Num.Obs.</w:t>
             </w:r>
           </w:p>
@@ -19130,7 +19235,13 @@
               <w:jc w:val="right"/>
             </w:pPr>
             <w:r>
-              <w:t>(3.2)</w:t>
+              <w:t>(</w:t>
+            </w:r>
+            <w:r>
+              <w:t>2.10</w:t>
+            </w:r>
+            <w:r>
+              <w:t>)</w:t>
             </w:r>
           </w:p>
         </w:tc>
@@ -19606,13 +19717,32 @@
         <w:rPr>
           <w:lang w:val="en-US"/>
         </w:rPr>
-        <w:t>Table ## demonstrates</w:t>
+        <w:t xml:space="preserve">Table </w:t>
       </w:r>
       <w:r>
         <w:rPr>
           <w:lang w:val="en-US"/>
         </w:rPr>
-        <w:t xml:space="preserve"> no significant effects prior to the pandemic. Additionally, parameters comparatively close to zero indicating prominent parallel trends picture ##.</w:t>
+        <w:t>11</w:t>
+      </w:r>
+      <w:r>
+        <w:rPr>
+          <w:lang w:val="en-US"/>
+        </w:rPr>
+        <w:t xml:space="preserve"> demonstrates</w:t>
+      </w:r>
+      <w:r>
+        <w:rPr>
+          <w:lang w:val="en-US"/>
+        </w:rPr>
+        <w:t xml:space="preserve"> no significant effects prior to the pandemic. Additionally, parameters comparatively close to zero indicating prominent parallel trends picture </w:t>
+      </w:r>
+      <w:r>
+        <w:rPr>
+          <w:lang w:val="en-US"/>
+        </w:rPr>
+        <w:lastRenderedPageBreak/>
+        <w:t>##.</w:t>
       </w:r>
       <w:r>
         <w:rPr>
@@ -19759,7 +19889,13 @@
         <w:jc w:val="left"/>
       </w:pPr>
       <w:r>
-        <w:t>Picture ##. Coefficient plot of dynamic TWFE regression with hilighted pandemic period.</w:t>
+        <w:t xml:space="preserve">Picture </w:t>
+      </w:r>
+      <w:r>
+        <w:t>3</w:t>
+      </w:r>
+      <w:r>
+        <w:t>. Coefficient plot of dynamic TWFE regression with hilighted pandemic period.</w:t>
       </w:r>
     </w:p>
     <w:p>
@@ -19768,7 +19904,13 @@
         <w:jc w:val="center"/>
       </w:pPr>
       <w:r>
-        <w:t>Table ##. Results of dynamic TWFE.</w:t>
+        <w:t xml:space="preserve">Table </w:t>
+      </w:r>
+      <w:r>
+        <w:t>11</w:t>
+      </w:r>
+      <w:r>
+        <w:t>. Results of dynamic TWFE.</w:t>
       </w:r>
     </w:p>
     <w:tbl>
@@ -19816,7 +19958,6 @@
                 <w:sz w:val="28"/>
                 <w:szCs w:val="28"/>
               </w:rPr>
-              <w:lastRenderedPageBreak/>
               <w:t>variable</w:t>
             </w:r>
           </w:p>
@@ -20610,6 +20751,7 @@
               <w:rPr>
                 <w:rFonts w:ascii="Times New Roman" w:hAnsi="Times New Roman" w:cs="Times New Roman"/>
               </w:rPr>
+              <w:lastRenderedPageBreak/>
               <w:t>period_relevance = 0 × has_disability × period</w:t>
             </w:r>
           </w:p>
@@ -21914,7 +22056,6 @@
                 <w:rFonts w:ascii="Times New Roman" w:hAnsi="Times New Roman" w:cs="Times New Roman"/>
                 <w:lang w:val="en-US"/>
               </w:rPr>
-              <w:lastRenderedPageBreak/>
               <w:t>Time Effects</w:t>
             </w:r>
           </w:p>
@@ -22080,13 +22221,11 @@
         <w:t xml:space="preserve">Empirical study highlighted </w:t>
       </w:r>
       <w:r>
-        <w:t>that disabled workers experienced a statistically significant decline in monthly employment earnings of -5,678.95 rubles (SE = 2,350.19, p = 0.016) during the pandemic period relative to their pre-pandemic baseline when compared to non-disabled workers. This decline represents approximately a 19 percent reduction relative to the pre-pandemic mean for the treatment group. The 95 percent confidence interval, ranging from -10,287.58 to -1,070.32 rubles</w:t>
-      </w:r>
-      <w:r>
-        <w:t xml:space="preserve"> has </w:t>
-      </w:r>
-      <w:r>
-        <w:t>reasonable precision around this estimate, though the magnitude of the effect should be interpreted with attention to its substantial lower bound.</w:t>
+        <w:t xml:space="preserve">that disabled workers experienced a statistically significant decline in monthly employment earnings of -5,678.95 rubles (SE = 2,350.19, p = 0.016) during the pandemic period relative to their pre-pandemic baseline when compared to non-disabled workers. This decline represents </w:t>
+      </w:r>
+      <w:r>
+        <w:lastRenderedPageBreak/>
+        <w:t>approximately a 19 percent reduction relative to the pre-pandemic mean for the treatment group. The 95 percent confidence interval, ranging from -10,287.58 to -1,070.32 rubles has reasonable precision around this estimate, though the magnitude of the effect should be interpreted with attention to its substantial lower bound.</w:t>
       </w:r>
     </w:p>
     <w:p>
@@ -22102,19 +22241,19 @@
         <w:ind w:firstLine="720"/>
       </w:pPr>
       <w:r>
-        <w:t xml:space="preserve">The Propensity Score Matching procedure employing full logit matching successfully balanced covariates between treatment and control groups, with all </w:t>
+        <w:t>The Propensity Score Matching procedure employing full logit matching successfully balanced covariates between treatment and control groups, with all standardized mean differences below 0.10 and all squared and interaction terms below 0.15 post-matching. This balance strengthens the comparability of the comparison groups and reduces concerns about confounding by observed characteristics such as age, education, gender, marital status, harmful work exposure, and employment status.</w:t>
+      </w:r>
+    </w:p>
+    <w:p>
+      <w:pPr>
+        <w:ind w:firstLine="720"/>
+      </w:pPr>
+      <w:r>
+        <w:t xml:space="preserve">Several limitations warrant consideration. First, the self-reported nature of wage variables may introduce measurement error, though there is little reason to suspect differential reporting bias between disabled and non-disabled respondents. Second, the exclusion of individuals who acquired or lost disability status during the </w:t>
       </w:r>
       <w:r>
         <w:lastRenderedPageBreak/>
-        <w:t>standardized mean differences below 0.10 and all squared and interaction terms below 0.15 post-matching. This balance strengthens the comparability of the comparison groups and reduces concerns about confounding by observed characteristics such as age, education, gender, marital status, harmful work exposure, and employment status.</w:t>
-      </w:r>
-    </w:p>
-    <w:p>
-      <w:pPr>
-        <w:ind w:firstLine="720"/>
-      </w:pPr>
-      <w:r>
-        <w:t>Several limitations warrant consideration. First, the self-reported nature of wage variables may introduce measurement error, though there is little reason to suspect differential reporting bias between disabled and non-disabled respondents. Second, the exclusion of individuals who acquired or lost disability status during the period of interest, while necessary for SUTVA compliance, limits generalizability to the stable disability population. Third, the relatively small number of treated units (221 matched disabled individuals) relative to controls (9,309) may affect precision, though the cluster-robust standard errors partially address concerns about dependence. Fourth, the analysis captures short- to medium-term effects only; longer-term adjustments in labor market outcomes remain unobserved.</w:t>
+        <w:t>period of interest, while necessary for SUTVA compliance, limits generalizability to the stable disability population. Third, the relatively small number of treated units (221 matched disabled individuals) relative to controls (9,309) may affect precision, though the cluster-robust standard errors partially address concerns about dependence. Fourth, the analysis captures short- to medium-term effects only; longer-term adjustments in labor market outcomes remain unobserved.</w:t>
       </w:r>
       <w:r>
         <w:t xml:space="preserve"> Additionally there are possible cofounders presented in picture ## that may effect treatment directly such as: discrimination by age (ageism), employer’s prejudge which is present in all sectors of the employment market and other types of discrimination. Unfortunatly those confounders remain unobserved.</w:t>
@@ -22184,7 +22323,19 @@
         <w:jc w:val="center"/>
       </w:pPr>
       <w:r>
-        <w:t>Picture ##. Variable influence on outccome.</w:t>
+        <w:t xml:space="preserve">Picture </w:t>
+      </w:r>
+      <w:r>
+        <w:t>4</w:t>
+      </w:r>
+      <w:r>
+        <w:t xml:space="preserve">. </w:t>
+      </w:r>
+      <w:r>
+        <w:t>Casual inference on outcome</w:t>
+      </w:r>
+      <w:r>
+        <w:t>.</w:t>
       </w:r>
     </w:p>
     <w:p>
@@ -22212,6 +22363,7 @@
         <w:ind w:firstLine="720"/>
       </w:pPr>
       <w:r>
+        <w:lastRenderedPageBreak/>
         <w:t>In sum</w:t>
       </w:r>
       <w:r>
@@ -22246,7 +22398,7 @@
       <w:pPr>
         <w:pStyle w:val="Titre1"/>
       </w:pPr>
-      <w:bookmarkStart w:id="13" w:name="_Toc229485491"/>
+      <w:bookmarkStart w:id="13" w:name="_Toc229556438"/>
       <w:r>
         <w:lastRenderedPageBreak/>
         <w:t>3. Recommendations to address similar</w:t>
@@ -22419,7 +22571,7 @@
       <w:pPr>
         <w:pStyle w:val="Titre1"/>
       </w:pPr>
-      <w:bookmarkStart w:id="14" w:name="_Toc229485492"/>
+      <w:bookmarkStart w:id="14" w:name="_Toc229556439"/>
       <w:r>
         <w:lastRenderedPageBreak/>
         <w:t>Conclusion</w:t>
@@ -22579,14 +22731,1191 @@
       <w:pPr>
         <w:pStyle w:val="Titre1"/>
       </w:pPr>
-      <w:bookmarkStart w:id="15" w:name="_Toc229485493"/>
+      <w:bookmarkStart w:id="15" w:name="_Toc229556440"/>
       <w:r>
         <w:lastRenderedPageBreak/>
-        <w:t>References</w:t>
+        <w:t>Bibliography</w:t>
       </w:r>
       <w:bookmarkEnd w:id="15"/>
     </w:p>
-    <w:p/>
+    <w:p>
+      <w:pPr>
+        <w:pStyle w:val="Paragraphedeliste"/>
+        <w:numPr>
+          <w:ilvl w:val="0"/>
+          <w:numId w:val="31"/>
+        </w:numPr>
+        <w:ind w:hanging="578"/>
+        <w:rPr>
+          <w:lang w:val="en-US"/>
+        </w:rPr>
+      </w:pPr>
+      <w:r>
+        <w:rPr>
+          <w:lang w:val="en-US"/>
+        </w:rPr>
+        <w:t xml:space="preserve">Kuper, H., Banks, L. M., Bright, T., Davey, C., &amp; Shakespeare, T. (2020). Disability-inclusive COVID-19 response: What it is, why it is important and what we can learn from the United Kingdom's response. </w:t>
+      </w:r>
+      <w:proofErr w:type="spellStart"/>
+      <w:r>
+        <w:rPr>
+          <w:lang w:val="en-US"/>
+        </w:rPr>
+        <w:t>Wellcome</w:t>
+      </w:r>
+      <w:proofErr w:type="spellEnd"/>
+      <w:r>
+        <w:rPr>
+          <w:lang w:val="en-US"/>
+        </w:rPr>
+        <w:t xml:space="preserve"> Open Research, 5, 79. https://doi.org/10.12688/wellcomeopenres.15833.1</w:t>
+      </w:r>
+    </w:p>
+    <w:p>
+      <w:pPr>
+        <w:pStyle w:val="Paragraphedeliste"/>
+        <w:numPr>
+          <w:ilvl w:val="0"/>
+          <w:numId w:val="31"/>
+        </w:numPr>
+        <w:ind w:hanging="578"/>
+        <w:rPr>
+          <w:lang w:val="en-US"/>
+        </w:rPr>
+      </w:pPr>
+      <w:r>
+        <w:rPr>
+          <w:lang w:val="en-US"/>
+        </w:rPr>
+        <w:t xml:space="preserve">Adda, J., Banks, J., &amp; Von </w:t>
+      </w:r>
+      <w:proofErr w:type="spellStart"/>
+      <w:r>
+        <w:rPr>
+          <w:lang w:val="en-US"/>
+        </w:rPr>
+        <w:t>Gaudecker</w:t>
+      </w:r>
+      <w:proofErr w:type="spellEnd"/>
+      <w:r>
+        <w:rPr>
+          <w:lang w:val="en-US"/>
+        </w:rPr>
+        <w:t>, H. M. (2003). The impact of income shocks on health: Evidence from cohort data. Journal of the European Economic Association, 1(4), 968–1000.</w:t>
+      </w:r>
+    </w:p>
+    <w:p>
+      <w:pPr>
+        <w:pStyle w:val="Paragraphedeliste"/>
+        <w:numPr>
+          <w:ilvl w:val="0"/>
+          <w:numId w:val="31"/>
+        </w:numPr>
+        <w:ind w:hanging="578"/>
+        <w:rPr>
+          <w:lang w:val="en-US"/>
+        </w:rPr>
+      </w:pPr>
+      <w:r>
+        <w:rPr>
+          <w:lang w:val="en-US"/>
+        </w:rPr>
+        <w:t xml:space="preserve">Baicker, K., Mullainathan, S., &amp; </w:t>
+      </w:r>
+      <w:proofErr w:type="spellStart"/>
+      <w:r>
+        <w:rPr>
+          <w:lang w:val="en-US"/>
+        </w:rPr>
+        <w:t>Schwartzstein</w:t>
+      </w:r>
+      <w:proofErr w:type="spellEnd"/>
+      <w:r>
+        <w:rPr>
+          <w:lang w:val="en-US"/>
+        </w:rPr>
+        <w:t>, J. (2015). Behavioral hazard in health insurance. Quarterly Journal of Economics, 130(4), 1623–1667.</w:t>
+      </w:r>
+    </w:p>
+    <w:p>
+      <w:pPr>
+        <w:pStyle w:val="Paragraphedeliste"/>
+        <w:numPr>
+          <w:ilvl w:val="0"/>
+          <w:numId w:val="31"/>
+        </w:numPr>
+        <w:ind w:hanging="578"/>
+        <w:rPr>
+          <w:lang w:val="en-US"/>
+        </w:rPr>
+      </w:pPr>
+      <w:r>
+        <w:rPr>
+          <w:lang w:val="en-US"/>
+        </w:rPr>
+        <w:t>Becker, G. S. (1964). Human capital: A theoretical and empirical analysis, with special reference to education. National Bureau of Economic Research; distributed by Columbia University Press.</w:t>
+      </w:r>
+    </w:p>
+    <w:p>
+      <w:pPr>
+        <w:pStyle w:val="Paragraphedeliste"/>
+        <w:numPr>
+          <w:ilvl w:val="0"/>
+          <w:numId w:val="31"/>
+        </w:numPr>
+        <w:ind w:hanging="578"/>
+        <w:rPr>
+          <w:lang w:val="en-US"/>
+        </w:rPr>
+      </w:pPr>
+      <w:proofErr w:type="spellStart"/>
+      <w:r>
+        <w:rPr>
+          <w:lang w:val="en-US"/>
+        </w:rPr>
+        <w:t>Bondoux</w:t>
+      </w:r>
+      <w:proofErr w:type="spellEnd"/>
+      <w:r>
+        <w:rPr>
+          <w:lang w:val="en-US"/>
+        </w:rPr>
+        <w:t xml:space="preserve">, Justine, (2024), Relationships between disability and </w:t>
+      </w:r>
+      <w:proofErr w:type="spellStart"/>
+      <w:r>
+        <w:rPr>
+          <w:lang w:val="en-US"/>
+        </w:rPr>
+        <w:t>labour</w:t>
+      </w:r>
+      <w:proofErr w:type="spellEnd"/>
+      <w:r>
+        <w:rPr>
+          <w:lang w:val="en-US"/>
+        </w:rPr>
+        <w:t xml:space="preserve"> market outcomes in Europe</w:t>
+      </w:r>
+    </w:p>
+    <w:p>
+      <w:pPr>
+        <w:pStyle w:val="Paragraphedeliste"/>
+        <w:numPr>
+          <w:ilvl w:val="0"/>
+          <w:numId w:val="31"/>
+        </w:numPr>
+        <w:ind w:hanging="578"/>
+        <w:rPr>
+          <w:lang w:val="en-US"/>
+        </w:rPr>
+      </w:pPr>
+      <w:r>
+        <w:rPr>
+          <w:lang w:val="en-US"/>
+        </w:rPr>
+        <w:t xml:space="preserve">Campbell, F. K. (2009). Contours of ableism: The production of disability and </w:t>
+      </w:r>
+      <w:proofErr w:type="spellStart"/>
+      <w:r>
+        <w:rPr>
+          <w:lang w:val="en-US"/>
+        </w:rPr>
+        <w:t>abledness</w:t>
+      </w:r>
+      <w:proofErr w:type="spellEnd"/>
+      <w:r>
+        <w:rPr>
+          <w:lang w:val="en-US"/>
+        </w:rPr>
+        <w:t>. Palgrave Macmillan.</w:t>
+      </w:r>
+    </w:p>
+    <w:p>
+      <w:pPr>
+        <w:pStyle w:val="Paragraphedeliste"/>
+        <w:numPr>
+          <w:ilvl w:val="0"/>
+          <w:numId w:val="31"/>
+        </w:numPr>
+        <w:ind w:hanging="578"/>
+        <w:rPr>
+          <w:lang w:val="en-US"/>
+        </w:rPr>
+      </w:pPr>
+      <w:r>
+        <w:rPr>
+          <w:lang w:val="en-US"/>
+        </w:rPr>
+        <w:t>Dan, B. (2024), The ICF as a socio-psycho-biological model for the full participation of disabled individuals. Dev Med Child Neurol, 66: 1398-1399. https://doi.org/10.1111/dmcn.16044</w:t>
+      </w:r>
+    </w:p>
+    <w:p>
+      <w:pPr>
+        <w:pStyle w:val="Paragraphedeliste"/>
+        <w:numPr>
+          <w:ilvl w:val="0"/>
+          <w:numId w:val="31"/>
+        </w:numPr>
+        <w:ind w:hanging="578"/>
+        <w:rPr>
+          <w:lang w:val="en-US"/>
+        </w:rPr>
+      </w:pPr>
+      <w:r>
+        <w:rPr>
+          <w:lang w:val="en-US"/>
+        </w:rPr>
+        <w:t xml:space="preserve">Doeringer, P. B., &amp; </w:t>
+      </w:r>
+      <w:proofErr w:type="spellStart"/>
+      <w:r>
+        <w:rPr>
+          <w:lang w:val="en-US"/>
+        </w:rPr>
+        <w:t>Piore</w:t>
+      </w:r>
+      <w:proofErr w:type="spellEnd"/>
+      <w:r>
+        <w:rPr>
+          <w:lang w:val="en-US"/>
+        </w:rPr>
+        <w:t>, M. J. (1971). Internal labor markets and manpower analysis. Heath</w:t>
+      </w:r>
+    </w:p>
+    <w:p>
+      <w:pPr>
+        <w:pStyle w:val="Paragraphedeliste"/>
+        <w:numPr>
+          <w:ilvl w:val="0"/>
+          <w:numId w:val="31"/>
+        </w:numPr>
+        <w:ind w:hanging="578"/>
+        <w:rPr>
+          <w:lang w:val="en-US"/>
+        </w:rPr>
+      </w:pPr>
+      <w:r>
+        <w:rPr>
+          <w:lang w:val="en-US"/>
+        </w:rPr>
+        <w:t>Federal Law No. 166-FZ of December 15, 2001, "On State Pension Provision in the Russian Federation"</w:t>
+      </w:r>
+    </w:p>
+    <w:p>
+      <w:pPr>
+        <w:pStyle w:val="Paragraphedeliste"/>
+        <w:numPr>
+          <w:ilvl w:val="0"/>
+          <w:numId w:val="31"/>
+        </w:numPr>
+        <w:ind w:hanging="578"/>
+        <w:rPr>
+          <w:lang w:val="en-US"/>
+        </w:rPr>
+      </w:pPr>
+      <w:r>
+        <w:rPr>
+          <w:lang w:val="en-US"/>
+        </w:rPr>
+        <w:t>Federal Law No. 178-FZ of July 17, 1999, "On State Social Assistance"</w:t>
+      </w:r>
+    </w:p>
+    <w:p>
+      <w:pPr>
+        <w:pStyle w:val="Paragraphedeliste"/>
+        <w:numPr>
+          <w:ilvl w:val="0"/>
+          <w:numId w:val="31"/>
+        </w:numPr>
+        <w:ind w:hanging="578"/>
+        <w:rPr>
+          <w:lang w:val="en-US"/>
+        </w:rPr>
+      </w:pPr>
+      <w:r>
+        <w:rPr>
+          <w:lang w:val="en-US"/>
+        </w:rPr>
+        <w:t xml:space="preserve">Galama, T., &amp; Van </w:t>
+      </w:r>
+      <w:proofErr w:type="spellStart"/>
+      <w:r>
+        <w:rPr>
+          <w:lang w:val="en-US"/>
+        </w:rPr>
+        <w:t>Kippersluis</w:t>
+      </w:r>
+      <w:proofErr w:type="spellEnd"/>
+      <w:r>
+        <w:rPr>
+          <w:lang w:val="en-US"/>
+        </w:rPr>
+        <w:t>, H. (2019). A theory of socioeconomic disparities in health. Journal of Health Economics, 62, 1–14.</w:t>
+      </w:r>
+    </w:p>
+    <w:p>
+      <w:pPr>
+        <w:pStyle w:val="Paragraphedeliste"/>
+        <w:numPr>
+          <w:ilvl w:val="0"/>
+          <w:numId w:val="31"/>
+        </w:numPr>
+        <w:ind w:hanging="578"/>
+        <w:rPr>
+          <w:lang w:val="en-US"/>
+        </w:rPr>
+      </w:pPr>
+      <w:proofErr w:type="spellStart"/>
+      <w:r>
+        <w:rPr>
+          <w:lang w:val="fr-FR"/>
+        </w:rPr>
+        <w:lastRenderedPageBreak/>
+        <w:t>Gilleskie</w:t>
+      </w:r>
+      <w:proofErr w:type="spellEnd"/>
+      <w:r>
+        <w:rPr>
+          <w:lang w:val="fr-FR"/>
+        </w:rPr>
+        <w:t xml:space="preserve">, D. B., &amp; Hoffman, D. (2014). </w:t>
+      </w:r>
+      <w:r>
+        <w:rPr>
+          <w:lang w:val="en-US"/>
+        </w:rPr>
+        <w:t>Health capital and human capital as explanations for health-related wage disparities. Journal of Human Capital, 8(3), 235–279</w:t>
+      </w:r>
+    </w:p>
+    <w:p>
+      <w:pPr>
+        <w:pStyle w:val="Paragraphedeliste"/>
+        <w:numPr>
+          <w:ilvl w:val="0"/>
+          <w:numId w:val="31"/>
+        </w:numPr>
+        <w:ind w:hanging="578"/>
+        <w:rPr>
+          <w:lang w:val="en-US"/>
+        </w:rPr>
+      </w:pPr>
+      <w:r>
+        <w:rPr>
+          <w:lang w:val="en-US"/>
+        </w:rPr>
+        <w:t>Goodley, D. (2017). Disability studies: An interdisciplinary introduction (2nd ed.). Sage.</w:t>
+      </w:r>
+    </w:p>
+    <w:p>
+      <w:pPr>
+        <w:pStyle w:val="Paragraphedeliste"/>
+        <w:numPr>
+          <w:ilvl w:val="0"/>
+          <w:numId w:val="31"/>
+        </w:numPr>
+        <w:ind w:hanging="578"/>
+        <w:rPr>
+          <w:lang w:val="en-US"/>
+        </w:rPr>
+      </w:pPr>
+      <w:r>
+        <w:rPr>
+          <w:lang w:val="en-US"/>
+        </w:rPr>
+        <w:t>Grossman, M. (1972). On the concept of health capital and the demand for health. Journal of Political Economy, 80(2), 223–255.</w:t>
+      </w:r>
+    </w:p>
+    <w:p>
+      <w:pPr>
+        <w:pStyle w:val="Paragraphedeliste"/>
+        <w:numPr>
+          <w:ilvl w:val="0"/>
+          <w:numId w:val="31"/>
+        </w:numPr>
+        <w:ind w:hanging="578"/>
+        <w:rPr>
+          <w:lang w:val="en-US"/>
+        </w:rPr>
+      </w:pPr>
+      <w:r>
+        <w:rPr>
+          <w:lang w:val="en-US"/>
+        </w:rPr>
+        <w:t>Haveman, R., &amp; Wolfe, B. (2000). The economics of disability and disability policy. Handbook of Health Economics, 1, 995-1051</w:t>
+      </w:r>
+    </w:p>
+    <w:p>
+      <w:pPr>
+        <w:pStyle w:val="Paragraphedeliste"/>
+        <w:numPr>
+          <w:ilvl w:val="0"/>
+          <w:numId w:val="31"/>
+        </w:numPr>
+        <w:ind w:hanging="578"/>
+        <w:rPr>
+          <w:lang w:val="en-US"/>
+        </w:rPr>
+      </w:pPr>
+      <w:r>
+        <w:rPr>
+          <w:lang w:val="en-US"/>
+        </w:rPr>
+        <w:t>https://doi.org/10.1007/s00038-006-0035-y</w:t>
+      </w:r>
+    </w:p>
+    <w:p>
+      <w:pPr>
+        <w:pStyle w:val="Paragraphedeliste"/>
+        <w:numPr>
+          <w:ilvl w:val="0"/>
+          <w:numId w:val="31"/>
+        </w:numPr>
+        <w:ind w:hanging="578"/>
+        <w:rPr>
+          <w:lang w:val="fr-FR"/>
+        </w:rPr>
+      </w:pPr>
+      <w:r>
+        <w:rPr>
+          <w:lang w:val="en-US"/>
+        </w:rPr>
+        <w:t xml:space="preserve">Jones, M. (2022). COVID-19 and the </w:t>
+      </w:r>
+      <w:proofErr w:type="spellStart"/>
+      <w:r>
+        <w:rPr>
+          <w:lang w:val="en-US"/>
+        </w:rPr>
+        <w:t>labour</w:t>
+      </w:r>
+      <w:proofErr w:type="spellEnd"/>
+      <w:r>
+        <w:rPr>
+          <w:lang w:val="en-US"/>
+        </w:rPr>
+        <w:t xml:space="preserve"> market outcomes of disabled people in the UK. </w:t>
+      </w:r>
+      <w:r>
+        <w:rPr>
+          <w:lang w:val="fr-FR"/>
+        </w:rPr>
+        <w:t xml:space="preserve">Social Science &amp; </w:t>
+      </w:r>
+      <w:proofErr w:type="spellStart"/>
+      <w:r>
+        <w:rPr>
+          <w:lang w:val="fr-FR"/>
+        </w:rPr>
+        <w:t>Medicine</w:t>
+      </w:r>
+      <w:proofErr w:type="spellEnd"/>
+      <w:r>
+        <w:rPr>
+          <w:lang w:val="fr-FR"/>
+        </w:rPr>
+        <w:t>, 292, Article 114637. https://doi.org/10.1016/j.socscimed.2021.114637</w:t>
+      </w:r>
+    </w:p>
+    <w:p>
+      <w:pPr>
+        <w:pStyle w:val="Paragraphedeliste"/>
+        <w:numPr>
+          <w:ilvl w:val="0"/>
+          <w:numId w:val="31"/>
+        </w:numPr>
+        <w:ind w:hanging="578"/>
+        <w:rPr>
+          <w:lang w:val="en-US"/>
+        </w:rPr>
+      </w:pPr>
+      <w:r>
+        <w:rPr>
+          <w:lang w:val="fr-FR"/>
+        </w:rPr>
+        <w:t xml:space="preserve">Jones, M. K., Latreille, P. L., &amp; Sloane, P. J. (2021). </w:t>
+      </w:r>
+      <w:r>
+        <w:rPr>
+          <w:lang w:val="en-US"/>
+        </w:rPr>
+        <w:t xml:space="preserve">Disability, gender, and the British </w:t>
+      </w:r>
+      <w:proofErr w:type="spellStart"/>
+      <w:r>
+        <w:rPr>
+          <w:lang w:val="en-US"/>
+        </w:rPr>
+        <w:t>labour</w:t>
+      </w:r>
+      <w:proofErr w:type="spellEnd"/>
+      <w:r>
+        <w:rPr>
+          <w:lang w:val="en-US"/>
+        </w:rPr>
+        <w:t xml:space="preserve"> market. Oxford Economic Papers, 73(2), 565-587.</w:t>
+      </w:r>
+    </w:p>
+    <w:p>
+      <w:pPr>
+        <w:pStyle w:val="Paragraphedeliste"/>
+        <w:numPr>
+          <w:ilvl w:val="0"/>
+          <w:numId w:val="31"/>
+        </w:numPr>
+        <w:ind w:hanging="578"/>
+        <w:rPr>
+          <w:lang w:val="en-US"/>
+        </w:rPr>
+      </w:pPr>
+      <w:r>
+        <w:rPr>
+          <w:lang w:val="en-US"/>
+        </w:rPr>
+        <w:t>Kabeer, N. (2021). Women's empowerment and economic development. World Development, 147, 105553.</w:t>
+      </w:r>
+    </w:p>
+    <w:p>
+      <w:pPr>
+        <w:pStyle w:val="Paragraphedeliste"/>
+        <w:numPr>
+          <w:ilvl w:val="0"/>
+          <w:numId w:val="31"/>
+        </w:numPr>
+        <w:ind w:hanging="578"/>
+        <w:rPr>
+          <w:lang w:val="en-US"/>
+        </w:rPr>
+      </w:pPr>
+      <w:r>
+        <w:rPr>
+          <w:lang w:val="en-US"/>
+        </w:rPr>
+        <w:t xml:space="preserve">Maroto, M., &amp; </w:t>
+      </w:r>
+      <w:proofErr w:type="spellStart"/>
+      <w:r>
+        <w:rPr>
+          <w:lang w:val="en-US"/>
+        </w:rPr>
+        <w:t>Pettinicchio</w:t>
+      </w:r>
+      <w:proofErr w:type="spellEnd"/>
+      <w:r>
+        <w:rPr>
+          <w:lang w:val="en-US"/>
+        </w:rPr>
+        <w:t>, D. (2024). From recession to pandemic: Displacement among workers with disabilities from 2007 through 2021. Journal of Vocational Rehabilitation, 61(1), 25–37. https://doi.org/10.3233/JVR-230064</w:t>
+      </w:r>
+    </w:p>
+    <w:p>
+      <w:pPr>
+        <w:pStyle w:val="Paragraphedeliste"/>
+        <w:numPr>
+          <w:ilvl w:val="0"/>
+          <w:numId w:val="31"/>
+        </w:numPr>
+        <w:ind w:hanging="578"/>
+        <w:rPr>
+          <w:lang w:val="en-US"/>
+        </w:rPr>
+      </w:pPr>
+      <w:proofErr w:type="spellStart"/>
+      <w:r>
+        <w:rPr>
+          <w:lang w:val="en-US"/>
+        </w:rPr>
+        <w:t>Ne'eman</w:t>
+      </w:r>
+      <w:proofErr w:type="spellEnd"/>
+      <w:r>
+        <w:rPr>
+          <w:lang w:val="en-US"/>
+        </w:rPr>
+        <w:t xml:space="preserve">, A., &amp; Maestas, N. (2023). How has COVID-19 impacted disability </w:t>
+      </w:r>
+      <w:proofErr w:type="gramStart"/>
+      <w:r>
+        <w:rPr>
+          <w:lang w:val="en-US"/>
+        </w:rPr>
+        <w:t>employment?.</w:t>
+      </w:r>
+      <w:proofErr w:type="gramEnd"/>
+      <w:r>
+        <w:rPr>
+          <w:lang w:val="en-US"/>
+        </w:rPr>
+        <w:t xml:space="preserve"> Disability and health journal, 16(2), 101429. https://doi.org/10.1016/j.dhjo.2022.101429</w:t>
+      </w:r>
+    </w:p>
+    <w:p>
+      <w:pPr>
+        <w:pStyle w:val="Paragraphedeliste"/>
+        <w:numPr>
+          <w:ilvl w:val="0"/>
+          <w:numId w:val="31"/>
+        </w:numPr>
+        <w:ind w:hanging="578"/>
+        <w:rPr>
+          <w:lang w:val="en-US"/>
+        </w:rPr>
+      </w:pPr>
+      <w:r>
+        <w:rPr>
+          <w:lang w:val="en-US"/>
+        </w:rPr>
+        <w:t>Nussbaum, M. C. (2006). Frontiers of justice: Disability, nationality, species membership. The Belknap Press of Harvard University Press.</w:t>
+      </w:r>
+    </w:p>
+    <w:p>
+      <w:pPr>
+        <w:pStyle w:val="Paragraphedeliste"/>
+        <w:numPr>
+          <w:ilvl w:val="0"/>
+          <w:numId w:val="31"/>
+        </w:numPr>
+        <w:ind w:hanging="578"/>
+        <w:rPr>
+          <w:lang w:val="en-US"/>
+        </w:rPr>
+      </w:pPr>
+      <w:proofErr w:type="spellStart"/>
+      <w:r>
+        <w:rPr>
+          <w:lang w:val="en-US"/>
+        </w:rPr>
+        <w:lastRenderedPageBreak/>
+        <w:t>Pryma</w:t>
+      </w:r>
+      <w:proofErr w:type="spellEnd"/>
+      <w:r>
+        <w:rPr>
+          <w:lang w:val="en-US"/>
+        </w:rPr>
+        <w:t>, J. (2025). Trauma as a workaround: Recognizing chronic pain as disability without medical documentation in the United States and France. Social Science &amp; Medicine, 382, Article 118364.</w:t>
+      </w:r>
+    </w:p>
+    <w:p>
+      <w:pPr>
+        <w:pStyle w:val="Paragraphedeliste"/>
+        <w:numPr>
+          <w:ilvl w:val="0"/>
+          <w:numId w:val="31"/>
+        </w:numPr>
+        <w:ind w:hanging="578"/>
+        <w:rPr>
+          <w:lang w:val="en-US"/>
+        </w:rPr>
+      </w:pPr>
+      <w:r>
+        <w:rPr>
+          <w:lang w:val="en-US"/>
+        </w:rPr>
+        <w:t xml:space="preserve">Ramaswamy, K. (2024). </w:t>
+      </w:r>
+      <w:proofErr w:type="spellStart"/>
+      <w:r>
+        <w:rPr>
+          <w:lang w:val="en-US"/>
+        </w:rPr>
+        <w:t>Cripping</w:t>
+      </w:r>
+      <w:proofErr w:type="spellEnd"/>
+      <w:r>
+        <w:rPr>
+          <w:lang w:val="en-US"/>
+        </w:rPr>
+        <w:t xml:space="preserve"> Justice: Enabling Theory on Disability [Apollo - University of Cambridge Repository]. https://doi.org/10.17863/CAM.115138</w:t>
+      </w:r>
+    </w:p>
+    <w:p>
+      <w:pPr>
+        <w:pStyle w:val="Paragraphedeliste"/>
+        <w:numPr>
+          <w:ilvl w:val="0"/>
+          <w:numId w:val="31"/>
+        </w:numPr>
+        <w:ind w:hanging="578"/>
+        <w:rPr>
+          <w:lang w:val="en-US"/>
+        </w:rPr>
+      </w:pPr>
+      <w:proofErr w:type="spellStart"/>
+      <w:r>
+        <w:rPr>
+          <w:lang w:val="en-US"/>
+        </w:rPr>
+        <w:t>Rasell</w:t>
+      </w:r>
+      <w:proofErr w:type="spellEnd"/>
+      <w:r>
+        <w:rPr>
+          <w:lang w:val="en-US"/>
+        </w:rPr>
+        <w:t xml:space="preserve">, M., &amp; </w:t>
+      </w:r>
+      <w:proofErr w:type="spellStart"/>
+      <w:r>
+        <w:rPr>
+          <w:lang w:val="en-US"/>
+        </w:rPr>
+        <w:t>Iarskaia</w:t>
+      </w:r>
+      <w:proofErr w:type="spellEnd"/>
+      <w:r>
+        <w:rPr>
+          <w:lang w:val="en-US"/>
+        </w:rPr>
+        <w:t>-Smirnova, E. (Eds.). (2013). Disability in Eastern Europe and the Former Soviet Union: History, policy and everyday life (1st ed.). Routledge. https://doi.org/10.4324/9781315866932</w:t>
+      </w:r>
+    </w:p>
+    <w:p>
+      <w:pPr>
+        <w:pStyle w:val="Paragraphedeliste"/>
+        <w:numPr>
+          <w:ilvl w:val="0"/>
+          <w:numId w:val="31"/>
+        </w:numPr>
+        <w:ind w:hanging="578"/>
+        <w:rPr>
+          <w:lang w:val="en-US"/>
+        </w:rPr>
+      </w:pPr>
+      <w:r>
+        <w:rPr>
+          <w:lang w:val="en-US"/>
+        </w:rPr>
+        <w:t>Resolution of the Government of the Russian Federation No. 890 of July 30, 1994, "On State Support for the Development of the Medical Industry and Improving the Provision of Medicines and Medical Devices to the Population and Healthcare Institutions"</w:t>
+      </w:r>
+    </w:p>
+    <w:p>
+      <w:pPr>
+        <w:pStyle w:val="Paragraphedeliste"/>
+        <w:numPr>
+          <w:ilvl w:val="0"/>
+          <w:numId w:val="31"/>
+        </w:numPr>
+        <w:ind w:hanging="578"/>
+        <w:rPr>
+          <w:lang w:val="en-US"/>
+        </w:rPr>
+      </w:pPr>
+      <w:r>
+        <w:rPr>
+          <w:lang w:val="en-US"/>
+        </w:rPr>
+        <w:t>RLMS official page (https://www.hse.ru/en/rlms/questionnaires)</w:t>
+      </w:r>
+    </w:p>
+    <w:p>
+      <w:pPr>
+        <w:pStyle w:val="Paragraphedeliste"/>
+        <w:numPr>
+          <w:ilvl w:val="0"/>
+          <w:numId w:val="31"/>
+        </w:numPr>
+        <w:ind w:hanging="578"/>
+        <w:rPr>
+          <w:lang w:val="en-US"/>
+        </w:rPr>
+      </w:pPr>
+      <w:r>
+        <w:rPr>
+          <w:lang w:val="en-US"/>
+        </w:rPr>
+        <w:t xml:space="preserve">Rosenbaum, P. R., &amp; Rubin, D. B. (1983). The central role of the propensity score in observational studies for causal effects. </w:t>
+      </w:r>
+      <w:proofErr w:type="spellStart"/>
+      <w:r>
+        <w:rPr>
+          <w:lang w:val="en-US"/>
+        </w:rPr>
+        <w:t>Biometrika</w:t>
+      </w:r>
+      <w:proofErr w:type="spellEnd"/>
+      <w:r>
+        <w:rPr>
+          <w:lang w:val="en-US"/>
+        </w:rPr>
+        <w:t>, 70(1), 41–55.</w:t>
+      </w:r>
+    </w:p>
+    <w:p>
+      <w:pPr>
+        <w:pStyle w:val="Paragraphedeliste"/>
+        <w:numPr>
+          <w:ilvl w:val="0"/>
+          <w:numId w:val="31"/>
+        </w:numPr>
+        <w:ind w:hanging="578"/>
+        <w:rPr>
+          <w:lang w:val="en-US"/>
+        </w:rPr>
+      </w:pPr>
+      <w:r>
+        <w:rPr>
+          <w:lang w:val="en-US"/>
+        </w:rPr>
+        <w:t>Schur, Lisa &amp; Rodgers, Yana &amp; Kruse, Douglas. (2021). COVID-19 and Employment Losses for Workers with Disabilities: An Intersectional Approach. SSRN Electronic Journal. 10.2139/ssrn.3788319.</w:t>
+      </w:r>
+    </w:p>
+    <w:p>
+      <w:pPr>
+        <w:pStyle w:val="Paragraphedeliste"/>
+        <w:numPr>
+          <w:ilvl w:val="0"/>
+          <w:numId w:val="31"/>
+        </w:numPr>
+        <w:ind w:hanging="578"/>
+        <w:rPr>
+          <w:lang w:val="en-US"/>
+        </w:rPr>
+      </w:pPr>
+      <w:r>
+        <w:rPr>
+          <w:lang w:val="en-US"/>
+        </w:rPr>
+        <w:t>Sen, A. (1999). Development as freedom. Oxford University Press</w:t>
+      </w:r>
+    </w:p>
+    <w:p>
+      <w:pPr>
+        <w:pStyle w:val="Paragraphedeliste"/>
+        <w:numPr>
+          <w:ilvl w:val="0"/>
+          <w:numId w:val="31"/>
+        </w:numPr>
+        <w:ind w:hanging="578"/>
+        <w:rPr>
+          <w:lang w:val="en-US"/>
+        </w:rPr>
+      </w:pPr>
+      <w:r>
+        <w:rPr>
+          <w:lang w:val="en-US"/>
+        </w:rPr>
+        <w:t>Shakespeare, T. (2006). Disability rights and wrongs. Routledge.</w:t>
+      </w:r>
+    </w:p>
+    <w:p>
+      <w:pPr>
+        <w:pStyle w:val="Paragraphedeliste"/>
+        <w:numPr>
+          <w:ilvl w:val="0"/>
+          <w:numId w:val="31"/>
+        </w:numPr>
+        <w:ind w:hanging="578"/>
+        <w:rPr>
+          <w:lang w:val="en-US"/>
+        </w:rPr>
+      </w:pPr>
+      <w:proofErr w:type="spellStart"/>
+      <w:r>
+        <w:rPr>
+          <w:lang w:val="en-US"/>
+        </w:rPr>
+        <w:t>Sukushina</w:t>
+      </w:r>
+      <w:proofErr w:type="spellEnd"/>
+      <w:r>
+        <w:rPr>
+          <w:lang w:val="en-US"/>
+        </w:rPr>
+        <w:t xml:space="preserve">, E. V., </w:t>
+      </w:r>
+      <w:proofErr w:type="spellStart"/>
+      <w:r>
+        <w:rPr>
+          <w:lang w:val="en-US"/>
+        </w:rPr>
+        <w:t>Marinenko</w:t>
+      </w:r>
+      <w:proofErr w:type="spellEnd"/>
+      <w:r>
+        <w:rPr>
+          <w:lang w:val="en-US"/>
+        </w:rPr>
+        <w:t xml:space="preserve">, Y. S., &amp; </w:t>
+      </w:r>
+      <w:proofErr w:type="spellStart"/>
+      <w:r>
+        <w:rPr>
+          <w:lang w:val="en-US"/>
+        </w:rPr>
+        <w:t>Vyalova</w:t>
+      </w:r>
+      <w:proofErr w:type="spellEnd"/>
+      <w:r>
+        <w:rPr>
+          <w:lang w:val="en-US"/>
+        </w:rPr>
+        <w:t>, V. P. (2024). Specifics of representing disability in scientific discourse: The experience of a practical study [</w:t>
+      </w:r>
+      <w:proofErr w:type="spellStart"/>
+      <w:r>
+        <w:rPr>
+          <w:lang w:val="en-US"/>
+        </w:rPr>
+        <w:t>Особенности</w:t>
+      </w:r>
+      <w:proofErr w:type="spellEnd"/>
+      <w:r>
+        <w:rPr>
+          <w:lang w:val="en-US"/>
+        </w:rPr>
+        <w:t xml:space="preserve"> </w:t>
+      </w:r>
+      <w:proofErr w:type="spellStart"/>
+      <w:r>
+        <w:rPr>
+          <w:lang w:val="en-US"/>
+        </w:rPr>
+        <w:t>представления</w:t>
+      </w:r>
+      <w:proofErr w:type="spellEnd"/>
+      <w:r>
+        <w:rPr>
+          <w:lang w:val="en-US"/>
+        </w:rPr>
+        <w:t xml:space="preserve"> </w:t>
+      </w:r>
+      <w:proofErr w:type="spellStart"/>
+      <w:r>
+        <w:rPr>
+          <w:lang w:val="en-US"/>
+        </w:rPr>
+        <w:t>инвалидности</w:t>
+      </w:r>
+      <w:proofErr w:type="spellEnd"/>
+      <w:r>
+        <w:rPr>
+          <w:lang w:val="en-US"/>
+        </w:rPr>
+        <w:t xml:space="preserve"> в </w:t>
+      </w:r>
+      <w:proofErr w:type="spellStart"/>
+      <w:r>
+        <w:rPr>
+          <w:lang w:val="en-US"/>
+        </w:rPr>
+        <w:t>научном</w:t>
+      </w:r>
+      <w:proofErr w:type="spellEnd"/>
+      <w:r>
+        <w:rPr>
+          <w:lang w:val="en-US"/>
+        </w:rPr>
+        <w:t xml:space="preserve"> </w:t>
+      </w:r>
+      <w:proofErr w:type="spellStart"/>
+      <w:r>
+        <w:rPr>
+          <w:lang w:val="en-US"/>
+        </w:rPr>
+        <w:t>дискурсе</w:t>
+      </w:r>
+      <w:proofErr w:type="spellEnd"/>
+      <w:r>
+        <w:rPr>
+          <w:lang w:val="en-US"/>
+        </w:rPr>
+        <w:t xml:space="preserve">]. </w:t>
+      </w:r>
+      <w:proofErr w:type="spellStart"/>
+      <w:r>
+        <w:rPr>
+          <w:lang w:val="en-US"/>
+        </w:rPr>
+        <w:t>Vestnik</w:t>
+      </w:r>
+      <w:proofErr w:type="spellEnd"/>
+      <w:r>
+        <w:rPr>
+          <w:lang w:val="en-US"/>
+        </w:rPr>
+        <w:t xml:space="preserve"> Tomsk State University. Philosophy. Sociology. Political Science, (Issue 82), 183–198. https://doi.org/10.17223/1998863Х/82/16</w:t>
+      </w:r>
+    </w:p>
+    <w:p>
+      <w:pPr>
+        <w:pStyle w:val="Paragraphedeliste"/>
+        <w:numPr>
+          <w:ilvl w:val="0"/>
+          <w:numId w:val="31"/>
+        </w:numPr>
+        <w:ind w:hanging="578"/>
+        <w:rPr>
+          <w:lang w:val="en-US"/>
+        </w:rPr>
+      </w:pPr>
+      <w:r>
+        <w:rPr>
+          <w:lang w:val="en-US"/>
+        </w:rPr>
+        <w:lastRenderedPageBreak/>
+        <w:t>Terzi, L. (2020). Capability and educational equality. Journal of Human Development, 21(2), 123-139.</w:t>
+      </w:r>
+    </w:p>
+    <w:p>
+      <w:pPr>
+        <w:pStyle w:val="Paragraphedeliste"/>
+        <w:numPr>
+          <w:ilvl w:val="0"/>
+          <w:numId w:val="31"/>
+        </w:numPr>
+        <w:ind w:hanging="578"/>
+        <w:rPr>
+          <w:lang w:val="en-US"/>
+        </w:rPr>
+      </w:pPr>
+      <w:r>
+        <w:rPr>
+          <w:lang w:val="en-US"/>
+        </w:rPr>
+        <w:t>United Nations. (2006). Convention on the Rights of Persons with Disabilities (CRPD).</w:t>
+      </w:r>
+    </w:p>
+    <w:p>
+      <w:pPr>
+        <w:pStyle w:val="Paragraphedeliste"/>
+        <w:numPr>
+          <w:ilvl w:val="0"/>
+          <w:numId w:val="31"/>
+        </w:numPr>
+        <w:ind w:hanging="578"/>
+        <w:rPr>
+          <w:lang w:val="en-US"/>
+        </w:rPr>
+      </w:pPr>
+      <w:r>
+        <w:rPr>
+          <w:lang w:val="en-US"/>
+        </w:rPr>
+        <w:t>United Nations. (2020). Policy brief: A disability</w:t>
+      </w:r>
+      <w:r>
+        <w:rPr>
+          <w:rFonts w:ascii="Cambria Math" w:hAnsi="Cambria Math" w:cs="Cambria Math"/>
+          <w:lang w:val="en-US"/>
+        </w:rPr>
+        <w:t>‑</w:t>
+      </w:r>
+      <w:r>
+        <w:rPr>
+          <w:lang w:val="en-US"/>
+        </w:rPr>
+        <w:t>inclusive response to COVID</w:t>
+      </w:r>
+      <w:r>
+        <w:rPr>
+          <w:rFonts w:ascii="Cambria Math" w:hAnsi="Cambria Math" w:cs="Cambria Math"/>
+          <w:lang w:val="en-US"/>
+        </w:rPr>
+        <w:t>‑</w:t>
+      </w:r>
+      <w:r>
+        <w:rPr>
+          <w:lang w:val="en-US"/>
+        </w:rPr>
+        <w:t>19. United Nations.</w:t>
+      </w:r>
+    </w:p>
+    <w:p>
+      <w:pPr>
+        <w:pStyle w:val="Paragraphedeliste"/>
+        <w:numPr>
+          <w:ilvl w:val="0"/>
+          <w:numId w:val="31"/>
+        </w:numPr>
+        <w:ind w:hanging="578"/>
+        <w:rPr>
+          <w:lang w:val="en-US"/>
+        </w:rPr>
+      </w:pPr>
+      <w:r>
+        <w:rPr>
+          <w:lang w:val="en-US"/>
+        </w:rPr>
+        <w:t xml:space="preserve">Van Oyen, H., Van der Heyden, J., </w:t>
+      </w:r>
+      <w:proofErr w:type="spellStart"/>
+      <w:r>
+        <w:rPr>
+          <w:lang w:val="en-US"/>
+        </w:rPr>
+        <w:t>Perenboom</w:t>
+      </w:r>
+      <w:proofErr w:type="spellEnd"/>
+      <w:r>
+        <w:rPr>
+          <w:lang w:val="en-US"/>
+        </w:rPr>
+        <w:t xml:space="preserve">, R., &amp; Jagger, C. (2006). Monitoring population disability: evaluation of a new Global Activity Limitation Indicator (GALI). </w:t>
+      </w:r>
+      <w:proofErr w:type="spellStart"/>
+      <w:r>
+        <w:rPr>
+          <w:lang w:val="en-US"/>
+        </w:rPr>
+        <w:t>Sozial</w:t>
+      </w:r>
+      <w:proofErr w:type="spellEnd"/>
+      <w:r>
+        <w:rPr>
+          <w:lang w:val="en-US"/>
+        </w:rPr>
+        <w:t xml:space="preserve">- und </w:t>
+      </w:r>
+      <w:proofErr w:type="spellStart"/>
+      <w:r>
+        <w:rPr>
+          <w:lang w:val="en-US"/>
+        </w:rPr>
+        <w:t>Präventivmedizin</w:t>
+      </w:r>
+      <w:proofErr w:type="spellEnd"/>
+      <w:r>
+        <w:rPr>
+          <w:lang w:val="en-US"/>
+        </w:rPr>
+        <w:t>, 51(3), 153-161.</w:t>
+      </w:r>
+    </w:p>
+    <w:p>
+      <w:pPr>
+        <w:pStyle w:val="Paragraphedeliste"/>
+        <w:numPr>
+          <w:ilvl w:val="0"/>
+          <w:numId w:val="31"/>
+        </w:numPr>
+        <w:ind w:hanging="578"/>
+        <w:rPr>
+          <w:lang w:val="en-US"/>
+        </w:rPr>
+      </w:pPr>
+      <w:r>
+        <w:rPr>
+          <w:lang w:val="en-US"/>
+        </w:rPr>
+        <w:t>Williams, D., &amp; Mohammed, S. (2013). Racism and health I: Pathways and evidence. American Behavioral Scientist, 57(8), 1152–1173.</w:t>
+      </w:r>
+    </w:p>
+    <w:p>
+      <w:pPr>
+        <w:pStyle w:val="Paragraphedeliste"/>
+        <w:numPr>
+          <w:ilvl w:val="0"/>
+          <w:numId w:val="31"/>
+        </w:numPr>
+        <w:ind w:hanging="578"/>
+      </w:pPr>
+      <w:r>
+        <w:rPr>
+          <w:lang w:val="en-US"/>
+        </w:rPr>
+        <w:t>World Health Organization (WHO). (2021). International Classification of Functioning, Disability and Health (ICF). https://www.who.int/classifications/icf/en/</w:t>
+      </w:r>
+    </w:p>
     <w:p>
       <w:pPr>
         <w:spacing w:after="160" w:line="278" w:lineRule="auto"/>
@@ -22606,7 +23935,7 @@
       <w:pPr>
         <w:pStyle w:val="Titre1"/>
       </w:pPr>
-      <w:bookmarkStart w:id="16" w:name="_Toc229485494"/>
+      <w:bookmarkStart w:id="16" w:name="_Toc229556441"/>
       <w:r>
         <w:lastRenderedPageBreak/>
         <w:t>Appendix</w:t>
@@ -37617,7 +38946,7 @@
           <w:lang w:val="en-US"/>
         </w:rPr>
       </w:pPr>
-      <w:bookmarkStart w:id="17" w:name="_Toc229485495"/>
+      <w:bookmarkStart w:id="17" w:name="_Toc229556442"/>
       <w:r>
         <w:rPr>
           <w:lang w:val="en-US"/>
@@ -43469,7 +44798,7 @@
       <w:pPr>
         <w:pStyle w:val="Notedebasdepage"/>
         <w:rPr>
-          <w:lang w:val="ru-RU"/>
+          <w:lang w:val="en-US"/>
         </w:rPr>
       </w:pPr>
       <w:r>
@@ -43480,9 +44809,15 @@
       </w:r>
       <w:r>
         <w:rPr>
-          <w:lang w:val="ru-RU"/>
-        </w:rPr>
-        <w:t xml:space="preserve"> Федеральный закон от 15 декабря 2001 г. № 166-ФЗ «О государственном пенсионном обеспечении в Российской Федерации»</w:t>
+          <w:lang w:val="en-US"/>
+        </w:rPr>
+        <w:t xml:space="preserve"> </w:t>
+      </w:r>
+      <w:r>
+        <w:rPr>
+          <w:lang w:val="en-US"/>
+        </w:rPr>
+        <w:t>Federal Law No. 166-FZ of December 15, 2001, "On State Pension Provision in the Russian Federation"</w:t>
       </w:r>
     </w:p>
   </w:footnote>
@@ -43491,7 +44826,7 @@
       <w:pPr>
         <w:pStyle w:val="Notedebasdepage"/>
         <w:rPr>
-          <w:lang w:val="ru-RU"/>
+          <w:lang w:val="en-US"/>
         </w:rPr>
       </w:pPr>
       <w:r>
@@ -43502,16 +44837,22 @@
       </w:r>
       <w:r>
         <w:rPr>
-          <w:lang w:val="ru-RU"/>
-        </w:rPr>
-        <w:t xml:space="preserve"> Федеральный закон от 17 июля 1999 г. № 178-ФЗ «О государственной социальной помощи»</w:t>
+          <w:lang w:val="en-US"/>
+        </w:rPr>
+        <w:t xml:space="preserve"> </w:t>
+      </w:r>
+      <w:r>
+        <w:rPr>
+          <w:lang w:val="en-US"/>
+        </w:rPr>
+        <w:t>Federal Law No. 178-FZ of July 17, 1999, "On State Social Assistance"</w:t>
       </w:r>
     </w:p>
     <w:p>
       <w:pPr>
         <w:pStyle w:val="Notedebasdepage"/>
         <w:rPr>
-          <w:lang w:val="ru-RU"/>
+          <w:lang w:val="en-US"/>
         </w:rPr>
       </w:pPr>
     </w:p>
@@ -43519,22 +44860,36 @@
   <w:footnote w:id="5">
     <w:p>
       <w:pPr>
-        <w:pStyle w:val="Notedebasdepage"/>
-        <w:rPr>
-          <w:lang w:val="ru-RU"/>
+        <w:spacing w:line="240" w:lineRule="auto"/>
+        <w:rPr>
+          <w:sz w:val="20"/>
+          <w:szCs w:val="20"/>
+          <w:lang w:val="en-US"/>
         </w:rPr>
       </w:pPr>
       <w:r>
         <w:rPr>
           <w:rStyle w:val="Appelnotedebasdep"/>
+          <w:sz w:val="20"/>
+          <w:szCs w:val="20"/>
         </w:rPr>
         <w:footnoteRef/>
       </w:r>
       <w:r>
         <w:rPr>
-          <w:lang w:val="ru-RU"/>
-        </w:rPr>
-        <w:t xml:space="preserve"> Постановление Правительства РФ от 30 июля 1994 г. № 890 «О государственной поддержке развития медицинской промышленности и улучшении обеспечения населения и учреждений здравоохранения лекарственными средствами и изделиями медицинского назначения»</w:t>
+          <w:sz w:val="20"/>
+          <w:szCs w:val="20"/>
+          <w:lang w:val="en-US"/>
+        </w:rPr>
+        <w:t xml:space="preserve"> </w:t>
+      </w:r>
+      <w:r>
+        <w:rPr>
+          <w:sz w:val="20"/>
+          <w:szCs w:val="20"/>
+          <w:lang w:val="en-US"/>
+        </w:rPr>
+        <w:t>Resolution of the Government of the Russian Federation No. 890 of July 30, 1994, "On State Support for the Development of the Medical Industry and Improving the Provision of Medicines and Medical Devices to the Population and Healthcare Institutions"</w:t>
       </w:r>
     </w:p>
   </w:footnote>
@@ -43626,6 +44981,9 @@
       <w:r>
         <w:t xml:space="preserve"> </w:t>
       </w:r>
+      <w:r>
+        <w:t>RLMS official page (</w:t>
+      </w:r>
       <w:hyperlink r:id="rId3" w:history="1">
         <w:r>
           <w:rPr>
@@ -43635,7 +44993,7 @@
         </w:r>
       </w:hyperlink>
       <w:r>
-        <w:t xml:space="preserve"> </w:t>
+        <w:t>)</w:t>
       </w:r>
     </w:p>
   </w:footnote>
@@ -43802,20 +45160,47 @@
   <w:footnote w:id="17">
     <w:p>
       <w:pPr>
+        <w:spacing w:line="240" w:lineRule="auto"/>
+        <w:rPr>
+          <w:sz w:val="20"/>
+          <w:szCs w:val="20"/>
+        </w:rPr>
+      </w:pPr>
+      <w:r>
+        <w:rPr>
+          <w:rStyle w:val="Appelnotedebasdep"/>
+        </w:rPr>
+        <w:footnoteRef/>
+      </w:r>
+      <w:r>
+        <w:t xml:space="preserve"> </w:t>
+      </w:r>
+      <w:r>
+        <w:rPr>
+          <w:sz w:val="20"/>
+          <w:szCs w:val="20"/>
+        </w:rPr>
+        <w:t>Becker, G. S. (1964). Human capital: A theoretical and empirical analysis, with special reference to education.</w:t>
+      </w:r>
+      <w:r>
+        <w:rPr>
+          <w:sz w:val="20"/>
+          <w:szCs w:val="20"/>
+        </w:rPr>
+        <w:t xml:space="preserve"> </w:t>
+      </w:r>
+      <w:r>
+        <w:rPr>
+          <w:sz w:val="20"/>
+          <w:szCs w:val="20"/>
+        </w:rPr>
+        <w:t>National Bureau of Economic Research; distributed by Columbia University Press.</w:t>
+      </w:r>
+    </w:p>
+    <w:p>
+      <w:pPr>
         <w:pStyle w:val="Notedebasdepage"/>
       </w:pPr>
-      <w:r>
-        <w:rPr>
-          <w:rStyle w:val="Appelnotedebasdep"/>
-        </w:rPr>
-        <w:footnoteRef/>
-      </w:r>
-      <w:r>
-        <w:t xml:space="preserve"> </w:t>
-      </w:r>
-      <w:r>
-        <w:t>Haveman, R., &amp; Wolfe, B. (2000). The economics of disability and disability policy. Handbook of Health Economics, 1, 995-1051</w:t>
-      </w:r>
     </w:p>
   </w:footnote>
   <w:footnote w:id="18">
@@ -43833,7 +45218,7 @@
         <w:t xml:space="preserve"> </w:t>
       </w:r>
       <w:r>
-        <w:t>Jones, M. K., Latreille, P. L., &amp; Sloane, P. J. (2021). Disability, gender, and the British labour market. Oxford Economic Papers, 73(2), 565-587.</w:t>
+        <w:t>Haveman, R., &amp; Wolfe, B. (2000). The economics of disability and disability policy. Handbook of Health Economics, 1, 995-1051</w:t>
       </w:r>
     </w:p>
   </w:footnote>
@@ -43852,7 +45237,7 @@
         <w:t xml:space="preserve"> </w:t>
       </w:r>
       <w:r>
-        <w:t>Grossman, M. (1972). On the concept of health capital and the demand for health. Journal of Political Economy, 80(2), 223–255.</w:t>
+        <w:t>Jones, M. K., Latreille, P. L., &amp; Sloane, P. J. (2021). Disability, gender, and the British labour market. Oxford Economic Papers, 73(2), 565-587.</w:t>
       </w:r>
     </w:p>
   </w:footnote>
@@ -43860,6 +45245,9 @@
     <w:p>
       <w:pPr>
         <w:pStyle w:val="Notedebasdepage"/>
+        <w:rPr>
+          <w:lang w:val="en-US"/>
+        </w:rPr>
       </w:pPr>
       <w:r>
         <w:rPr>
@@ -43871,7 +45259,7 @@
         <w:t xml:space="preserve"> </w:t>
       </w:r>
       <w:r>
-        <w:t>Galama, T., &amp; Van Kippersluis, H. (2019). A theory of socioeconomic disparities in health. Journal of Health Economics, 62, 1–14.</w:t>
+        <w:t>Gilleskie, D. B., &amp; Hoffman, D. (2014). Health capital and human capital as explanations for health-related wage disparities. Journal of Human Capital, 8(3), 235–279</w:t>
       </w:r>
     </w:p>
   </w:footnote>
@@ -43890,7 +45278,7 @@
         <w:t xml:space="preserve"> </w:t>
       </w:r>
       <w:r>
-        <w:t>Baicker, K., Mullainathan, S., &amp; Schwartzstein, J. (2015). Behavioral hazard in health insurance. Quarterly Journal of Economics, 130(4), 1623–1667.</w:t>
+        <w:t>Grossman, M. (1972). On the concept of health capital and the demand for health. Journal of Political Economy, 80(2), 223–255.</w:t>
       </w:r>
     </w:p>
   </w:footnote>
@@ -43909,7 +45297,7 @@
         <w:t xml:space="preserve"> </w:t>
       </w:r>
       <w:r>
-        <w:t>Williams, D., &amp; Mohammed, S. (2013). Racism and health I: Pathways and evidence. American Behavioral Scientist, 57(8), 1152–1173.</w:t>
+        <w:t>Galama, T., &amp; Van Kippersluis, H. (2019). A theory of socioeconomic disparities in health. Journal of Health Economics, 62, 1–14.</w:t>
       </w:r>
     </w:p>
   </w:footnote>
@@ -43928,7 +45316,7 @@
         <w:t xml:space="preserve"> </w:t>
       </w:r>
       <w:r>
-        <w:t>Adda, J., Banks, J., &amp; Von Gaudecker, H. M. (2003). The impact of income shocks on health: Evidence from cohort data. Journal of the European Economic Association, 1(4), 968–1000.</w:t>
+        <w:t>Baicker, K., Mullainathan, S., &amp; Schwartzstein, J. (2015). Behavioral hazard in health insurance. Quarterly Journal of Economics, 130(4), 1623–1667.</w:t>
       </w:r>
     </w:p>
   </w:footnote>
@@ -43947,7 +45335,7 @@
         <w:t xml:space="preserve"> </w:t>
       </w:r>
       <w:r>
-        <w:t>Sen, A. (1999). Development as freedom. Oxford University Press</w:t>
+        <w:t>Williams, D., &amp; Mohammed, S. (2013). Racism and health I: Pathways and evidence. American Behavioral Scientist, 57(8), 1152–1173.</w:t>
       </w:r>
     </w:p>
   </w:footnote>
@@ -43966,7 +45354,7 @@
         <w:t xml:space="preserve"> </w:t>
       </w:r>
       <w:r>
-        <w:t>Terzi, L. (2020). Capability and educational equality. Journal of Human Development, 21(2), 123-139.</w:t>
+        <w:t>Adda, J., Banks, J., &amp; Von Gaudecker, H. M. (2003). The impact of income shocks on health: Evidence from cohort data. Journal of the European Economic Association, 1(4), 968–1000.</w:t>
       </w:r>
     </w:p>
   </w:footnote>
@@ -43985,7 +45373,7 @@
         <w:t xml:space="preserve"> </w:t>
       </w:r>
       <w:r>
-        <w:t>Kabeer, N. (2021). Women's empowerment and economic development. World Development, 147, 105553.</w:t>
+        <w:t>Sen, A. (1999). Development as freedom. Oxford University Press</w:t>
       </w:r>
     </w:p>
   </w:footnote>
@@ -43993,6 +45381,9 @@
     <w:p>
       <w:pPr>
         <w:pStyle w:val="Notedebasdepage"/>
+        <w:rPr>
+          <w:lang w:val="en-US"/>
+        </w:rPr>
       </w:pPr>
       <w:r>
         <w:rPr>
@@ -44004,7 +45395,7 @@
         <w:t xml:space="preserve"> </w:t>
       </w:r>
       <w:r>
-        <w:t>Doeringer, P. B., &amp; Piore, M. J. (1971). Internal labor markets and manpower analysis. Heath</w:t>
+        <w:t>Nussbaum, M. C. (2006). Frontiers of justice: Disability, nationality, species membership. The Belknap Press of Harvard University Press.</w:t>
       </w:r>
     </w:p>
   </w:footnote>
@@ -44012,6 +45403,63 @@
     <w:p>
       <w:pPr>
         <w:pStyle w:val="Notedebasdepage"/>
+      </w:pPr>
+      <w:r>
+        <w:rPr>
+          <w:rStyle w:val="Appelnotedebasdep"/>
+        </w:rPr>
+        <w:footnoteRef/>
+      </w:r>
+      <w:r>
+        <w:t xml:space="preserve"> </w:t>
+      </w:r>
+      <w:r>
+        <w:t>Terzi, L. (2020). Capability and educational equality. Journal of Human Development, 21(2), 123-139.</w:t>
+      </w:r>
+    </w:p>
+  </w:footnote>
+  <w:footnote w:id="29">
+    <w:p>
+      <w:pPr>
+        <w:pStyle w:val="Notedebasdepage"/>
+      </w:pPr>
+      <w:r>
+        <w:rPr>
+          <w:rStyle w:val="Appelnotedebasdep"/>
+        </w:rPr>
+        <w:footnoteRef/>
+      </w:r>
+      <w:r>
+        <w:t xml:space="preserve"> </w:t>
+      </w:r>
+      <w:r>
+        <w:t>Kabeer, N. (2021). Women's empowerment and economic development. World Development, 147, 105553.</w:t>
+      </w:r>
+    </w:p>
+  </w:footnote>
+  <w:footnote w:id="30">
+    <w:p>
+      <w:pPr>
+        <w:pStyle w:val="Notedebasdepage"/>
+      </w:pPr>
+      <w:r>
+        <w:rPr>
+          <w:rStyle w:val="Appelnotedebasdep"/>
+        </w:rPr>
+        <w:footnoteRef/>
+      </w:r>
+      <w:r>
+        <w:t xml:space="preserve"> </w:t>
+      </w:r>
+      <w:r>
+        <w:t>Doeringer, P. B., &amp; Piore, M. J. (1971). Internal labor markets and manpower analysis. Heath</w:t>
+      </w:r>
+    </w:p>
+  </w:footnote>
+  <w:footnote w:id="31">
+    <w:p>
+      <w:pPr>
+        <w:pStyle w:val="Notedebasdepage"/>
         <w:rPr>
           <w:lang w:val="en-US"/>
         </w:rPr>
@@ -44026,7 +45474,167 @@
         <w:t xml:space="preserve"> </w:t>
       </w:r>
       <w:r>
+        <w:t>Campbell, F. K. (2009). Contours of ableism: The production of disability and abledness. Palgrave Macmillan.</w:t>
+      </w:r>
+    </w:p>
+  </w:footnote>
+  <w:footnote w:id="32">
+    <w:p>
+      <w:pPr>
+        <w:pStyle w:val="Notedebasdepage"/>
+        <w:rPr>
+          <w:lang w:val="en-US"/>
+        </w:rPr>
+      </w:pPr>
+      <w:r>
+        <w:rPr>
+          <w:rStyle w:val="Appelnotedebasdep"/>
+        </w:rPr>
+        <w:footnoteRef/>
+      </w:r>
+      <w:r>
+        <w:t xml:space="preserve"> </w:t>
+      </w:r>
+      <w:r>
+        <w:t xml:space="preserve">Jones, M. (2022). COVID-19 and the labour market outcomes of disabled people in the UK. Social Science &amp; Medicine, 292, Article 114637. </w:t>
+      </w:r>
+      <w:hyperlink r:id="rId4" w:history="1">
+        <w:r>
+          <w:rPr>
+            <w:rStyle w:val="Lienhypertexte"/>
+          </w:rPr>
+          <w:t>https://doi.org/10.1016/j.socscimed.2021.114637</w:t>
+        </w:r>
+      </w:hyperlink>
+      <w:r>
+        <w:t xml:space="preserve"> </w:t>
+      </w:r>
+    </w:p>
+  </w:footnote>
+  <w:footnote w:id="33">
+    <w:p>
+      <w:pPr>
+        <w:pStyle w:val="Notedebasdepage"/>
+        <w:rPr>
+          <w:lang w:val="en-US"/>
+        </w:rPr>
+      </w:pPr>
+      <w:r>
+        <w:rPr>
+          <w:rStyle w:val="Appelnotedebasdep"/>
+        </w:rPr>
+        <w:footnoteRef/>
+      </w:r>
+      <w:r>
+        <w:t xml:space="preserve"> </w:t>
+      </w:r>
+      <w:r>
         <w:t>Ne'eman, A., &amp; Maestas, N. (2023). How has COVID-19 impacted disability employment?. Disability and health journal, 16(2), 101429. https://doi.org/10.1016/j.dhjo.2022.101429</w:t>
+      </w:r>
+    </w:p>
+  </w:footnote>
+  <w:footnote w:id="34">
+    <w:p>
+      <w:pPr>
+        <w:pStyle w:val="Notedebasdepage"/>
+        <w:rPr>
+          <w:lang w:val="en-US"/>
+        </w:rPr>
+      </w:pPr>
+      <w:r>
+        <w:rPr>
+          <w:rStyle w:val="Appelnotedebasdep"/>
+        </w:rPr>
+        <w:footnoteRef/>
+      </w:r>
+      <w:r>
+        <w:t xml:space="preserve"> </w:t>
+      </w:r>
+      <w:r>
+        <w:t xml:space="preserve">Maroto, M., &amp; Pettinicchio, D. (2024). From recession to pandemic: Displacement among workers with disabilities from 2007 through 2021. Journal of Vocational Rehabilitation, 61(1), 25–37. </w:t>
+      </w:r>
+      <w:hyperlink r:id="rId5" w:history="1">
+        <w:r>
+          <w:rPr>
+            <w:rStyle w:val="Lienhypertexte"/>
+          </w:rPr>
+          <w:t>https://doi.org/10.3233/JVR-230064</w:t>
+        </w:r>
+      </w:hyperlink>
+      <w:r>
+        <w:t xml:space="preserve"> </w:t>
+      </w:r>
+    </w:p>
+  </w:footnote>
+  <w:footnote w:id="35">
+    <w:p>
+      <w:pPr>
+        <w:pStyle w:val="Notedebasdepage"/>
+        <w:rPr>
+          <w:lang w:val="en-US"/>
+        </w:rPr>
+      </w:pPr>
+      <w:r>
+        <w:rPr>
+          <w:rStyle w:val="Appelnotedebasdep"/>
+        </w:rPr>
+        <w:footnoteRef/>
+      </w:r>
+      <w:r>
+        <w:t xml:space="preserve"> </w:t>
+      </w:r>
+      <w:r>
+        <w:t>Bondoux, Justine, (2024), Relationships between disability and labour market outcomes in Europe</w:t>
+      </w:r>
+    </w:p>
+  </w:footnote>
+  <w:footnote w:id="36">
+    <w:p>
+      <w:pPr>
+        <w:pStyle w:val="Notedebasdepage"/>
+        <w:rPr>
+          <w:lang w:val="en-US"/>
+        </w:rPr>
+      </w:pPr>
+      <w:r>
+        <w:rPr>
+          <w:rStyle w:val="Appelnotedebasdep"/>
+        </w:rPr>
+        <w:footnoteRef/>
+      </w:r>
+      <w:r>
+        <w:t xml:space="preserve"> </w:t>
+      </w:r>
+      <w:r>
+        <w:t>Schur, Lisa &amp; Rodgers, Yana &amp; Kruse, Douglas. (2021). COVID-19 and Employment Losses for Workers with Disabilities: An Intersectional Approach. SSRN Electronic Journal. 10.2139/ssrn.3788319</w:t>
+      </w:r>
+      <w:r>
+        <w:rPr>
+          <w:lang w:val="en-US"/>
+        </w:rPr>
+        <w:t>.</w:t>
+      </w:r>
+    </w:p>
+  </w:footnote>
+  <w:footnote w:id="37">
+    <w:p>
+      <w:pPr>
+        <w:pStyle w:val="Notedebasdepage"/>
+        <w:rPr>
+          <w:lang w:val="en-US"/>
+        </w:rPr>
+      </w:pPr>
+      <w:r>
+        <w:rPr>
+          <w:rStyle w:val="Appelnotedebasdep"/>
+        </w:rPr>
+        <w:footnoteRef/>
+      </w:r>
+      <w:r>
+        <w:t xml:space="preserve"> </w:t>
+      </w:r>
+      <w:r>
+        <w:t>Rosenbaum, P. R., &amp; Rubin, D. B. (1983). The central role of the propensity score in observational studies for causal effects. Biometrika, 70(1), 41–55.</w:t>
       </w:r>
     </w:p>
   </w:footnote>
@@ -45961,6 +47569,95 @@
     </w:lvl>
   </w:abstractNum>
   <w:abstractNum w:abstractNumId="19" w15:restartNumberingAfterBreak="0">
+    <w:nsid w:val="565D64B9"/>
+    <w:multiLevelType w:val="hybridMultilevel"/>
+    <w:tmpl w:val="D02CA01A"/>
+    <w:lvl w:ilvl="0" w:tplc="13EA5FDA">
+      <w:start w:val="1"/>
+      <w:numFmt w:val="decimal"/>
+      <w:lvlText w:val="[%1]"/>
+      <w:lvlJc w:val="left"/>
+      <w:pPr>
+        <w:ind w:left="720" w:hanging="360"/>
+      </w:pPr>
+      <w:rPr>
+        <w:rFonts w:hint="default"/>
+      </w:rPr>
+    </w:lvl>
+    <w:lvl w:ilvl="1" w:tplc="040C0019" w:tentative="1">
+      <w:start w:val="1"/>
+      <w:numFmt w:val="lowerLetter"/>
+      <w:lvlText w:val="%2."/>
+      <w:lvlJc w:val="left"/>
+      <w:pPr>
+        <w:ind w:left="1440" w:hanging="360"/>
+      </w:pPr>
+    </w:lvl>
+    <w:lvl w:ilvl="2" w:tplc="040C001B" w:tentative="1">
+      <w:start w:val="1"/>
+      <w:numFmt w:val="lowerRoman"/>
+      <w:lvlText w:val="%3."/>
+      <w:lvlJc w:val="right"/>
+      <w:pPr>
+        <w:ind w:left="2160" w:hanging="180"/>
+      </w:pPr>
+    </w:lvl>
+    <w:lvl w:ilvl="3" w:tplc="040C000F" w:tentative="1">
+      <w:start w:val="1"/>
+      <w:numFmt w:val="decimal"/>
+      <w:lvlText w:val="%4."/>
+      <w:lvlJc w:val="left"/>
+      <w:pPr>
+        <w:ind w:left="2880" w:hanging="360"/>
+      </w:pPr>
+    </w:lvl>
+    <w:lvl w:ilvl="4" w:tplc="040C0019" w:tentative="1">
+      <w:start w:val="1"/>
+      <w:numFmt w:val="lowerLetter"/>
+      <w:lvlText w:val="%5."/>
+      <w:lvlJc w:val="left"/>
+      <w:pPr>
+        <w:ind w:left="3600" w:hanging="360"/>
+      </w:pPr>
+    </w:lvl>
+    <w:lvl w:ilvl="5" w:tplc="040C001B" w:tentative="1">
+      <w:start w:val="1"/>
+      <w:numFmt w:val="lowerRoman"/>
+      <w:lvlText w:val="%6."/>
+      <w:lvlJc w:val="right"/>
+      <w:pPr>
+        <w:ind w:left="4320" w:hanging="180"/>
+      </w:pPr>
+    </w:lvl>
+    <w:lvl w:ilvl="6" w:tplc="040C000F" w:tentative="1">
+      <w:start w:val="1"/>
+      <w:numFmt w:val="decimal"/>
+      <w:lvlText w:val="%7."/>
+      <w:lvlJc w:val="left"/>
+      <w:pPr>
+        <w:ind w:left="5040" w:hanging="360"/>
+      </w:pPr>
+    </w:lvl>
+    <w:lvl w:ilvl="7" w:tplc="040C0019" w:tentative="1">
+      <w:start w:val="1"/>
+      <w:numFmt w:val="lowerLetter"/>
+      <w:lvlText w:val="%8."/>
+      <w:lvlJc w:val="left"/>
+      <w:pPr>
+        <w:ind w:left="5760" w:hanging="360"/>
+      </w:pPr>
+    </w:lvl>
+    <w:lvl w:ilvl="8" w:tplc="040C001B" w:tentative="1">
+      <w:start w:val="1"/>
+      <w:numFmt w:val="lowerRoman"/>
+      <w:lvlText w:val="%9."/>
+      <w:lvlJc w:val="right"/>
+      <w:pPr>
+        <w:ind w:left="6480" w:hanging="180"/>
+      </w:pPr>
+    </w:lvl>
+  </w:abstractNum>
+  <w:abstractNum w:abstractNumId="20" w15:restartNumberingAfterBreak="0">
     <w:nsid w:val="5C241D72"/>
     <w:multiLevelType w:val="hybridMultilevel"/>
     <w:tmpl w:val="B9D25C62"/>
@@ -46046,7 +47743,7 @@
       </w:pPr>
     </w:lvl>
   </w:abstractNum>
-  <w:abstractNum w:abstractNumId="20" w15:restartNumberingAfterBreak="0">
+  <w:abstractNum w:abstractNumId="21" w15:restartNumberingAfterBreak="0">
     <w:nsid w:val="5CBB317F"/>
     <w:multiLevelType w:val="hybridMultilevel"/>
     <w:tmpl w:val="1500DE1C"/>
@@ -46132,7 +47829,7 @@
       </w:pPr>
     </w:lvl>
   </w:abstractNum>
-  <w:abstractNum w:abstractNumId="21" w15:restartNumberingAfterBreak="0">
+  <w:abstractNum w:abstractNumId="22" w15:restartNumberingAfterBreak="0">
     <w:nsid w:val="65BC1713"/>
     <w:multiLevelType w:val="hybridMultilevel"/>
     <w:tmpl w:val="43CEA4A0"/>
@@ -46221,7 +47918,7 @@
       </w:pPr>
     </w:lvl>
   </w:abstractNum>
-  <w:abstractNum w:abstractNumId="22" w15:restartNumberingAfterBreak="0">
+  <w:abstractNum w:abstractNumId="23" w15:restartNumberingAfterBreak="0">
     <w:nsid w:val="66103EE7"/>
     <w:multiLevelType w:val="hybridMultilevel"/>
     <w:tmpl w:val="EE72548A"/>
@@ -46334,7 +48031,7 @@
       </w:rPr>
     </w:lvl>
   </w:abstractNum>
-  <w:abstractNum w:abstractNumId="23" w15:restartNumberingAfterBreak="0">
+  <w:abstractNum w:abstractNumId="24" w15:restartNumberingAfterBreak="0">
     <w:nsid w:val="689263D6"/>
     <w:multiLevelType w:val="hybridMultilevel"/>
     <w:tmpl w:val="83EA1518"/>
@@ -46420,7 +48117,7 @@
       </w:pPr>
     </w:lvl>
   </w:abstractNum>
-  <w:abstractNum w:abstractNumId="24" w15:restartNumberingAfterBreak="0">
+  <w:abstractNum w:abstractNumId="25" w15:restartNumberingAfterBreak="0">
     <w:nsid w:val="692D3CAC"/>
     <w:multiLevelType w:val="hybridMultilevel"/>
     <w:tmpl w:val="1AD84C82"/>
@@ -46532,7 +48229,7 @@
       </w:rPr>
     </w:lvl>
   </w:abstractNum>
-  <w:abstractNum w:abstractNumId="25" w15:restartNumberingAfterBreak="0">
+  <w:abstractNum w:abstractNumId="26" w15:restartNumberingAfterBreak="0">
     <w:nsid w:val="6A7130B8"/>
     <w:multiLevelType w:val="hybridMultilevel"/>
     <w:tmpl w:val="7D3E42A4"/>
@@ -46645,7 +48342,7 @@
       </w:rPr>
     </w:lvl>
   </w:abstractNum>
-  <w:abstractNum w:abstractNumId="26" w15:restartNumberingAfterBreak="0">
+  <w:abstractNum w:abstractNumId="27" w15:restartNumberingAfterBreak="0">
     <w:nsid w:val="6F9D19D8"/>
     <w:multiLevelType w:val="hybridMultilevel"/>
     <w:tmpl w:val="6CB84494"/>
@@ -46731,7 +48428,7 @@
       </w:pPr>
     </w:lvl>
   </w:abstractNum>
-  <w:abstractNum w:abstractNumId="27" w15:restartNumberingAfterBreak="0">
+  <w:abstractNum w:abstractNumId="28" w15:restartNumberingAfterBreak="0">
     <w:nsid w:val="720A3C41"/>
     <w:multiLevelType w:val="multilevel"/>
     <w:tmpl w:val="99502C3C"/>
@@ -46880,7 +48577,7 @@
       </w:rPr>
     </w:lvl>
   </w:abstractNum>
-  <w:abstractNum w:abstractNumId="28" w15:restartNumberingAfterBreak="0">
+  <w:abstractNum w:abstractNumId="29" w15:restartNumberingAfterBreak="0">
     <w:nsid w:val="72BB48EF"/>
     <w:multiLevelType w:val="hybridMultilevel"/>
     <w:tmpl w:val="6A70AB3A"/>
@@ -46966,7 +48663,7 @@
       </w:pPr>
     </w:lvl>
   </w:abstractNum>
-  <w:abstractNum w:abstractNumId="29" w15:restartNumberingAfterBreak="0">
+  <w:abstractNum w:abstractNumId="30" w15:restartNumberingAfterBreak="0">
     <w:nsid w:val="75550180"/>
     <w:multiLevelType w:val="hybridMultilevel"/>
     <w:tmpl w:val="6EFE8270"/>
@@ -47056,7 +48753,7 @@
     </w:lvl>
   </w:abstractNum>
   <w:num w:numId="1" w16cid:durableId="1851871220">
-    <w:abstractNumId w:val="24"/>
+    <w:abstractNumId w:val="25"/>
   </w:num>
   <w:num w:numId="2" w16cid:durableId="864950355">
     <w:abstractNumId w:val="13"/>
@@ -47065,13 +48762,13 @@
     <w:abstractNumId w:val="10"/>
   </w:num>
   <w:num w:numId="4" w16cid:durableId="1468082961">
-    <w:abstractNumId w:val="26"/>
+    <w:abstractNumId w:val="27"/>
   </w:num>
   <w:num w:numId="5" w16cid:durableId="213273258">
     <w:abstractNumId w:val="5"/>
   </w:num>
   <w:num w:numId="6" w16cid:durableId="222910829">
-    <w:abstractNumId w:val="23"/>
+    <w:abstractNumId w:val="24"/>
   </w:num>
   <w:num w:numId="7" w16cid:durableId="18510155">
     <w:abstractNumId w:val="14"/>
@@ -47080,7 +48777,7 @@
     <w:abstractNumId w:val="11"/>
   </w:num>
   <w:num w:numId="9" w16cid:durableId="801848313">
-    <w:abstractNumId w:val="27"/>
+    <w:abstractNumId w:val="28"/>
   </w:num>
   <w:num w:numId="10" w16cid:durableId="1791706795">
     <w:abstractNumId w:val="12"/>
@@ -47092,7 +48789,7 @@
     <w:abstractNumId w:val="1"/>
   </w:num>
   <w:num w:numId="13" w16cid:durableId="1916283762">
-    <w:abstractNumId w:val="21"/>
+    <w:abstractNumId w:val="22"/>
   </w:num>
   <w:num w:numId="14" w16cid:durableId="995451726">
     <w:abstractNumId w:val="4"/>
@@ -47101,7 +48798,7 @@
     <w:abstractNumId w:val="6"/>
   </w:num>
   <w:num w:numId="16" w16cid:durableId="1407341606">
-    <w:abstractNumId w:val="28"/>
+    <w:abstractNumId w:val="29"/>
   </w:num>
   <w:num w:numId="17" w16cid:durableId="609434593">
     <w:abstractNumId w:val="7"/>
@@ -47110,10 +48807,10 @@
     <w:abstractNumId w:val="17"/>
   </w:num>
   <w:num w:numId="19" w16cid:durableId="1531142692">
-    <w:abstractNumId w:val="19"/>
+    <w:abstractNumId w:val="20"/>
   </w:num>
   <w:num w:numId="20" w16cid:durableId="1038892398">
-    <w:abstractNumId w:val="20"/>
+    <w:abstractNumId w:val="21"/>
   </w:num>
   <w:num w:numId="21" w16cid:durableId="2006398776">
     <w:abstractNumId w:val="0"/>
@@ -47122,10 +48819,10 @@
     <w:abstractNumId w:val="18"/>
   </w:num>
   <w:num w:numId="23" w16cid:durableId="543911979">
-    <w:abstractNumId w:val="25"/>
+    <w:abstractNumId w:val="26"/>
   </w:num>
   <w:num w:numId="24" w16cid:durableId="1674453303">
-    <w:abstractNumId w:val="22"/>
+    <w:abstractNumId w:val="23"/>
   </w:num>
   <w:num w:numId="25" w16cid:durableId="1551771533">
     <w:abstractNumId w:val="2"/>
@@ -47140,10 +48837,13 @@
     <w:abstractNumId w:val="15"/>
   </w:num>
   <w:num w:numId="29" w16cid:durableId="824471672">
-    <w:abstractNumId w:val="29"/>
+    <w:abstractNumId w:val="30"/>
   </w:num>
   <w:num w:numId="30" w16cid:durableId="1871146265">
     <w:abstractNumId w:val="3"/>
+  </w:num>
+  <w:num w:numId="31" w16cid:durableId="1703361631">
+    <w:abstractNumId w:val="19"/>
   </w:num>
 </w:numbering>
 </file>
@@ -47756,6 +49456,7 @@
   <w:style w:type="character" w:default="1" w:styleId="Policepardfaut">
     <w:name w:val="Default Paragraph Font"/>
     <w:uiPriority w:val="1"/>
+    <w:semiHidden/>
     <w:unhideWhenUsed/>
   </w:style>
   <w:style w:type="table" w:default="1" w:styleId="TableauNormal">
@@ -49285,6 +50986,18 @@
       <w:szCs w:val="20"/>
     </w:rPr>
   </w:style>
+  <w:style w:type="character" w:styleId="Lienhypertextesuivivisit">
+    <w:name w:val="FollowedHyperlink"/>
+    <w:basedOn w:val="Policepardfaut"/>
+    <w:uiPriority w:val="99"/>
+    <w:semiHidden/>
+    <w:unhideWhenUsed/>
+    <w:rsid w:val="00EC4441"/>
+    <w:rPr>
+      <w:color w:val="96607D" w:themeColor="followedHyperlink"/>
+      <w:u w:val="single"/>
+    </w:rPr>
+  </w:style>
 </w:styles>
 </file>
 

</xml_diff>